<commit_message>
docs: update SRS and design document
</commit_message>
<xml_diff>
--- a/docs/Design-Document-UML-ER.docx
+++ b/docs/Design-Document-UML-ER.docx
@@ -1,6 +1,6 @@
 
 <file path=word/document.xml><?xml version="1.0" encoding="utf-8"?>
-<w:document xmlns:wpc="http://schemas.microsoft.com/office/word/2010/wordprocessingCanvas" xmlns:mc="http://schemas.openxmlformats.org/markup-compatibility/2006" xmlns:o="urn:schemas-microsoft-com:office:office" xmlns:r="http://schemas.openxmlformats.org/officeDocument/2006/relationships" xmlns:m="http://schemas.openxmlformats.org/officeDocument/2006/math" xmlns:v="urn:schemas-microsoft-com:vml" xmlns:wp14="http://schemas.microsoft.com/office/word/2010/wordprocessingDrawing" xmlns:wp="http://schemas.openxmlformats.org/drawingml/2006/wordprocessingDrawing" xmlns:w10="urn:schemas-microsoft-com:office:word" xmlns:w="http://schemas.openxmlformats.org/wordprocessingml/2006/main" xmlns:w14="http://schemas.microsoft.com/office/word/2010/wordml" xmlns:w15="http://schemas.microsoft.com/office/word/2012/wordml" xmlns:wpg="http://schemas.microsoft.com/office/word/2010/wordprocessingGroup" xmlns:wpi="http://schemas.microsoft.com/office/word/2010/wordprocessingInk" xmlns:wne="http://schemas.microsoft.com/office/word/2006/wordml" xmlns:wps="http://schemas.microsoft.com/office/word/2010/wordprocessingShape" xmlns:cx="http://schemas.microsoft.com/office/drawing/2014/chartex" xmlns:cx1="http://schemas.microsoft.com/office/drawing/2015/9/8/chartex" xmlns:cx2="http://schemas.microsoft.com/office/drawing/2015/10/21/chartex" xmlns:cx3="http://schemas.microsoft.com/office/drawing/2016/5/9/chartex" xmlns:cx4="http://schemas.microsoft.com/office/drawing/2016/5/10/chartex" xmlns:cx5="http://schemas.microsoft.com/office/drawing/2016/5/11/chartex" xmlns:cx6="http://schemas.microsoft.com/office/drawing/2016/5/12/chartex" xmlns:cx7="http://schemas.microsoft.com/office/drawing/2016/5/13/chartex" xmlns:cx8="http://schemas.microsoft.com/office/drawing/2016/5/14/chartex" xmlns:aink="http://schemas.microsoft.com/office/drawing/2016/ink" xmlns:am3d="http://schemas.microsoft.com/office/drawing/2017/model3d" xmlns:w16cex="http://schemas.microsoft.com/office/word/2018/wordml/cex" xmlns:w16cid="http://schemas.microsoft.com/office/word/2016/wordml/cid" xmlns:w16="http://schemas.microsoft.com/office/word/2018/wordml" xmlns:w16sdtdh="http://schemas.microsoft.com/office/word/2020/wordml/sdtdatahash" xmlns:w16se="http://schemas.microsoft.com/office/word/2015/wordml/symex" mc:Ignorable="w14 w15 wp14">
+<w:document xmlns:wpc="http://schemas.microsoft.com/office/word/2010/wordprocessingCanvas" xmlns:cx="http://schemas.microsoft.com/office/drawing/2014/chartex" xmlns:cx1="http://schemas.microsoft.com/office/drawing/2015/9/8/chartex" xmlns:cx2="http://schemas.microsoft.com/office/drawing/2015/10/21/chartex" xmlns:cx3="http://schemas.microsoft.com/office/drawing/2016/5/9/chartex" xmlns:cx4="http://schemas.microsoft.com/office/drawing/2016/5/10/chartex" xmlns:cx5="http://schemas.microsoft.com/office/drawing/2016/5/11/chartex" xmlns:cx6="http://schemas.microsoft.com/office/drawing/2016/5/12/chartex" xmlns:cx7="http://schemas.microsoft.com/office/drawing/2016/5/13/chartex" xmlns:cx8="http://schemas.microsoft.com/office/drawing/2016/5/14/chartex" xmlns:mc="http://schemas.openxmlformats.org/markup-compatibility/2006" xmlns:aink="http://schemas.microsoft.com/office/drawing/2016/ink" xmlns:am3d="http://schemas.microsoft.com/office/drawing/2017/model3d" xmlns:o="urn:schemas-microsoft-com:office:office" xmlns:oel="http://schemas.microsoft.com/office/2019/extlst" xmlns:r="http://schemas.openxmlformats.org/officeDocument/2006/relationships" xmlns:m="http://schemas.openxmlformats.org/officeDocument/2006/math" xmlns:v="urn:schemas-microsoft-com:vml" xmlns:wp14="http://schemas.microsoft.com/office/word/2010/wordprocessingDrawing" xmlns:wp="http://schemas.openxmlformats.org/drawingml/2006/wordprocessingDrawing" xmlns:w10="urn:schemas-microsoft-com:office:word" xmlns:w="http://schemas.openxmlformats.org/wordprocessingml/2006/main" xmlns:w14="http://schemas.microsoft.com/office/word/2010/wordml" xmlns:w15="http://schemas.microsoft.com/office/word/2012/wordml" xmlns:w16cex="http://schemas.microsoft.com/office/word/2018/wordml/cex" xmlns:w16cid="http://schemas.microsoft.com/office/word/2016/wordml/cid" xmlns:w16="http://schemas.microsoft.com/office/word/2018/wordml" xmlns:w16du="http://schemas.microsoft.com/office/word/2023/wordml/word16du" xmlns:w16sdtdh="http://schemas.microsoft.com/office/word/2020/wordml/sdtdatahash" xmlns:w16sdtfl="http://schemas.microsoft.com/office/word/2024/wordml/sdtformatlock" xmlns:w16se="http://schemas.microsoft.com/office/word/2015/wordml/symex" xmlns:wpg="http://schemas.microsoft.com/office/word/2010/wordprocessingGroup" xmlns:wpi="http://schemas.microsoft.com/office/word/2010/wordprocessingInk" xmlns:wne="http://schemas.microsoft.com/office/word/2006/wordml" xmlns:wps="http://schemas.microsoft.com/office/word/2010/wordprocessingShape" mc:Ignorable="w14 w15 w16se w16cid w16 w16cex w16sdtdh w16sdtfl w16du wp14">
   <w:body>
     <w:p>
       <w:pPr>
@@ -16,13 +16,11 @@
         <w:rPr>
           <w:b/>
           <w:bCs/>
-          <w:i w:val="false"/>
-          <w:iCs w:val="false"/>
           <w:color w:val="1F4E79"/>
           <w:sz w:val="40"/>
           <w:szCs w:val="40"/>
         </w:rPr>
-        <w:t xml:space="preserve">DESIGN DOCUMENT</w:t>
+        <w:t>DESIGN DOCUMENT</w:t>
       </w:r>
     </w:p>
     <w:p>
@@ -32,14 +30,10 @@
       </w:pPr>
       <w:r>
         <w:rPr>
-          <w:b w:val="false"/>
-          <w:bCs w:val="false"/>
-          <w:i w:val="false"/>
-          <w:iCs w:val="false"/>
           <w:sz w:val="28"/>
           <w:szCs w:val="28"/>
         </w:rPr>
-        <w:t xml:space="preserve">UML Diagrams and Database Design</w:t>
+        <w:t>UML Diagrams and Database Design</w:t>
       </w:r>
     </w:p>
     <w:p>
@@ -48,15 +42,7 @@
         <w:jc w:val="center"/>
       </w:pPr>
       <w:r>
-        <w:rPr>
-          <w:b w:val="false"/>
-          <w:bCs w:val="false"/>
-          <w:i w:val="false"/>
-          <w:iCs w:val="false"/>
-          <w:sz w:val="22"/>
-          <w:szCs w:val="22"/>
-        </w:rPr>
-        <w:t xml:space="preserve">for</w:t>
+        <w:t>for</w:t>
       </w:r>
     </w:p>
     <w:p>
@@ -68,12 +54,10 @@
         <w:rPr>
           <w:b/>
           <w:bCs/>
-          <w:i w:val="false"/>
-          <w:iCs w:val="false"/>
           <w:sz w:val="34"/>
           <w:szCs w:val="34"/>
         </w:rPr>
-        <w:t xml:space="preserve">INSURANCE MANAGEMENT SYSTEM</w:t>
+        <w:t>INSURANCE MANAGEMENT SYSTEM</w:t>
       </w:r>
     </w:p>
     <w:p>
@@ -83,14 +67,12 @@
       </w:pPr>
       <w:r>
         <w:rPr>
-          <w:b w:val="false"/>
-          <w:bCs w:val="false"/>
           <w:i/>
           <w:iCs/>
           <w:sz w:val="24"/>
           <w:szCs w:val="24"/>
         </w:rPr>
-        <w:t xml:space="preserve">A Java Full-Stack Web Application</w:t>
+        <w:t>A Java Full-Stack Web Application</w:t>
       </w:r>
     </w:p>
     <w:p>
@@ -99,15 +81,7 @@
         <w:jc w:val="center"/>
       </w:pPr>
       <w:r>
-        <w:rPr>
-          <w:b w:val="false"/>
-          <w:bCs w:val="false"/>
-          <w:i w:val="false"/>
-          <w:iCs w:val="false"/>
-          <w:sz w:val="22"/>
-          <w:szCs w:val="22"/>
-        </w:rPr>
-        <w:t xml:space="preserve">Submitted by</w:t>
+        <w:t>Submitted by</w:t>
       </w:r>
     </w:p>
     <w:p>
@@ -119,12 +93,10 @@
         <w:rPr>
           <w:b/>
           <w:bCs/>
-          <w:i w:val="false"/>
-          <w:iCs w:val="false"/>
           <w:sz w:val="26"/>
           <w:szCs w:val="26"/>
         </w:rPr>
-        <w:t xml:space="preserve">[STUDENT NAME]</w:t>
+        <w:t>Sasi Chandan</w:t>
       </w:r>
     </w:p>
     <w:p>
@@ -134,14 +106,17 @@
       </w:pPr>
       <w:r>
         <w:rPr>
-          <w:b w:val="false"/>
-          <w:bCs w:val="false"/>
-          <w:i w:val="false"/>
-          <w:iCs w:val="false"/>
           <w:sz w:val="24"/>
           <w:szCs w:val="24"/>
         </w:rPr>
-        <w:t xml:space="preserve">Roll No: [ROLL NUMBER]</w:t>
+        <w:t xml:space="preserve">Roll No: </w:t>
+      </w:r>
+      <w:r>
+        <w:rPr>
+          <w:sz w:val="24"/>
+          <w:szCs w:val="24"/>
+        </w:rPr>
+        <w:t>2411CS020051</w:t>
       </w:r>
     </w:p>
     <w:p>
@@ -153,12 +128,10 @@
         <w:rPr>
           <w:b/>
           <w:bCs/>
-          <w:i w:val="false"/>
-          <w:iCs w:val="false"/>
           <w:sz w:val="24"/>
           <w:szCs w:val="24"/>
         </w:rPr>
-        <w:t xml:space="preserve">DEPARTMENT OF COMPUTER SCIENCE AND ENGINEERING</w:t>
+        <w:t>DEPARTMENT OF COMPUTER SCIENCE AND ENGINEERING</w:t>
       </w:r>
     </w:p>
     <w:p>
@@ -170,12 +143,10 @@
         <w:rPr>
           <w:b/>
           <w:bCs/>
-          <w:i w:val="false"/>
-          <w:iCs w:val="false"/>
           <w:sz w:val="26"/>
           <w:szCs w:val="26"/>
         </w:rPr>
-        <w:t xml:space="preserve">[COLLEGE NAME]</w:t>
+        <w:t>Malla Reddy University</w:t>
       </w:r>
     </w:p>
     <w:p>
@@ -185,14 +156,31 @@
       </w:pPr>
       <w:r>
         <w:rPr>
-          <w:b w:val="false"/>
-          <w:bCs w:val="false"/>
-          <w:i w:val="false"/>
-          <w:iCs w:val="false"/>
           <w:sz w:val="24"/>
           <w:szCs w:val="24"/>
         </w:rPr>
-        <w:t xml:space="preserve">Academic Year: 2025 - 2026</w:t>
+        <w:t>Academic Year: 202</w:t>
+      </w:r>
+      <w:r>
+        <w:rPr>
+          <w:sz w:val="24"/>
+          <w:szCs w:val="24"/>
+        </w:rPr>
+        <w:t>4</w:t>
+      </w:r>
+      <w:r>
+        <w:rPr>
+          <w:sz w:val="24"/>
+          <w:szCs w:val="24"/>
+        </w:rPr>
+        <w:t xml:space="preserve"> - 202</w:t>
+      </w:r>
+      <w:r>
+        <w:rPr>
+          <w:sz w:val="24"/>
+          <w:szCs w:val="24"/>
+        </w:rPr>
+        <w:t>8</w:t>
       </w:r>
     </w:p>
     <w:p>
@@ -213,20 +201,634 @@
           <w:sz w:val="32"/>
           <w:szCs w:val="32"/>
         </w:rPr>
-        <w:t xml:space="preserve">TABLE OF CONTENTS</w:t>
+        <w:lastRenderedPageBreak/>
+        <w:t>TABLE OF CONTENTS</w:t>
       </w:r>
     </w:p>
     <w:sdt>
       <w:sdtPr>
         <w:alias w:val="Table of Contents"/>
+        <w:id w:val="-308084327"/>
       </w:sdtPr>
       <w:sdtContent>
         <w:p>
+          <w:pPr>
+            <w:pStyle w:val="TOC1"/>
+            <w:tabs>
+              <w:tab w:val="right" w:leader="dot" w:pos="9016"/>
+            </w:tabs>
+            <w:rPr>
+              <w:noProof/>
+            </w:rPr>
+          </w:pPr>
           <w:r>
-            <w:fldChar w:fldCharType="begin" w:dirty="true"/>
-            <w:instrText xml:space="preserve">TOC \h \o "1-2"</w:instrText>
+            <w:fldChar w:fldCharType="begin"/>
+          </w:r>
+          <w:r>
+            <w:instrText>TOC \h \o "1-2"</w:instrText>
+          </w:r>
+          <w:r>
             <w:fldChar w:fldCharType="separate"/>
           </w:r>
+          <w:hyperlink w:anchor="_Toc234438917" w:history="1">
+            <w:r>
+              <w:rPr>
+                <w:rStyle w:val="Hyperlink"/>
+                <w:noProof/>
+              </w:rPr>
+              <w:t>1. INTRODUCTION</w:t>
+            </w:r>
+            <w:r>
+              <w:rPr>
+                <w:noProof/>
+              </w:rPr>
+              <w:tab/>
+            </w:r>
+            <w:r>
+              <w:rPr>
+                <w:noProof/>
+              </w:rPr>
+              <w:fldChar w:fldCharType="begin"/>
+            </w:r>
+            <w:r>
+              <w:rPr>
+                <w:noProof/>
+              </w:rPr>
+              <w:instrText xml:space="preserve"> PAGEREF _Toc234438917 \h </w:instrText>
+            </w:r>
+            <w:r>
+              <w:rPr>
+                <w:noProof/>
+              </w:rPr>
+            </w:r>
+            <w:r>
+              <w:rPr>
+                <w:noProof/>
+              </w:rPr>
+              <w:fldChar w:fldCharType="separate"/>
+            </w:r>
+            <w:r>
+              <w:rPr>
+                <w:noProof/>
+              </w:rPr>
+              <w:t>3</w:t>
+            </w:r>
+            <w:r>
+              <w:rPr>
+                <w:noProof/>
+              </w:rPr>
+              <w:fldChar w:fldCharType="end"/>
+            </w:r>
+          </w:hyperlink>
+        </w:p>
+        <w:p>
+          <w:pPr>
+            <w:pStyle w:val="TOC1"/>
+            <w:tabs>
+              <w:tab w:val="right" w:leader="dot" w:pos="9016"/>
+            </w:tabs>
+            <w:rPr>
+              <w:noProof/>
+            </w:rPr>
+          </w:pPr>
+          <w:hyperlink w:anchor="_Toc234438918" w:history="1">
+            <w:r>
+              <w:rPr>
+                <w:rStyle w:val="Hyperlink"/>
+                <w:noProof/>
+              </w:rPr>
+              <w:t>2. SYSTEM ARCHITECTURE</w:t>
+            </w:r>
+            <w:r>
+              <w:rPr>
+                <w:noProof/>
+              </w:rPr>
+              <w:tab/>
+            </w:r>
+            <w:r>
+              <w:rPr>
+                <w:noProof/>
+              </w:rPr>
+              <w:fldChar w:fldCharType="begin"/>
+            </w:r>
+            <w:r>
+              <w:rPr>
+                <w:noProof/>
+              </w:rPr>
+              <w:instrText xml:space="preserve"> PAGEREF _Toc234438918 \h </w:instrText>
+            </w:r>
+            <w:r>
+              <w:rPr>
+                <w:noProof/>
+              </w:rPr>
+            </w:r>
+            <w:r>
+              <w:rPr>
+                <w:noProof/>
+              </w:rPr>
+              <w:fldChar w:fldCharType="separate"/>
+            </w:r>
+            <w:r>
+              <w:rPr>
+                <w:noProof/>
+              </w:rPr>
+              <w:t>3</w:t>
+            </w:r>
+            <w:r>
+              <w:rPr>
+                <w:noProof/>
+              </w:rPr>
+              <w:fldChar w:fldCharType="end"/>
+            </w:r>
+          </w:hyperlink>
+        </w:p>
+        <w:p>
+          <w:pPr>
+            <w:pStyle w:val="TOC1"/>
+            <w:tabs>
+              <w:tab w:val="right" w:leader="dot" w:pos="9016"/>
+            </w:tabs>
+            <w:rPr>
+              <w:noProof/>
+            </w:rPr>
+          </w:pPr>
+          <w:hyperlink w:anchor="_Toc234438919" w:history="1">
+            <w:r>
+              <w:rPr>
+                <w:rStyle w:val="Hyperlink"/>
+                <w:noProof/>
+              </w:rPr>
+              <w:t>3. USE CASE DIAGRAM</w:t>
+            </w:r>
+            <w:r>
+              <w:rPr>
+                <w:noProof/>
+              </w:rPr>
+              <w:tab/>
+            </w:r>
+            <w:r>
+              <w:rPr>
+                <w:noProof/>
+              </w:rPr>
+              <w:fldChar w:fldCharType="begin"/>
+            </w:r>
+            <w:r>
+              <w:rPr>
+                <w:noProof/>
+              </w:rPr>
+              <w:instrText xml:space="preserve"> PAGEREF _Toc234438919 \h </w:instrText>
+            </w:r>
+            <w:r>
+              <w:rPr>
+                <w:noProof/>
+              </w:rPr>
+            </w:r>
+            <w:r>
+              <w:rPr>
+                <w:noProof/>
+              </w:rPr>
+              <w:fldChar w:fldCharType="separate"/>
+            </w:r>
+            <w:r>
+              <w:rPr>
+                <w:noProof/>
+              </w:rPr>
+              <w:t>5</w:t>
+            </w:r>
+            <w:r>
+              <w:rPr>
+                <w:noProof/>
+              </w:rPr>
+              <w:fldChar w:fldCharType="end"/>
+            </w:r>
+          </w:hyperlink>
+        </w:p>
+        <w:p>
+          <w:pPr>
+            <w:pStyle w:val="TOC1"/>
+            <w:tabs>
+              <w:tab w:val="right" w:leader="dot" w:pos="9016"/>
+            </w:tabs>
+            <w:rPr>
+              <w:noProof/>
+            </w:rPr>
+          </w:pPr>
+          <w:hyperlink w:anchor="_Toc234438920" w:history="1">
+            <w:r>
+              <w:rPr>
+                <w:rStyle w:val="Hyperlink"/>
+                <w:noProof/>
+              </w:rPr>
+              <w:t>4. CLASS DIAGRAM</w:t>
+            </w:r>
+            <w:r>
+              <w:rPr>
+                <w:noProof/>
+              </w:rPr>
+              <w:tab/>
+            </w:r>
+            <w:r>
+              <w:rPr>
+                <w:noProof/>
+              </w:rPr>
+              <w:fldChar w:fldCharType="begin"/>
+            </w:r>
+            <w:r>
+              <w:rPr>
+                <w:noProof/>
+              </w:rPr>
+              <w:instrText xml:space="preserve"> PAGEREF _Toc234438920 \h </w:instrText>
+            </w:r>
+            <w:r>
+              <w:rPr>
+                <w:noProof/>
+              </w:rPr>
+            </w:r>
+            <w:r>
+              <w:rPr>
+                <w:noProof/>
+              </w:rPr>
+              <w:fldChar w:fldCharType="separate"/>
+            </w:r>
+            <w:r>
+              <w:rPr>
+                <w:noProof/>
+              </w:rPr>
+              <w:t>7</w:t>
+            </w:r>
+            <w:r>
+              <w:rPr>
+                <w:noProof/>
+              </w:rPr>
+              <w:fldChar w:fldCharType="end"/>
+            </w:r>
+          </w:hyperlink>
+        </w:p>
+        <w:p>
+          <w:pPr>
+            <w:pStyle w:val="TOC1"/>
+            <w:tabs>
+              <w:tab w:val="right" w:leader="dot" w:pos="9016"/>
+            </w:tabs>
+            <w:rPr>
+              <w:noProof/>
+            </w:rPr>
+          </w:pPr>
+          <w:hyperlink w:anchor="_Toc234438921" w:history="1">
+            <w:r>
+              <w:rPr>
+                <w:rStyle w:val="Hyperlink"/>
+                <w:noProof/>
+              </w:rPr>
+              <w:t>5. SEQUENCE DIAGRAMS</w:t>
+            </w:r>
+            <w:r>
+              <w:rPr>
+                <w:noProof/>
+              </w:rPr>
+              <w:tab/>
+            </w:r>
+            <w:r>
+              <w:rPr>
+                <w:noProof/>
+              </w:rPr>
+              <w:fldChar w:fldCharType="begin"/>
+            </w:r>
+            <w:r>
+              <w:rPr>
+                <w:noProof/>
+              </w:rPr>
+              <w:instrText xml:space="preserve"> PAGEREF _Toc234438921 \h </w:instrText>
+            </w:r>
+            <w:r>
+              <w:rPr>
+                <w:noProof/>
+              </w:rPr>
+            </w:r>
+            <w:r>
+              <w:rPr>
+                <w:noProof/>
+              </w:rPr>
+              <w:fldChar w:fldCharType="separate"/>
+            </w:r>
+            <w:r>
+              <w:rPr>
+                <w:noProof/>
+              </w:rPr>
+              <w:t>9</w:t>
+            </w:r>
+            <w:r>
+              <w:rPr>
+                <w:noProof/>
+              </w:rPr>
+              <w:fldChar w:fldCharType="end"/>
+            </w:r>
+          </w:hyperlink>
+        </w:p>
+        <w:p>
+          <w:pPr>
+            <w:pStyle w:val="TOC2"/>
+            <w:tabs>
+              <w:tab w:val="right" w:leader="dot" w:pos="9016"/>
+            </w:tabs>
+            <w:rPr>
+              <w:noProof/>
+            </w:rPr>
+          </w:pPr>
+          <w:hyperlink w:anchor="_Toc234438922" w:history="1">
+            <w:r>
+              <w:rPr>
+                <w:rStyle w:val="Hyperlink"/>
+                <w:noProof/>
+              </w:rPr>
+              <w:t>5.1 User Login with JWT Authentication</w:t>
+            </w:r>
+            <w:r>
+              <w:rPr>
+                <w:noProof/>
+              </w:rPr>
+              <w:tab/>
+            </w:r>
+            <w:r>
+              <w:rPr>
+                <w:noProof/>
+              </w:rPr>
+              <w:fldChar w:fldCharType="begin"/>
+            </w:r>
+            <w:r>
+              <w:rPr>
+                <w:noProof/>
+              </w:rPr>
+              <w:instrText xml:space="preserve"> PAGEREF _Toc234438922 \h </w:instrText>
+            </w:r>
+            <w:r>
+              <w:rPr>
+                <w:noProof/>
+              </w:rPr>
+            </w:r>
+            <w:r>
+              <w:rPr>
+                <w:noProof/>
+              </w:rPr>
+              <w:fldChar w:fldCharType="separate"/>
+            </w:r>
+            <w:r>
+              <w:rPr>
+                <w:noProof/>
+              </w:rPr>
+              <w:t>9</w:t>
+            </w:r>
+            <w:r>
+              <w:rPr>
+                <w:noProof/>
+              </w:rPr>
+              <w:fldChar w:fldCharType="end"/>
+            </w:r>
+          </w:hyperlink>
+        </w:p>
+        <w:p>
+          <w:pPr>
+            <w:pStyle w:val="TOC2"/>
+            <w:tabs>
+              <w:tab w:val="right" w:leader="dot" w:pos="9016"/>
+            </w:tabs>
+            <w:rPr>
+              <w:noProof/>
+            </w:rPr>
+          </w:pPr>
+          <w:hyperlink w:anchor="_Toc234438923" w:history="1">
+            <w:r>
+              <w:rPr>
+                <w:rStyle w:val="Hyperlink"/>
+                <w:noProof/>
+              </w:rPr>
+              <w:t>5.2 Policy Application and Approval</w:t>
+            </w:r>
+            <w:r>
+              <w:rPr>
+                <w:noProof/>
+              </w:rPr>
+              <w:tab/>
+            </w:r>
+            <w:r>
+              <w:rPr>
+                <w:noProof/>
+              </w:rPr>
+              <w:fldChar w:fldCharType="begin"/>
+            </w:r>
+            <w:r>
+              <w:rPr>
+                <w:noProof/>
+              </w:rPr>
+              <w:instrText xml:space="preserve"> PAGEREF _Toc234438923 \h </w:instrText>
+            </w:r>
+            <w:r>
+              <w:rPr>
+                <w:noProof/>
+              </w:rPr>
+            </w:r>
+            <w:r>
+              <w:rPr>
+                <w:noProof/>
+              </w:rPr>
+              <w:fldChar w:fldCharType="separate"/>
+            </w:r>
+            <w:r>
+              <w:rPr>
+                <w:noProof/>
+              </w:rPr>
+              <w:t>9</w:t>
+            </w:r>
+            <w:r>
+              <w:rPr>
+                <w:noProof/>
+              </w:rPr>
+              <w:fldChar w:fldCharType="end"/>
+            </w:r>
+          </w:hyperlink>
+        </w:p>
+        <w:p>
+          <w:pPr>
+            <w:pStyle w:val="TOC2"/>
+            <w:tabs>
+              <w:tab w:val="right" w:leader="dot" w:pos="9016"/>
+            </w:tabs>
+            <w:rPr>
+              <w:noProof/>
+            </w:rPr>
+          </w:pPr>
+          <w:hyperlink w:anchor="_Toc234438924" w:history="1">
+            <w:r>
+              <w:rPr>
+                <w:rStyle w:val="Hyperlink"/>
+                <w:noProof/>
+              </w:rPr>
+              <w:t>5.3 Claim Filing, Review and Settlement</w:t>
+            </w:r>
+            <w:r>
+              <w:rPr>
+                <w:noProof/>
+              </w:rPr>
+              <w:tab/>
+            </w:r>
+            <w:r>
+              <w:rPr>
+                <w:noProof/>
+              </w:rPr>
+              <w:fldChar w:fldCharType="begin"/>
+            </w:r>
+            <w:r>
+              <w:rPr>
+                <w:noProof/>
+              </w:rPr>
+              <w:instrText xml:space="preserve"> PAGEREF _Toc234438924 \h </w:instrText>
+            </w:r>
+            <w:r>
+              <w:rPr>
+                <w:noProof/>
+              </w:rPr>
+            </w:r>
+            <w:r>
+              <w:rPr>
+                <w:noProof/>
+              </w:rPr>
+              <w:fldChar w:fldCharType="separate"/>
+            </w:r>
+            <w:r>
+              <w:rPr>
+                <w:noProof/>
+              </w:rPr>
+              <w:t>11</w:t>
+            </w:r>
+            <w:r>
+              <w:rPr>
+                <w:noProof/>
+              </w:rPr>
+              <w:fldChar w:fldCharType="end"/>
+            </w:r>
+          </w:hyperlink>
+        </w:p>
+        <w:p>
+          <w:pPr>
+            <w:pStyle w:val="TOC1"/>
+            <w:tabs>
+              <w:tab w:val="right" w:leader="dot" w:pos="9016"/>
+            </w:tabs>
+            <w:rPr>
+              <w:noProof/>
+            </w:rPr>
+          </w:pPr>
+          <w:hyperlink w:anchor="_Toc234438925" w:history="1">
+            <w:r>
+              <w:rPr>
+                <w:rStyle w:val="Hyperlink"/>
+                <w:noProof/>
+              </w:rPr>
+              <w:t>6. DATABASE DESIGN (ER DIAGRAM)</w:t>
+            </w:r>
+            <w:r>
+              <w:rPr>
+                <w:noProof/>
+              </w:rPr>
+              <w:tab/>
+            </w:r>
+            <w:r>
+              <w:rPr>
+                <w:noProof/>
+              </w:rPr>
+              <w:fldChar w:fldCharType="begin"/>
+            </w:r>
+            <w:r>
+              <w:rPr>
+                <w:noProof/>
+              </w:rPr>
+              <w:instrText xml:space="preserve"> PAGEREF _Toc234438925 \h </w:instrText>
+            </w:r>
+            <w:r>
+              <w:rPr>
+                <w:noProof/>
+              </w:rPr>
+            </w:r>
+            <w:r>
+              <w:rPr>
+                <w:noProof/>
+              </w:rPr>
+              <w:fldChar w:fldCharType="separate"/>
+            </w:r>
+            <w:r>
+              <w:rPr>
+                <w:noProof/>
+              </w:rPr>
+              <w:t>12</w:t>
+            </w:r>
+            <w:r>
+              <w:rPr>
+                <w:noProof/>
+              </w:rPr>
+              <w:fldChar w:fldCharType="end"/>
+            </w:r>
+          </w:hyperlink>
+        </w:p>
+        <w:p>
+          <w:pPr>
+            <w:pStyle w:val="TOC2"/>
+            <w:tabs>
+              <w:tab w:val="right" w:leader="dot" w:pos="9016"/>
+            </w:tabs>
+            <w:rPr>
+              <w:noProof/>
+            </w:rPr>
+          </w:pPr>
+          <w:hyperlink w:anchor="_Toc234438926" w:history="1">
+            <w:r>
+              <w:rPr>
+                <w:rStyle w:val="Hyperlink"/>
+                <w:noProof/>
+              </w:rPr>
+              <w:t>6.1 Relationship Summary</w:t>
+            </w:r>
+            <w:r>
+              <w:rPr>
+                <w:noProof/>
+              </w:rPr>
+              <w:tab/>
+            </w:r>
+            <w:r>
+              <w:rPr>
+                <w:noProof/>
+              </w:rPr>
+              <w:fldChar w:fldCharType="begin"/>
+            </w:r>
+            <w:r>
+              <w:rPr>
+                <w:noProof/>
+              </w:rPr>
+              <w:instrText xml:space="preserve"> PAGEREF _Toc234438926 \h </w:instrText>
+            </w:r>
+            <w:r>
+              <w:rPr>
+                <w:noProof/>
+              </w:rPr>
+            </w:r>
+            <w:r>
+              <w:rPr>
+                <w:noProof/>
+              </w:rPr>
+              <w:fldChar w:fldCharType="separate"/>
+            </w:r>
+            <w:r>
+              <w:rPr>
+                <w:noProof/>
+              </w:rPr>
+              <w:t>12</w:t>
+            </w:r>
+            <w:r>
+              <w:rPr>
+                <w:noProof/>
+              </w:rPr>
+              <w:fldChar w:fldCharType="end"/>
+            </w:r>
+          </w:hyperlink>
         </w:p>
         <w:p>
           <w:r>
@@ -244,26 +846,29 @@
       <w:pPr>
         <w:pStyle w:val="Heading1"/>
       </w:pPr>
-      <w:r>
-        <w:t xml:space="preserve">1. INTRODUCTION</w:t>
-      </w:r>
-    </w:p>
-    <w:p>
-      <w:pPr>
-        <w:spacing w:after="120" w:line="300"/>
+      <w:bookmarkStart w:id="0" w:name="_Toc234438917"/>
+      <w:r>
+        <w:lastRenderedPageBreak/>
+        <w:t>1. INTRODUCTION</w:t>
+      </w:r>
+      <w:bookmarkEnd w:id="0"/>
+    </w:p>
+    <w:p>
+      <w:pPr>
+        <w:spacing w:after="120" w:line="300" w:lineRule="auto"/>
         <w:jc w:val="both"/>
       </w:pPr>
       <w:r>
-        <w:t xml:space="preserve">This document presents the design of the Insurance Management System through standard UML (Unified Modeling Language) diagrams and the Entity-Relationship (ER) diagram of the database. It complements the Software Requirements Specification (SRS) submitted for Phase 1 of the project. The diagrams in this document were prepared using PlantUML, an open-source diagramming tool, and they will guide the implementation of the backend (Spring Boot), the frontend (React), and the MySQL database in the subsequent phases.</w:t>
-      </w:r>
-    </w:p>
-    <w:p>
-      <w:pPr>
-        <w:spacing w:after="120" w:line="300"/>
+        <w:t>This document presents the design of the Insurance Management System through standard UML (Unified Modeling Language) diagrams and the Entity-Relationship (ER) diagram of the database. It complements the Software Requirements Specification (SRS) submitted for Phase 1 of the project. The diagrams in this document were prepared using PlantUML, an open-source diagramming tool, and they will guide the implementation of the backend (Spring Boot), the frontend (React), and the MySQL database in the subsequent phases.</w:t>
+      </w:r>
+    </w:p>
+    <w:p>
+      <w:pPr>
+        <w:spacing w:after="120" w:line="300" w:lineRule="auto"/>
         <w:jc w:val="both"/>
       </w:pPr>
       <w:r>
-        <w:t xml:space="preserve">The following diagrams are included:</w:t>
+        <w:t>The following diagrams are included:</w:t>
       </w:r>
     </w:p>
     <w:p>
@@ -276,7 +881,7 @@
         <w:spacing w:after="60"/>
       </w:pPr>
       <w:r>
-        <w:t xml:space="preserve">System Architecture Diagram - the three-tier structure of the application</w:t>
+        <w:t>System Architecture Diagram - the three-tier structure of the application</w:t>
       </w:r>
     </w:p>
     <w:p>
@@ -289,7 +894,7 @@
         <w:spacing w:after="60"/>
       </w:pPr>
       <w:r>
-        <w:t xml:space="preserve">Use Case Diagram - the functionality available to each actor (Admin, Agent, Customer)</w:t>
+        <w:t>Use Case Diagram - the functionality available to each actor (Admin, Agent, Customer)</w:t>
       </w:r>
     </w:p>
     <w:p>
@@ -302,7 +907,7 @@
         <w:spacing w:after="60"/>
       </w:pPr>
       <w:r>
-        <w:t xml:space="preserve">Class Diagram - the domain model with entities, attributes, operations, and relationships</w:t>
+        <w:t>Class Diagram - the domain model with entities, attributes, operations, and relationships</w:t>
       </w:r>
     </w:p>
     <w:p>
@@ -315,7 +920,7 @@
         <w:spacing w:after="60"/>
       </w:pPr>
       <w:r>
-        <w:t xml:space="preserve">Sequence Diagrams - the interaction flow for login, policy approval, and claim settlement</w:t>
+        <w:t>Sequence Diagrams - the interaction flow for login, policy approval, and claim settlement</w:t>
       </w:r>
     </w:p>
     <w:p>
@@ -328,36 +933,42 @@
         <w:spacing w:after="60"/>
       </w:pPr>
       <w:r>
-        <w:t xml:space="preserve">ER Diagram - the normalized database schema with keys and relationships</w:t>
+        <w:t>ER Diagram - the normalized database schema with keys and relationships</w:t>
       </w:r>
     </w:p>
     <w:p>
       <w:pPr>
         <w:pStyle w:val="Heading1"/>
       </w:pPr>
-      <w:r>
-        <w:t xml:space="preserve">2. SYSTEM ARCHITECTURE</w:t>
-      </w:r>
-    </w:p>
-    <w:p>
-      <w:pPr>
-        <w:spacing w:after="120" w:line="300"/>
+      <w:bookmarkStart w:id="1" w:name="_Toc234438918"/>
+      <w:r>
+        <w:t>2. SYSTEM ARCHITECTURE</w:t>
+      </w:r>
+      <w:bookmarkEnd w:id="1"/>
+    </w:p>
+    <w:p>
+      <w:pPr>
+        <w:spacing w:after="120" w:line="300" w:lineRule="auto"/>
         <w:jc w:val="both"/>
       </w:pPr>
       <w:r>
-        <w:t xml:space="preserve">The system follows a three-tier architecture. The presentation tier is a responsive React single-page application. The application tier is a Spring Boot REST API organized in layers: a Spring Security JWT filter authenticates every request, controllers expose REST endpoints and exchange DTOs, services contain the business logic within transactions, and repositories perform persistence through Spring Data JPA. A global exception handler converts every error into a consistent JSON response. The data tier is a normalized MySQL 8 database.</w:t>
-      </w:r>
-    </w:p>
-    <w:p>
-      <w:pPr>
-        <w:spacing w:after="80" w:before="120"/>
+        <w:t>The system follows a three-tier architecture. The presentation tier is a responsive React single-page application. The application tier is a Spring Boot REST API organized in layers: a Spring Security JWT filter authenticates every request, controllers expose REST endpoints and exchange DTOs, services contain the business logic within transactions, and repositories perform persistence through Spring Data JPA. A global exception handler converts every error into a consistent JSON response. The data tier is a normalized MySQL 8 database.</w:t>
+      </w:r>
+    </w:p>
+    <w:p>
+      <w:pPr>
+        <w:spacing w:before="120" w:after="80"/>
         <w:jc w:val="center"/>
       </w:pPr>
       <w:r>
+        <w:rPr>
+          <w:noProof/>
+        </w:rPr>
+        <w:lastRenderedPageBreak/>
         <w:drawing>
-          <wp:inline distT="0" distB="0" distL="0" distR="0">
+          <wp:inline distT="0" distB="0" distL="0" distR="0" wp14:anchorId="2A888B0B" wp14:editId="534AE7C2">
             <wp:extent cx="4762500" cy="7620000"/>
-            <wp:effectExtent t="0" r="0" b="0" l="0"/>
+            <wp:effectExtent l="0" t="0" r="0" b="0"/>
             <wp:docPr id="1" name="Figure 2.1: Three-Tier Architecture of the Insurance Management System" descr="Figure 2.1: Three-Tier Architecture of the Insurance Management System" title="Figure 2.1: Three-Tier Architecture of the Insurance Management System"/>
             <wp:cNvGraphicFramePr>
               <a:graphicFrameLocks xmlns:a="http://schemas.openxmlformats.org/drawingml/2006/main" noChangeAspect="1"/>
@@ -366,13 +977,13 @@
               <a:graphicData uri="http://schemas.openxmlformats.org/drawingml/2006/picture">
                 <pic:pic xmlns:pic="http://schemas.openxmlformats.org/drawingml/2006/picture">
                   <pic:nvPicPr>
-                    <pic:cNvPr id="0" name="" descr=""/>
+                    <pic:cNvPr id="0" name=""/>
                     <pic:cNvPicPr>
                       <a:picLocks noChangeAspect="1" noChangeArrowheads="1"/>
                     </pic:cNvPicPr>
                   </pic:nvPicPr>
                   <pic:blipFill>
-                    <a:blip r:embed="rId9" cstate="none"/>
+                    <a:blip r:embed="rId7"/>
                     <a:srcRect/>
                     <a:stretch>
                       <a:fillRect/>
@@ -407,7 +1018,7 @@
           <w:sz w:val="20"/>
           <w:szCs w:val="20"/>
         </w:rPr>
-        <w:t xml:space="preserve">Figure 2.1: Three-Tier Architecture of the Insurance Management System</w:t>
+        <w:t>Figure 2.1: Three-Tier Architecture of the Insurance Management System</w:t>
       </w:r>
     </w:p>
     <w:p>
@@ -419,30 +1030,37 @@
       <w:pPr>
         <w:pStyle w:val="Heading1"/>
       </w:pPr>
-      <w:r>
-        <w:t xml:space="preserve">3. USE CASE DIAGRAM</w:t>
-      </w:r>
-    </w:p>
-    <w:p>
-      <w:pPr>
-        <w:spacing w:after="120" w:line="300"/>
+      <w:bookmarkStart w:id="2" w:name="_Toc234438919"/>
+      <w:r>
+        <w:lastRenderedPageBreak/>
+        <w:t>3. USE CASE DIAGRAM</w:t>
+      </w:r>
+      <w:bookmarkEnd w:id="2"/>
+    </w:p>
+    <w:p>
+      <w:pPr>
+        <w:spacing w:after="120" w:line="300" w:lineRule="auto"/>
         <w:jc w:val="both"/>
       </w:pPr>
       <w:r>
-        <w:t xml:space="preserve">The use case diagram shows the functionality offered by the system to its three actors. The Customer registers, browses insurance plans of all four types, applies for policies, pays premiums, files claims, and tracks statuses. The Agent reviews and decides the policy applications and claims of assigned customers. The Admin manages users, agents, and plans, assigns agents to customers, gives the final settlement decision on claims, and monitors the system through dashboards.</w:t>
-      </w:r>
-    </w:p>
-    <w:p>
-      <w:pPr>
-        <w:spacing w:after="80" w:before="120"/>
+        <w:t>The use case diagram shows the functionality offered by the system to its three actors. The Customer registers, browses insurance plans of all four types, applies for policies, pays premiums, files claims, and tracks statuses. The Agent reviews and decides the policy applications and claims of assigned customers. The Admin manages users, agents, and plans, assigns agents to customers, gives the final settlement decision on claims, and monitors the system through dashboards.</w:t>
+      </w:r>
+    </w:p>
+    <w:p>
+      <w:pPr>
+        <w:spacing w:before="120" w:after="80"/>
         <w:jc w:val="center"/>
       </w:pPr>
       <w:r>
+        <w:rPr>
+          <w:noProof/>
+        </w:rPr>
+        <w:lastRenderedPageBreak/>
         <w:drawing>
-          <wp:inline distT="0" distB="0" distL="0" distR="0">
+          <wp:inline distT="0" distB="0" distL="0" distR="0" wp14:anchorId="7BA9D13E" wp14:editId="3CCD3A93">
             <wp:extent cx="2952750" cy="7515225"/>
-            <wp:effectExtent t="0" r="0" b="0" l="0"/>
-            <wp:docPr id="1" name="Figure 3.1: Use Case Diagram" descr="Figure 3.1: Use Case Diagram" title="Figure 3.1: Use Case Diagram"/>
+            <wp:effectExtent l="0" t="0" r="0" b="0"/>
+            <wp:docPr id="1243903591" name="Figure 3.1: Use Case Diagram" descr="Figure 3.1: Use Case Diagram" title="Figure 3.1: Use Case Diagram"/>
             <wp:cNvGraphicFramePr>
               <a:graphicFrameLocks xmlns:a="http://schemas.openxmlformats.org/drawingml/2006/main" noChangeAspect="1"/>
             </wp:cNvGraphicFramePr>
@@ -450,13 +1068,13 @@
               <a:graphicData uri="http://schemas.openxmlformats.org/drawingml/2006/picture">
                 <pic:pic xmlns:pic="http://schemas.openxmlformats.org/drawingml/2006/picture">
                   <pic:nvPicPr>
-                    <pic:cNvPr id="0" name="" descr=""/>
+                    <pic:cNvPr id="0" name=""/>
                     <pic:cNvPicPr>
                       <a:picLocks noChangeAspect="1" noChangeArrowheads="1"/>
                     </pic:cNvPicPr>
                   </pic:nvPicPr>
                   <pic:blipFill>
-                    <a:blip r:embed="rId10" cstate="none"/>
+                    <a:blip r:embed="rId8"/>
                     <a:srcRect/>
                     <a:stretch>
                       <a:fillRect/>
@@ -491,7 +1109,7 @@
           <w:sz w:val="20"/>
           <w:szCs w:val="20"/>
         </w:rPr>
-        <w:t xml:space="preserve">Figure 3.1: Use Case Diagram</w:t>
+        <w:t>Figure 3.1: Use Case Diagram</w:t>
       </w:r>
     </w:p>
     <w:p>
@@ -503,30 +1121,37 @@
       <w:pPr>
         <w:pStyle w:val="Heading1"/>
       </w:pPr>
-      <w:r>
-        <w:t xml:space="preserve">4. CLASS DIAGRAM</w:t>
-      </w:r>
-    </w:p>
-    <w:p>
-      <w:pPr>
-        <w:spacing w:after="120" w:line="300"/>
+      <w:bookmarkStart w:id="3" w:name="_Toc234438920"/>
+      <w:r>
+        <w:lastRenderedPageBreak/>
+        <w:t>4. CLASS DIAGRAM</w:t>
+      </w:r>
+      <w:bookmarkEnd w:id="3"/>
+    </w:p>
+    <w:p>
+      <w:pPr>
+        <w:spacing w:after="120" w:line="300" w:lineRule="auto"/>
         <w:jc w:val="both"/>
       </w:pPr>
       <w:r>
-        <w:t xml:space="preserve">The class diagram models the domain entities of the system and their relationships. A User plays one of three roles (ADMIN, AGENT, CUSTOMER). A Plan is an insurance product template of one insurance type (LIFE, HEALTH, MOTOR, HOME). A Policy is created when a customer applies for a plan and carries its own life-cycle status. Claims and Payments are always raised against a specific policy. AgentAssignment links one agent to many customers, and Notifications are delivered per user. Enumerations capture all status values so that the same model works uniformly for every insurance type.</w:t>
-      </w:r>
-    </w:p>
-    <w:p>
-      <w:pPr>
-        <w:spacing w:after="80" w:before="120"/>
+        <w:t>The class diagram models the domain entities of the system and their relationships. A User plays one of three roles (ADMIN, AGENT, CUSTOMER). A Plan is an insurance product template of one insurance type (LIFE, HEALTH, MOTOR, HOME). A Policy is created when a customer applies for a plan and carries its own life-cycle status. Claims and Payments are always raised against a specific policy. AgentAssignment links one agent to many customers, and Notifications are delivered per user. Enumerations capture all status values so that the same model works uniformly for every insurance type.</w:t>
+      </w:r>
+    </w:p>
+    <w:p>
+      <w:pPr>
+        <w:spacing w:before="120" w:after="80"/>
         <w:jc w:val="center"/>
       </w:pPr>
       <w:r>
+        <w:rPr>
+          <w:noProof/>
+        </w:rPr>
+        <w:lastRenderedPageBreak/>
         <w:drawing>
-          <wp:inline distT="0" distB="0" distL="0" distR="0">
+          <wp:inline distT="0" distB="0" distL="0" distR="0" wp14:anchorId="284CE768" wp14:editId="295637A1">
             <wp:extent cx="5715000" cy="7315200"/>
-            <wp:effectExtent t="0" r="0" b="0" l="0"/>
-            <wp:docPr id="1" name="Figure 4.1: Class Diagram (Domain Model)" descr="Figure 4.1: Class Diagram (Domain Model)" title="Figure 4.1: Class Diagram (Domain Model)"/>
+            <wp:effectExtent l="0" t="0" r="0" b="0"/>
+            <wp:docPr id="415278280" name="Figure 4.1: Class Diagram (Domain Model)" descr="Figure 4.1: Class Diagram (Domain Model)" title="Figure 4.1: Class Diagram (Domain Model)"/>
             <wp:cNvGraphicFramePr>
               <a:graphicFrameLocks xmlns:a="http://schemas.openxmlformats.org/drawingml/2006/main" noChangeAspect="1"/>
             </wp:cNvGraphicFramePr>
@@ -534,13 +1159,13 @@
               <a:graphicData uri="http://schemas.openxmlformats.org/drawingml/2006/picture">
                 <pic:pic xmlns:pic="http://schemas.openxmlformats.org/drawingml/2006/picture">
                   <pic:nvPicPr>
-                    <pic:cNvPr id="0" name="" descr=""/>
+                    <pic:cNvPr id="0" name=""/>
                     <pic:cNvPicPr>
                       <a:picLocks noChangeAspect="1" noChangeArrowheads="1"/>
                     </pic:cNvPicPr>
                   </pic:nvPicPr>
                   <pic:blipFill>
-                    <a:blip r:embed="rId11" cstate="none"/>
+                    <a:blip r:embed="rId9"/>
                     <a:srcRect/>
                     <a:stretch>
                       <a:fillRect/>
@@ -575,7 +1200,7 @@
           <w:sz w:val="20"/>
           <w:szCs w:val="20"/>
         </w:rPr>
-        <w:t xml:space="preserve">Figure 4.1: Class Diagram (Domain Model)</w:t>
+        <w:t>Figure 4.1: Class Diagram (Domain Model)</w:t>
       </w:r>
     </w:p>
     <w:p>
@@ -587,38 +1212,46 @@
       <w:pPr>
         <w:pStyle w:val="Heading1"/>
       </w:pPr>
-      <w:r>
-        <w:t xml:space="preserve">5. SEQUENCE DIAGRAMS</w:t>
-      </w:r>
+      <w:bookmarkStart w:id="4" w:name="_Toc234438921"/>
+      <w:r>
+        <w:lastRenderedPageBreak/>
+        <w:t>5. SEQUENCE DIAGRAMS</w:t>
+      </w:r>
+      <w:bookmarkEnd w:id="4"/>
     </w:p>
     <w:p>
       <w:pPr>
         <w:pStyle w:val="Heading2"/>
       </w:pPr>
-      <w:r>
-        <w:t xml:space="preserve">5.1 User Login with JWT Authentication</w:t>
-      </w:r>
-    </w:p>
-    <w:p>
-      <w:pPr>
-        <w:spacing w:after="120" w:line="300"/>
+      <w:bookmarkStart w:id="5" w:name="_Toc234438922"/>
+      <w:r>
+        <w:t>5.1 User Login with JWT Authentication</w:t>
+      </w:r>
+      <w:bookmarkEnd w:id="5"/>
+    </w:p>
+    <w:p>
+      <w:pPr>
+        <w:spacing w:after="120" w:line="300" w:lineRule="auto"/>
         <w:jc w:val="both"/>
       </w:pPr>
       <w:r>
-        <w:t xml:space="preserve">The login flow demonstrates the security design. The React app validates the form and posts credentials to the AuthController. The AuthService loads the user, verifies the BCrypt password hash, and on success generates a signed JWT containing the user's role. The frontend stores the token and attaches it to the Authorization header of every later request; invalid credentials result in HTTP 401.</w:t>
-      </w:r>
-    </w:p>
-    <w:p>
-      <w:pPr>
-        <w:spacing w:after="80" w:before="120"/>
+        <w:t>The login flow demonstrates the security design. The React app validates the form and posts credentials to the AuthController. The AuthService loads the user, verifies the BCrypt password hash, and on success generates a signed JWT containing the user's role. The frontend stores the token and attaches it to the Authorization header of every later request; invalid credentials result in HTTP 401.</w:t>
+      </w:r>
+    </w:p>
+    <w:p>
+      <w:pPr>
+        <w:spacing w:before="120" w:after="80"/>
         <w:jc w:val="center"/>
       </w:pPr>
       <w:r>
+        <w:rPr>
+          <w:noProof/>
+        </w:rPr>
         <w:drawing>
-          <wp:inline distT="0" distB="0" distL="0" distR="0">
+          <wp:inline distT="0" distB="0" distL="0" distR="0" wp14:anchorId="6BA0F3D4" wp14:editId="18B6EBC7">
             <wp:extent cx="5715000" cy="3695700"/>
-            <wp:effectExtent t="0" r="0" b="0" l="0"/>
-            <wp:docPr id="1" name="Figure 5.1: Sequence Diagram - Login with JWT" descr="Figure 5.1: Sequence Diagram - Login with JWT" title="Figure 5.1: Sequence Diagram - Login with JWT"/>
+            <wp:effectExtent l="0" t="0" r="0" b="0"/>
+            <wp:docPr id="381147179" name="Figure 5.1: Sequence Diagram - Login with JWT" descr="Figure 5.1: Sequence Diagram - Login with JWT" title="Figure 5.1: Sequence Diagram - Login with JWT"/>
             <wp:cNvGraphicFramePr>
               <a:graphicFrameLocks xmlns:a="http://schemas.openxmlformats.org/drawingml/2006/main" noChangeAspect="1"/>
             </wp:cNvGraphicFramePr>
@@ -626,13 +1259,13 @@
               <a:graphicData uri="http://schemas.openxmlformats.org/drawingml/2006/picture">
                 <pic:pic xmlns:pic="http://schemas.openxmlformats.org/drawingml/2006/picture">
                   <pic:nvPicPr>
-                    <pic:cNvPr id="0" name="" descr=""/>
+                    <pic:cNvPr id="0" name=""/>
                     <pic:cNvPicPr>
                       <a:picLocks noChangeAspect="1" noChangeArrowheads="1"/>
                     </pic:cNvPicPr>
                   </pic:nvPicPr>
                   <pic:blipFill>
-                    <a:blip r:embed="rId12" cstate="none"/>
+                    <a:blip r:embed="rId10"/>
                     <a:srcRect/>
                     <a:stretch>
                       <a:fillRect/>
@@ -667,37 +1300,43 @@
           <w:sz w:val="20"/>
           <w:szCs w:val="20"/>
         </w:rPr>
-        <w:t xml:space="preserve">Figure 5.1: Sequence Diagram - Login with JWT</w:t>
+        <w:t>Figure 5.1: Sequence Diagram - Login with JWT</w:t>
       </w:r>
     </w:p>
     <w:p>
       <w:pPr>
         <w:pStyle w:val="Heading2"/>
       </w:pPr>
-      <w:r>
-        <w:t xml:space="preserve">5.2 Policy Application and Approval</w:t>
-      </w:r>
-    </w:p>
-    <w:p>
-      <w:pPr>
-        <w:spacing w:after="120" w:line="300"/>
+      <w:bookmarkStart w:id="6" w:name="_Toc234438923"/>
+      <w:r>
+        <w:t>5.2 Policy Application and Approval</w:t>
+      </w:r>
+      <w:bookmarkEnd w:id="6"/>
+    </w:p>
+    <w:p>
+      <w:pPr>
+        <w:spacing w:after="120" w:line="300" w:lineRule="auto"/>
         <w:jc w:val="both"/>
       </w:pPr>
       <w:r>
-        <w:t xml:space="preserve">A customer applies for a policy under an active plan; the system generates a unique policy number with status PENDING and notifies the assigned agent. The agent (or admin) approves or rejects the application. Approval activates the policy, computes its start and end dates, and generates the premium due records; either decision notifies the customer.</w:t>
-      </w:r>
-    </w:p>
-    <w:p>
-      <w:pPr>
-        <w:spacing w:after="80" w:before="120"/>
+        <w:t>A customer applies for a policy under an active plan; the system generates a unique policy number with status PENDING and notifies the assigned agent. The agent (or admin) approves or rejects the application. Approval activates the policy, computes its start and end dates, and generates the premium due records; either decision notifies the customer.</w:t>
+      </w:r>
+    </w:p>
+    <w:p>
+      <w:pPr>
+        <w:spacing w:before="120" w:after="80"/>
         <w:jc w:val="center"/>
       </w:pPr>
       <w:r>
+        <w:rPr>
+          <w:noProof/>
+        </w:rPr>
+        <w:lastRenderedPageBreak/>
         <w:drawing>
-          <wp:inline distT="0" distB="0" distL="0" distR="0">
+          <wp:inline distT="0" distB="0" distL="0" distR="0" wp14:anchorId="3C7FEA2A" wp14:editId="124721EE">
             <wp:extent cx="5715000" cy="5229225"/>
-            <wp:effectExtent t="0" r="0" b="0" l="0"/>
-            <wp:docPr id="1" name="Figure 5.2: Sequence Diagram - Policy Application and Approval" descr="Figure 5.2: Sequence Diagram - Policy Application and Approval" title="Figure 5.2: Sequence Diagram - Policy Application and Approval"/>
+            <wp:effectExtent l="0" t="0" r="0" b="0"/>
+            <wp:docPr id="1171723084" name="Figure 5.2: Sequence Diagram - Policy Application and Approval" descr="Figure 5.2: Sequence Diagram - Policy Application and Approval" title="Figure 5.2: Sequence Diagram - Policy Application and Approval"/>
             <wp:cNvGraphicFramePr>
               <a:graphicFrameLocks xmlns:a="http://schemas.openxmlformats.org/drawingml/2006/main" noChangeAspect="1"/>
             </wp:cNvGraphicFramePr>
@@ -705,13 +1344,13 @@
               <a:graphicData uri="http://schemas.openxmlformats.org/drawingml/2006/picture">
                 <pic:pic xmlns:pic="http://schemas.openxmlformats.org/drawingml/2006/picture">
                   <pic:nvPicPr>
-                    <pic:cNvPr id="0" name="" descr=""/>
+                    <pic:cNvPr id="0" name=""/>
                     <pic:cNvPicPr>
                       <a:picLocks noChangeAspect="1" noChangeArrowheads="1"/>
                     </pic:cNvPicPr>
                   </pic:nvPicPr>
                   <pic:blipFill>
-                    <a:blip r:embed="rId13" cstate="none"/>
+                    <a:blip r:embed="rId11"/>
                     <a:srcRect/>
                     <a:stretch>
                       <a:fillRect/>
@@ -746,7 +1385,7 @@
           <w:sz w:val="20"/>
           <w:szCs w:val="20"/>
         </w:rPr>
-        <w:t xml:space="preserve">Figure 5.2: Sequence Diagram - Policy Application and Approval</w:t>
+        <w:t>Figure 5.2: Sequence Diagram - Policy Application and Approval</w:t>
       </w:r>
     </w:p>
     <w:p>
@@ -758,30 +1397,36 @@
       <w:pPr>
         <w:pStyle w:val="Heading2"/>
       </w:pPr>
-      <w:r>
-        <w:t xml:space="preserve">5.3 Claim Filing, Review and Settlement</w:t>
-      </w:r>
-    </w:p>
-    <w:p>
-      <w:pPr>
-        <w:spacing w:after="120" w:line="300"/>
+      <w:bookmarkStart w:id="7" w:name="_Toc234438924"/>
+      <w:r>
+        <w:lastRenderedPageBreak/>
+        <w:t>5.3 Claim Filing, Review and Settlement</w:t>
+      </w:r>
+      <w:bookmarkEnd w:id="7"/>
+    </w:p>
+    <w:p>
+      <w:pPr>
+        <w:spacing w:after="120" w:line="300" w:lineRule="auto"/>
         <w:jc w:val="both"/>
       </w:pPr>
       <w:r>
-        <w:t xml:space="preserve">A customer files a claim against an active policy. The service layer enforces the business rules (policy must be ACTIVE; claim amount cannot exceed the coverage amount). The assigned agent reviews the claim and approves or rejects it, and the admin gives the final settlement decision, recording the settled amount and date. The customer is notified at every status change.</w:t>
-      </w:r>
-    </w:p>
-    <w:p>
-      <w:pPr>
-        <w:spacing w:after="80" w:before="120"/>
+        <w:t>A customer files a claim against an active policy. The service layer enforces the business rules (policy must be ACTIVE; claim amount cannot exceed the coverage amount). The assigned agent reviews the claim and approves or rejects it, and the admin gives the final settlement decision, recording the settled amount and date. The customer is notified at every status change.</w:t>
+      </w:r>
+    </w:p>
+    <w:p>
+      <w:pPr>
+        <w:spacing w:before="120" w:after="80"/>
         <w:jc w:val="center"/>
       </w:pPr>
       <w:r>
+        <w:rPr>
+          <w:noProof/>
+        </w:rPr>
         <w:drawing>
-          <wp:inline distT="0" distB="0" distL="0" distR="0">
+          <wp:inline distT="0" distB="0" distL="0" distR="0" wp14:anchorId="4DED64AD" wp14:editId="273C2A0C">
             <wp:extent cx="5715000" cy="5724525"/>
-            <wp:effectExtent t="0" r="0" b="0" l="0"/>
-            <wp:docPr id="1" name="Figure 5.3: Sequence Diagram - Claim Workflow" descr="Figure 5.3: Sequence Diagram - Claim Workflow" title="Figure 5.3: Sequence Diagram - Claim Workflow"/>
+            <wp:effectExtent l="0" t="0" r="0" b="0"/>
+            <wp:docPr id="488501718" name="Figure 5.3: Sequence Diagram - Claim Workflow" descr="Figure 5.3: Sequence Diagram - Claim Workflow" title="Figure 5.3: Sequence Diagram - Claim Workflow"/>
             <wp:cNvGraphicFramePr>
               <a:graphicFrameLocks xmlns:a="http://schemas.openxmlformats.org/drawingml/2006/main" noChangeAspect="1"/>
             </wp:cNvGraphicFramePr>
@@ -789,13 +1434,13 @@
               <a:graphicData uri="http://schemas.openxmlformats.org/drawingml/2006/picture">
                 <pic:pic xmlns:pic="http://schemas.openxmlformats.org/drawingml/2006/picture">
                   <pic:nvPicPr>
-                    <pic:cNvPr id="0" name="" descr=""/>
+                    <pic:cNvPr id="0" name=""/>
                     <pic:cNvPicPr>
                       <a:picLocks noChangeAspect="1" noChangeArrowheads="1"/>
                     </pic:cNvPicPr>
                   </pic:nvPicPr>
                   <pic:blipFill>
-                    <a:blip r:embed="rId14" cstate="none"/>
+                    <a:blip r:embed="rId12"/>
                     <a:srcRect/>
                     <a:stretch>
                       <a:fillRect/>
@@ -830,7 +1475,7 @@
           <w:sz w:val="20"/>
           <w:szCs w:val="20"/>
         </w:rPr>
-        <w:t xml:space="preserve">Figure 5.3: Sequence Diagram - Claim Workflow</w:t>
+        <w:t>Figure 5.3: Sequence Diagram - Claim Workflow</w:t>
       </w:r>
     </w:p>
     <w:p>
@@ -842,30 +1487,36 @@
       <w:pPr>
         <w:pStyle w:val="Heading1"/>
       </w:pPr>
-      <w:r>
-        <w:t xml:space="preserve">6. DATABASE DESIGN (ER DIAGRAM)</w:t>
-      </w:r>
-    </w:p>
-    <w:p>
-      <w:pPr>
-        <w:spacing w:after="120" w:line="300"/>
+      <w:bookmarkStart w:id="8" w:name="_Toc234438925"/>
+      <w:r>
+        <w:lastRenderedPageBreak/>
+        <w:t>6. DATABASE DESIGN (ER DIAGRAM)</w:t>
+      </w:r>
+      <w:bookmarkEnd w:id="8"/>
+    </w:p>
+    <w:p>
+      <w:pPr>
+        <w:spacing w:after="120" w:line="300" w:lineRule="auto"/>
         <w:jc w:val="both"/>
       </w:pPr>
       <w:r>
-        <w:t xml:space="preserve">The database consists of seven normalized tables. Every table has a surrogate primary key (id), and all relationships are enforced with foreign-key constraints. Business identifiers (email, policy_number, claim_number, transaction_ref) carry UNIQUE constraints. Enumerated values (role, insurance type, statuses) are stored as constrained string columns mapped to Java enums. The schema is in third normal form: every non-key attribute depends only on the key of its own table, and repeated groups (such as plan details) are factored into the plans table referenced by policies.</w:t>
-      </w:r>
-    </w:p>
-    <w:p>
-      <w:pPr>
-        <w:spacing w:after="80" w:before="120"/>
+        <w:t>The database consists of seven normalized tables. Every table has a surrogate primary key (id), and all relationships are enforced with foreign-key constraints. Business identifiers (email, policy_number, claim_number, transaction_ref) carry UNIQUE constraints. Enumerated values (role, insurance type, statuses) are stored as constrained string columns mapped to Java enums. The schema is in third normal form: every non-key attribute depends only on the key of its own table, and repeated groups (such as plan details) are factored into the plans table referenced by policies.</w:t>
+      </w:r>
+    </w:p>
+    <w:p>
+      <w:pPr>
+        <w:spacing w:before="120" w:after="80"/>
         <w:jc w:val="center"/>
       </w:pPr>
       <w:r>
+        <w:rPr>
+          <w:noProof/>
+        </w:rPr>
         <w:drawing>
-          <wp:inline distT="0" distB="0" distL="0" distR="0">
+          <wp:inline distT="0" distB="0" distL="0" distR="0" wp14:anchorId="4A25E919" wp14:editId="2B6C3CA6">
             <wp:extent cx="5715000" cy="4162425"/>
-            <wp:effectExtent t="0" r="0" b="0" l="0"/>
-            <wp:docPr id="1" name="Figure 6.1: Entity-Relationship Diagram" descr="Figure 6.1: Entity-Relationship Diagram" title="Figure 6.1: Entity-Relationship Diagram"/>
+            <wp:effectExtent l="0" t="0" r="0" b="0"/>
+            <wp:docPr id="145036760" name="Figure 6.1: Entity-Relationship Diagram" descr="Figure 6.1: Entity-Relationship Diagram" title="Figure 6.1: Entity-Relationship Diagram"/>
             <wp:cNvGraphicFramePr>
               <a:graphicFrameLocks xmlns:a="http://schemas.openxmlformats.org/drawingml/2006/main" noChangeAspect="1"/>
             </wp:cNvGraphicFramePr>
@@ -873,13 +1524,13 @@
               <a:graphicData uri="http://schemas.openxmlformats.org/drawingml/2006/picture">
                 <pic:pic xmlns:pic="http://schemas.openxmlformats.org/drawingml/2006/picture">
                   <pic:nvPicPr>
-                    <pic:cNvPr id="0" name="" descr=""/>
+                    <pic:cNvPr id="0" name=""/>
                     <pic:cNvPicPr>
                       <a:picLocks noChangeAspect="1" noChangeArrowheads="1"/>
                     </pic:cNvPicPr>
                   </pic:nvPicPr>
                   <pic:blipFill>
-                    <a:blip r:embed="rId15" cstate="none"/>
+                    <a:blip r:embed="rId13"/>
                     <a:srcRect/>
                     <a:stretch>
                       <a:fillRect/>
@@ -914,28 +1565,35 @@
           <w:sz w:val="20"/>
           <w:szCs w:val="20"/>
         </w:rPr>
-        <w:t xml:space="preserve">Figure 6.1: Entity-Relationship Diagram</w:t>
+        <w:t>Figure 6.1: Entity-Relationship Diagram</w:t>
       </w:r>
     </w:p>
     <w:p>
       <w:pPr>
         <w:pStyle w:val="Heading2"/>
       </w:pPr>
-      <w:r>
-        <w:t xml:space="preserve">6.1 Relationship Summary</w:t>
-      </w:r>
+      <w:bookmarkStart w:id="9" w:name="_Toc234438926"/>
+      <w:r>
+        <w:t>6.1 Relationship Summary</w:t>
+      </w:r>
+      <w:bookmarkEnd w:id="9"/>
     </w:p>
     <w:tbl>
       <w:tblPr>
-        <w:tblW w:type="dxa" w:w="9026"/>
+        <w:tblW w:w="9026" w:type="dxa"/>
         <w:tblBorders>
-          <w:top w:val="single" w:color="auto" w:sz="4"/>
-          <w:left w:val="single" w:color="auto" w:sz="4"/>
-          <w:bottom w:val="single" w:color="auto" w:sz="4"/>
-          <w:right w:val="single" w:color="auto" w:sz="4"/>
-          <w:insideH w:val="single" w:color="auto" w:sz="4"/>
-          <w:insideV w:val="single" w:color="auto" w:sz="4"/>
+          <w:top w:val="single" w:sz="4" w:space="0" w:color="auto"/>
+          <w:left w:val="single" w:sz="4" w:space="0" w:color="auto"/>
+          <w:bottom w:val="single" w:sz="4" w:space="0" w:color="auto"/>
+          <w:right w:val="single" w:sz="4" w:space="0" w:color="auto"/>
+          <w:insideH w:val="single" w:sz="4" w:space="0" w:color="auto"/>
+          <w:insideV w:val="single" w:sz="4" w:space="0" w:color="auto"/>
         </w:tblBorders>
+        <w:tblCellMar>
+          <w:left w:w="10" w:type="dxa"/>
+          <w:right w:w="10" w:type="dxa"/>
+        </w:tblCellMar>
+        <w:tblLook w:val="04A0" w:firstRow="1" w:lastRow="0" w:firstColumn="1" w:lastColumn="0" w:noHBand="0" w:noVBand="1"/>
       </w:tblPr>
       <w:tblGrid>
         <w:gridCol w:w="2800"/>
@@ -943,24 +1601,30 @@
         <w:gridCol w:w="4026"/>
       </w:tblGrid>
       <w:tr>
+        <w:tblPrEx>
+          <w:tblCellMar>
+            <w:top w:w="0" w:type="dxa"/>
+            <w:bottom w:w="0" w:type="dxa"/>
+          </w:tblCellMar>
+        </w:tblPrEx>
         <w:trPr>
           <w:tblHeader/>
         </w:trPr>
         <w:tc>
           <w:tcPr>
-            <w:tcW w:type="dxa" w:w="2800"/>
+            <w:tcW w:w="2800" w:type="dxa"/>
             <w:tcBorders>
-              <w:top w:val="single" w:color="BFBFBF" w:sz="1"/>
-              <w:left w:val="single" w:color="BFBFBF" w:sz="1"/>
-              <w:bottom w:val="single" w:color="BFBFBF" w:sz="1"/>
-              <w:right w:val="single" w:color="BFBFBF" w:sz="1"/>
+              <w:top w:val="single" w:sz="1" w:space="0" w:color="BFBFBF"/>
+              <w:left w:val="single" w:sz="1" w:space="0" w:color="BFBFBF"/>
+              <w:bottom w:val="single" w:sz="1" w:space="0" w:color="BFBFBF"/>
+              <w:right w:val="single" w:sz="1" w:space="0" w:color="BFBFBF"/>
             </w:tcBorders>
-            <w:shd w:fill="D5E8F0" w:val="clear"/>
+            <w:shd w:val="clear" w:color="auto" w:fill="D5E8F0"/>
             <w:tcMar>
-              <w:top w:type="dxa" w:w="80"/>
-              <w:left w:type="dxa" w:w="120"/>
-              <w:bottom w:type="dxa" w:w="80"/>
-              <w:right w:type="dxa" w:w="120"/>
+              <w:top w:w="80" w:type="dxa"/>
+              <w:left w:w="120" w:type="dxa"/>
+              <w:bottom w:w="80" w:type="dxa"/>
+              <w:right w:w="120" w:type="dxa"/>
             </w:tcMar>
           </w:tcPr>
           <w:p>
@@ -971,25 +1635,25 @@
                 <w:sz w:val="20"/>
                 <w:szCs w:val="20"/>
               </w:rPr>
-              <w:t xml:space="preserve">Relationship</w:t>
+              <w:t>Relationship</w:t>
             </w:r>
           </w:p>
         </w:tc>
         <w:tc>
           <w:tcPr>
-            <w:tcW w:type="dxa" w:w="2200"/>
+            <w:tcW w:w="2200" w:type="dxa"/>
             <w:tcBorders>
-              <w:top w:val="single" w:color="BFBFBF" w:sz="1"/>
-              <w:left w:val="single" w:color="BFBFBF" w:sz="1"/>
-              <w:bottom w:val="single" w:color="BFBFBF" w:sz="1"/>
-              <w:right w:val="single" w:color="BFBFBF" w:sz="1"/>
+              <w:top w:val="single" w:sz="1" w:space="0" w:color="BFBFBF"/>
+              <w:left w:val="single" w:sz="1" w:space="0" w:color="BFBFBF"/>
+              <w:bottom w:val="single" w:sz="1" w:space="0" w:color="BFBFBF"/>
+              <w:right w:val="single" w:sz="1" w:space="0" w:color="BFBFBF"/>
             </w:tcBorders>
-            <w:shd w:fill="D5E8F0" w:val="clear"/>
+            <w:shd w:val="clear" w:color="auto" w:fill="D5E8F0"/>
             <w:tcMar>
-              <w:top w:type="dxa" w:w="80"/>
-              <w:left w:type="dxa" w:w="120"/>
-              <w:bottom w:type="dxa" w:w="80"/>
-              <w:right w:type="dxa" w:w="120"/>
+              <w:top w:w="80" w:type="dxa"/>
+              <w:left w:w="120" w:type="dxa"/>
+              <w:bottom w:w="80" w:type="dxa"/>
+              <w:right w:w="120" w:type="dxa"/>
             </w:tcMar>
           </w:tcPr>
           <w:p>
@@ -1000,25 +1664,25 @@
                 <w:sz w:val="20"/>
                 <w:szCs w:val="20"/>
               </w:rPr>
-              <w:t xml:space="preserve">Cardinality</w:t>
+              <w:t>Cardinality</w:t>
             </w:r>
           </w:p>
         </w:tc>
         <w:tc>
           <w:tcPr>
-            <w:tcW w:type="dxa" w:w="4026"/>
+            <w:tcW w:w="4026" w:type="dxa"/>
             <w:tcBorders>
-              <w:top w:val="single" w:color="BFBFBF" w:sz="1"/>
-              <w:left w:val="single" w:color="BFBFBF" w:sz="1"/>
-              <w:bottom w:val="single" w:color="BFBFBF" w:sz="1"/>
-              <w:right w:val="single" w:color="BFBFBF" w:sz="1"/>
+              <w:top w:val="single" w:sz="1" w:space="0" w:color="BFBFBF"/>
+              <w:left w:val="single" w:sz="1" w:space="0" w:color="BFBFBF"/>
+              <w:bottom w:val="single" w:sz="1" w:space="0" w:color="BFBFBF"/>
+              <w:right w:val="single" w:sz="1" w:space="0" w:color="BFBFBF"/>
             </w:tcBorders>
-            <w:shd w:fill="D5E8F0" w:val="clear"/>
+            <w:shd w:val="clear" w:color="auto" w:fill="D5E8F0"/>
             <w:tcMar>
-              <w:top w:type="dxa" w:w="80"/>
-              <w:left w:type="dxa" w:w="120"/>
-              <w:bottom w:type="dxa" w:w="80"/>
-              <w:right w:type="dxa" w:w="120"/>
+              <w:top w:w="80" w:type="dxa"/>
+              <w:left w:w="120" w:type="dxa"/>
+              <w:bottom w:w="80" w:type="dxa"/>
+              <w:right w:w="120" w:type="dxa"/>
             </w:tcMar>
           </w:tcPr>
           <w:p>
@@ -1029,664 +1693,632 @@
                 <w:sz w:val="20"/>
                 <w:szCs w:val="20"/>
               </w:rPr>
-              <w:t xml:space="preserve">Meaning</w:t>
+              <w:t>Meaning</w:t>
             </w:r>
           </w:p>
         </w:tc>
       </w:tr>
       <w:tr>
-        <w:trPr>
-          <w:tblHeader w:val="false"/>
-        </w:trPr>
+        <w:tblPrEx>
+          <w:tblCellMar>
+            <w:top w:w="0" w:type="dxa"/>
+            <w:bottom w:w="0" w:type="dxa"/>
+          </w:tblCellMar>
+        </w:tblPrEx>
         <w:tc>
           <w:tcPr>
-            <w:tcW w:type="dxa" w:w="2800"/>
+            <w:tcW w:w="2800" w:type="dxa"/>
             <w:tcBorders>
-              <w:top w:val="single" w:color="BFBFBF" w:sz="1"/>
-              <w:left w:val="single" w:color="BFBFBF" w:sz="1"/>
-              <w:bottom w:val="single" w:color="BFBFBF" w:sz="1"/>
-              <w:right w:val="single" w:color="BFBFBF" w:sz="1"/>
+              <w:top w:val="single" w:sz="1" w:space="0" w:color="BFBFBF"/>
+              <w:left w:val="single" w:sz="1" w:space="0" w:color="BFBFBF"/>
+              <w:bottom w:val="single" w:sz="1" w:space="0" w:color="BFBFBF"/>
+              <w:right w:val="single" w:sz="1" w:space="0" w:color="BFBFBF"/>
             </w:tcBorders>
             <w:tcMar>
-              <w:top w:type="dxa" w:w="80"/>
-              <w:left w:type="dxa" w:w="120"/>
-              <w:bottom w:type="dxa" w:w="80"/>
-              <w:right w:type="dxa" w:w="120"/>
+              <w:top w:w="80" w:type="dxa"/>
+              <w:left w:w="120" w:type="dxa"/>
+              <w:bottom w:w="80" w:type="dxa"/>
+              <w:right w:w="120" w:type="dxa"/>
             </w:tcMar>
           </w:tcPr>
           <w:p>
             <w:r>
               <w:rPr>
-                <w:b w:val="false"/>
-                <w:bCs w:val="false"/>
                 <w:sz w:val="20"/>
                 <w:szCs w:val="20"/>
               </w:rPr>
-              <w:t xml:space="preserve">users - policies</w:t>
+              <w:t>users - policies</w:t>
             </w:r>
           </w:p>
         </w:tc>
         <w:tc>
           <w:tcPr>
-            <w:tcW w:type="dxa" w:w="2200"/>
+            <w:tcW w:w="2200" w:type="dxa"/>
             <w:tcBorders>
-              <w:top w:val="single" w:color="BFBFBF" w:sz="1"/>
-              <w:left w:val="single" w:color="BFBFBF" w:sz="1"/>
-              <w:bottom w:val="single" w:color="BFBFBF" w:sz="1"/>
-              <w:right w:val="single" w:color="BFBFBF" w:sz="1"/>
+              <w:top w:val="single" w:sz="1" w:space="0" w:color="BFBFBF"/>
+              <w:left w:val="single" w:sz="1" w:space="0" w:color="BFBFBF"/>
+              <w:bottom w:val="single" w:sz="1" w:space="0" w:color="BFBFBF"/>
+              <w:right w:val="single" w:sz="1" w:space="0" w:color="BFBFBF"/>
             </w:tcBorders>
             <w:tcMar>
-              <w:top w:type="dxa" w:w="80"/>
-              <w:left w:type="dxa" w:w="120"/>
-              <w:bottom w:type="dxa" w:w="80"/>
-              <w:right w:type="dxa" w:w="120"/>
+              <w:top w:w="80" w:type="dxa"/>
+              <w:left w:w="120" w:type="dxa"/>
+              <w:bottom w:w="80" w:type="dxa"/>
+              <w:right w:w="120" w:type="dxa"/>
             </w:tcMar>
           </w:tcPr>
           <w:p>
             <w:r>
               <w:rPr>
-                <w:b w:val="false"/>
-                <w:bCs w:val="false"/>
                 <w:sz w:val="20"/>
                 <w:szCs w:val="20"/>
               </w:rPr>
-              <w:t xml:space="preserve">1 : N</w:t>
+              <w:t>1 : N</w:t>
             </w:r>
           </w:p>
         </w:tc>
         <w:tc>
           <w:tcPr>
-            <w:tcW w:type="dxa" w:w="4026"/>
+            <w:tcW w:w="4026" w:type="dxa"/>
             <w:tcBorders>
-              <w:top w:val="single" w:color="BFBFBF" w:sz="1"/>
-              <w:left w:val="single" w:color="BFBFBF" w:sz="1"/>
-              <w:bottom w:val="single" w:color="BFBFBF" w:sz="1"/>
-              <w:right w:val="single" w:color="BFBFBF" w:sz="1"/>
+              <w:top w:val="single" w:sz="1" w:space="0" w:color="BFBFBF"/>
+              <w:left w:val="single" w:sz="1" w:space="0" w:color="BFBFBF"/>
+              <w:bottom w:val="single" w:sz="1" w:space="0" w:color="BFBFBF"/>
+              <w:right w:val="single" w:sz="1" w:space="0" w:color="BFBFBF"/>
             </w:tcBorders>
             <w:tcMar>
-              <w:top w:type="dxa" w:w="80"/>
-              <w:left w:type="dxa" w:w="120"/>
-              <w:bottom w:type="dxa" w:w="80"/>
-              <w:right w:type="dxa" w:w="120"/>
+              <w:top w:w="80" w:type="dxa"/>
+              <w:left w:w="120" w:type="dxa"/>
+              <w:bottom w:w="80" w:type="dxa"/>
+              <w:right w:w="120" w:type="dxa"/>
             </w:tcMar>
           </w:tcPr>
           <w:p>
             <w:r>
               <w:rPr>
-                <w:b w:val="false"/>
-                <w:bCs w:val="false"/>
                 <w:sz w:val="20"/>
                 <w:szCs w:val="20"/>
               </w:rPr>
-              <w:t xml:space="preserve">A customer can hold many policies; each policy belongs to one customer</w:t>
+              <w:t>A customer can hold many policies; each policy belongs to one customer</w:t>
             </w:r>
           </w:p>
         </w:tc>
       </w:tr>
       <w:tr>
-        <w:trPr>
-          <w:tblHeader w:val="false"/>
-        </w:trPr>
+        <w:tblPrEx>
+          <w:tblCellMar>
+            <w:top w:w="0" w:type="dxa"/>
+            <w:bottom w:w="0" w:type="dxa"/>
+          </w:tblCellMar>
+        </w:tblPrEx>
         <w:tc>
           <w:tcPr>
-            <w:tcW w:type="dxa" w:w="2800"/>
+            <w:tcW w:w="2800" w:type="dxa"/>
             <w:tcBorders>
-              <w:top w:val="single" w:color="BFBFBF" w:sz="1"/>
-              <w:left w:val="single" w:color="BFBFBF" w:sz="1"/>
-              <w:bottom w:val="single" w:color="BFBFBF" w:sz="1"/>
-              <w:right w:val="single" w:color="BFBFBF" w:sz="1"/>
+              <w:top w:val="single" w:sz="1" w:space="0" w:color="BFBFBF"/>
+              <w:left w:val="single" w:sz="1" w:space="0" w:color="BFBFBF"/>
+              <w:bottom w:val="single" w:sz="1" w:space="0" w:color="BFBFBF"/>
+              <w:right w:val="single" w:sz="1" w:space="0" w:color="BFBFBF"/>
             </w:tcBorders>
             <w:tcMar>
-              <w:top w:type="dxa" w:w="80"/>
-              <w:left w:type="dxa" w:w="120"/>
-              <w:bottom w:type="dxa" w:w="80"/>
-              <w:right w:type="dxa" w:w="120"/>
+              <w:top w:w="80" w:type="dxa"/>
+              <w:left w:w="120" w:type="dxa"/>
+              <w:bottom w:w="80" w:type="dxa"/>
+              <w:right w:w="120" w:type="dxa"/>
             </w:tcMar>
           </w:tcPr>
           <w:p>
             <w:r>
               <w:rPr>
-                <w:b w:val="false"/>
-                <w:bCs w:val="false"/>
                 <w:sz w:val="20"/>
                 <w:szCs w:val="20"/>
               </w:rPr>
-              <w:t xml:space="preserve">plans - policies</w:t>
+              <w:t>plans - policies</w:t>
             </w:r>
           </w:p>
         </w:tc>
         <w:tc>
           <w:tcPr>
-            <w:tcW w:type="dxa" w:w="2200"/>
+            <w:tcW w:w="2200" w:type="dxa"/>
             <w:tcBorders>
-              <w:top w:val="single" w:color="BFBFBF" w:sz="1"/>
-              <w:left w:val="single" w:color="BFBFBF" w:sz="1"/>
-              <w:bottom w:val="single" w:color="BFBFBF" w:sz="1"/>
-              <w:right w:val="single" w:color="BFBFBF" w:sz="1"/>
+              <w:top w:val="single" w:sz="1" w:space="0" w:color="BFBFBF"/>
+              <w:left w:val="single" w:sz="1" w:space="0" w:color="BFBFBF"/>
+              <w:bottom w:val="single" w:sz="1" w:space="0" w:color="BFBFBF"/>
+              <w:right w:val="single" w:sz="1" w:space="0" w:color="BFBFBF"/>
             </w:tcBorders>
             <w:tcMar>
-              <w:top w:type="dxa" w:w="80"/>
-              <w:left w:type="dxa" w:w="120"/>
-              <w:bottom w:type="dxa" w:w="80"/>
-              <w:right w:type="dxa" w:w="120"/>
+              <w:top w:w="80" w:type="dxa"/>
+              <w:left w:w="120" w:type="dxa"/>
+              <w:bottom w:w="80" w:type="dxa"/>
+              <w:right w:w="120" w:type="dxa"/>
             </w:tcMar>
           </w:tcPr>
           <w:p>
             <w:r>
               <w:rPr>
-                <w:b w:val="false"/>
-                <w:bCs w:val="false"/>
                 <w:sz w:val="20"/>
                 <w:szCs w:val="20"/>
               </w:rPr>
-              <w:t xml:space="preserve">1 : N</w:t>
+              <w:t>1 : N</w:t>
             </w:r>
           </w:p>
         </w:tc>
         <w:tc>
           <w:tcPr>
-            <w:tcW w:type="dxa" w:w="4026"/>
+            <w:tcW w:w="4026" w:type="dxa"/>
             <w:tcBorders>
-              <w:top w:val="single" w:color="BFBFBF" w:sz="1"/>
-              <w:left w:val="single" w:color="BFBFBF" w:sz="1"/>
-              <w:bottom w:val="single" w:color="BFBFBF" w:sz="1"/>
-              <w:right w:val="single" w:color="BFBFBF" w:sz="1"/>
+              <w:top w:val="single" w:sz="1" w:space="0" w:color="BFBFBF"/>
+              <w:left w:val="single" w:sz="1" w:space="0" w:color="BFBFBF"/>
+              <w:bottom w:val="single" w:sz="1" w:space="0" w:color="BFBFBF"/>
+              <w:right w:val="single" w:sz="1" w:space="0" w:color="BFBFBF"/>
             </w:tcBorders>
             <w:tcMar>
-              <w:top w:type="dxa" w:w="80"/>
-              <w:left w:type="dxa" w:w="120"/>
-              <w:bottom w:type="dxa" w:w="80"/>
-              <w:right w:type="dxa" w:w="120"/>
+              <w:top w:w="80" w:type="dxa"/>
+              <w:left w:w="120" w:type="dxa"/>
+              <w:bottom w:w="80" w:type="dxa"/>
+              <w:right w:w="120" w:type="dxa"/>
             </w:tcMar>
           </w:tcPr>
           <w:p>
             <w:r>
               <w:rPr>
-                <w:b w:val="false"/>
-                <w:bCs w:val="false"/>
                 <w:sz w:val="20"/>
                 <w:szCs w:val="20"/>
               </w:rPr>
-              <w:t xml:space="preserve">A plan can be purchased many times; each policy is based on one plan</w:t>
+              <w:t>A plan can be purchased many times; each policy is based on one plan</w:t>
             </w:r>
           </w:p>
         </w:tc>
       </w:tr>
       <w:tr>
-        <w:trPr>
-          <w:tblHeader w:val="false"/>
-        </w:trPr>
+        <w:tblPrEx>
+          <w:tblCellMar>
+            <w:top w:w="0" w:type="dxa"/>
+            <w:bottom w:w="0" w:type="dxa"/>
+          </w:tblCellMar>
+        </w:tblPrEx>
         <w:tc>
           <w:tcPr>
-            <w:tcW w:type="dxa" w:w="2800"/>
+            <w:tcW w:w="2800" w:type="dxa"/>
             <w:tcBorders>
-              <w:top w:val="single" w:color="BFBFBF" w:sz="1"/>
-              <w:left w:val="single" w:color="BFBFBF" w:sz="1"/>
-              <w:bottom w:val="single" w:color="BFBFBF" w:sz="1"/>
-              <w:right w:val="single" w:color="BFBFBF" w:sz="1"/>
+              <w:top w:val="single" w:sz="1" w:space="0" w:color="BFBFBF"/>
+              <w:left w:val="single" w:sz="1" w:space="0" w:color="BFBFBF"/>
+              <w:bottom w:val="single" w:sz="1" w:space="0" w:color="BFBFBF"/>
+              <w:right w:val="single" w:sz="1" w:space="0" w:color="BFBFBF"/>
             </w:tcBorders>
             <w:tcMar>
-              <w:top w:type="dxa" w:w="80"/>
-              <w:left w:type="dxa" w:w="120"/>
-              <w:bottom w:type="dxa" w:w="80"/>
-              <w:right w:type="dxa" w:w="120"/>
+              <w:top w:w="80" w:type="dxa"/>
+              <w:left w:w="120" w:type="dxa"/>
+              <w:bottom w:w="80" w:type="dxa"/>
+              <w:right w:w="120" w:type="dxa"/>
             </w:tcMar>
           </w:tcPr>
           <w:p>
             <w:r>
               <w:rPr>
-                <w:b w:val="false"/>
-                <w:bCs w:val="false"/>
                 <w:sz w:val="20"/>
                 <w:szCs w:val="20"/>
               </w:rPr>
-              <w:t xml:space="preserve">policies - claims</w:t>
+              <w:t>policies - claims</w:t>
             </w:r>
           </w:p>
         </w:tc>
         <w:tc>
           <w:tcPr>
-            <w:tcW w:type="dxa" w:w="2200"/>
+            <w:tcW w:w="2200" w:type="dxa"/>
             <w:tcBorders>
-              <w:top w:val="single" w:color="BFBFBF" w:sz="1"/>
-              <w:left w:val="single" w:color="BFBFBF" w:sz="1"/>
-              <w:bottom w:val="single" w:color="BFBFBF" w:sz="1"/>
-              <w:right w:val="single" w:color="BFBFBF" w:sz="1"/>
+              <w:top w:val="single" w:sz="1" w:space="0" w:color="BFBFBF"/>
+              <w:left w:val="single" w:sz="1" w:space="0" w:color="BFBFBF"/>
+              <w:bottom w:val="single" w:sz="1" w:space="0" w:color="BFBFBF"/>
+              <w:right w:val="single" w:sz="1" w:space="0" w:color="BFBFBF"/>
             </w:tcBorders>
             <w:tcMar>
-              <w:top w:type="dxa" w:w="80"/>
-              <w:left w:type="dxa" w:w="120"/>
-              <w:bottom w:type="dxa" w:w="80"/>
-              <w:right w:type="dxa" w:w="120"/>
+              <w:top w:w="80" w:type="dxa"/>
+              <w:left w:w="120" w:type="dxa"/>
+              <w:bottom w:w="80" w:type="dxa"/>
+              <w:right w:w="120" w:type="dxa"/>
             </w:tcMar>
           </w:tcPr>
           <w:p>
             <w:r>
               <w:rPr>
-                <w:b w:val="false"/>
-                <w:bCs w:val="false"/>
                 <w:sz w:val="20"/>
                 <w:szCs w:val="20"/>
               </w:rPr>
-              <w:t xml:space="preserve">1 : N</w:t>
+              <w:t>1 : N</w:t>
             </w:r>
           </w:p>
         </w:tc>
         <w:tc>
           <w:tcPr>
-            <w:tcW w:type="dxa" w:w="4026"/>
+            <w:tcW w:w="4026" w:type="dxa"/>
             <w:tcBorders>
-              <w:top w:val="single" w:color="BFBFBF" w:sz="1"/>
-              <w:left w:val="single" w:color="BFBFBF" w:sz="1"/>
-              <w:bottom w:val="single" w:color="BFBFBF" w:sz="1"/>
-              <w:right w:val="single" w:color="BFBFBF" w:sz="1"/>
+              <w:top w:val="single" w:sz="1" w:space="0" w:color="BFBFBF"/>
+              <w:left w:val="single" w:sz="1" w:space="0" w:color="BFBFBF"/>
+              <w:bottom w:val="single" w:sz="1" w:space="0" w:color="BFBFBF"/>
+              <w:right w:val="single" w:sz="1" w:space="0" w:color="BFBFBF"/>
             </w:tcBorders>
             <w:tcMar>
-              <w:top w:type="dxa" w:w="80"/>
-              <w:left w:type="dxa" w:w="120"/>
-              <w:bottom w:type="dxa" w:w="80"/>
-              <w:right w:type="dxa" w:w="120"/>
+              <w:top w:w="80" w:type="dxa"/>
+              <w:left w:w="120" w:type="dxa"/>
+              <w:bottom w:w="80" w:type="dxa"/>
+              <w:right w:w="120" w:type="dxa"/>
             </w:tcMar>
           </w:tcPr>
           <w:p>
             <w:r>
               <w:rPr>
-                <w:b w:val="false"/>
-                <w:bCs w:val="false"/>
                 <w:sz w:val="20"/>
                 <w:szCs w:val="20"/>
               </w:rPr>
-              <w:t xml:space="preserve">A policy can have many claims; each claim targets one policy</w:t>
+              <w:t>A policy can have many claims; each claim targets one policy</w:t>
             </w:r>
           </w:p>
         </w:tc>
       </w:tr>
       <w:tr>
-        <w:trPr>
-          <w:tblHeader w:val="false"/>
-        </w:trPr>
+        <w:tblPrEx>
+          <w:tblCellMar>
+            <w:top w:w="0" w:type="dxa"/>
+            <w:bottom w:w="0" w:type="dxa"/>
+          </w:tblCellMar>
+        </w:tblPrEx>
         <w:tc>
           <w:tcPr>
-            <w:tcW w:type="dxa" w:w="2800"/>
+            <w:tcW w:w="2800" w:type="dxa"/>
             <w:tcBorders>
-              <w:top w:val="single" w:color="BFBFBF" w:sz="1"/>
-              <w:left w:val="single" w:color="BFBFBF" w:sz="1"/>
-              <w:bottom w:val="single" w:color="BFBFBF" w:sz="1"/>
-              <w:right w:val="single" w:color="BFBFBF" w:sz="1"/>
+              <w:top w:val="single" w:sz="1" w:space="0" w:color="BFBFBF"/>
+              <w:left w:val="single" w:sz="1" w:space="0" w:color="BFBFBF"/>
+              <w:bottom w:val="single" w:sz="1" w:space="0" w:color="BFBFBF"/>
+              <w:right w:val="single" w:sz="1" w:space="0" w:color="BFBFBF"/>
             </w:tcBorders>
             <w:tcMar>
-              <w:top w:type="dxa" w:w="80"/>
-              <w:left w:type="dxa" w:w="120"/>
-              <w:bottom w:type="dxa" w:w="80"/>
-              <w:right w:type="dxa" w:w="120"/>
+              <w:top w:w="80" w:type="dxa"/>
+              <w:left w:w="120" w:type="dxa"/>
+              <w:bottom w:w="80" w:type="dxa"/>
+              <w:right w:w="120" w:type="dxa"/>
             </w:tcMar>
           </w:tcPr>
           <w:p>
             <w:r>
               <w:rPr>
-                <w:b w:val="false"/>
-                <w:bCs w:val="false"/>
                 <w:sz w:val="20"/>
                 <w:szCs w:val="20"/>
               </w:rPr>
-              <w:t xml:space="preserve">policies - payments</w:t>
+              <w:t>policies - payments</w:t>
             </w:r>
           </w:p>
         </w:tc>
         <w:tc>
           <w:tcPr>
-            <w:tcW w:type="dxa" w:w="2200"/>
+            <w:tcW w:w="2200" w:type="dxa"/>
             <w:tcBorders>
-              <w:top w:val="single" w:color="BFBFBF" w:sz="1"/>
-              <w:left w:val="single" w:color="BFBFBF" w:sz="1"/>
-              <w:bottom w:val="single" w:color="BFBFBF" w:sz="1"/>
-              <w:right w:val="single" w:color="BFBFBF" w:sz="1"/>
+              <w:top w:val="single" w:sz="1" w:space="0" w:color="BFBFBF"/>
+              <w:left w:val="single" w:sz="1" w:space="0" w:color="BFBFBF"/>
+              <w:bottom w:val="single" w:sz="1" w:space="0" w:color="BFBFBF"/>
+              <w:right w:val="single" w:sz="1" w:space="0" w:color="BFBFBF"/>
             </w:tcBorders>
             <w:tcMar>
-              <w:top w:type="dxa" w:w="80"/>
-              <w:left w:type="dxa" w:w="120"/>
-              <w:bottom w:type="dxa" w:w="80"/>
-              <w:right w:type="dxa" w:w="120"/>
+              <w:top w:w="80" w:type="dxa"/>
+              <w:left w:w="120" w:type="dxa"/>
+              <w:bottom w:w="80" w:type="dxa"/>
+              <w:right w:w="120" w:type="dxa"/>
             </w:tcMar>
           </w:tcPr>
           <w:p>
             <w:r>
               <w:rPr>
-                <w:b w:val="false"/>
-                <w:bCs w:val="false"/>
                 <w:sz w:val="20"/>
                 <w:szCs w:val="20"/>
               </w:rPr>
-              <w:t xml:space="preserve">1 : N</w:t>
+              <w:t>1 : N</w:t>
             </w:r>
           </w:p>
         </w:tc>
         <w:tc>
           <w:tcPr>
-            <w:tcW w:type="dxa" w:w="4026"/>
+            <w:tcW w:w="4026" w:type="dxa"/>
             <w:tcBorders>
-              <w:top w:val="single" w:color="BFBFBF" w:sz="1"/>
-              <w:left w:val="single" w:color="BFBFBF" w:sz="1"/>
-              <w:bottom w:val="single" w:color="BFBFBF" w:sz="1"/>
-              <w:right w:val="single" w:color="BFBFBF" w:sz="1"/>
+              <w:top w:val="single" w:sz="1" w:space="0" w:color="BFBFBF"/>
+              <w:left w:val="single" w:sz="1" w:space="0" w:color="BFBFBF"/>
+              <w:bottom w:val="single" w:sz="1" w:space="0" w:color="BFBFBF"/>
+              <w:right w:val="single" w:sz="1" w:space="0" w:color="BFBFBF"/>
             </w:tcBorders>
             <w:tcMar>
-              <w:top w:type="dxa" w:w="80"/>
-              <w:left w:type="dxa" w:w="120"/>
-              <w:bottom w:type="dxa" w:w="80"/>
-              <w:right w:type="dxa" w:w="120"/>
+              <w:top w:w="80" w:type="dxa"/>
+              <w:left w:w="120" w:type="dxa"/>
+              <w:bottom w:w="80" w:type="dxa"/>
+              <w:right w:w="120" w:type="dxa"/>
             </w:tcMar>
           </w:tcPr>
           <w:p>
             <w:r>
               <w:rPr>
-                <w:b w:val="false"/>
-                <w:bCs w:val="false"/>
                 <w:sz w:val="20"/>
                 <w:szCs w:val="20"/>
               </w:rPr>
-              <w:t xml:space="preserve">A policy has many premium payment records</w:t>
+              <w:t>A policy has many premium payment records</w:t>
             </w:r>
           </w:p>
         </w:tc>
       </w:tr>
       <w:tr>
-        <w:trPr>
-          <w:tblHeader w:val="false"/>
-        </w:trPr>
+        <w:tblPrEx>
+          <w:tblCellMar>
+            <w:top w:w="0" w:type="dxa"/>
+            <w:bottom w:w="0" w:type="dxa"/>
+          </w:tblCellMar>
+        </w:tblPrEx>
         <w:tc>
           <w:tcPr>
-            <w:tcW w:type="dxa" w:w="2800"/>
+            <w:tcW w:w="2800" w:type="dxa"/>
             <w:tcBorders>
-              <w:top w:val="single" w:color="BFBFBF" w:sz="1"/>
-              <w:left w:val="single" w:color="BFBFBF" w:sz="1"/>
-              <w:bottom w:val="single" w:color="BFBFBF" w:sz="1"/>
-              <w:right w:val="single" w:color="BFBFBF" w:sz="1"/>
+              <w:top w:val="single" w:sz="1" w:space="0" w:color="BFBFBF"/>
+              <w:left w:val="single" w:sz="1" w:space="0" w:color="BFBFBF"/>
+              <w:bottom w:val="single" w:sz="1" w:space="0" w:color="BFBFBF"/>
+              <w:right w:val="single" w:sz="1" w:space="0" w:color="BFBFBF"/>
             </w:tcBorders>
             <w:tcMar>
-              <w:top w:type="dxa" w:w="80"/>
-              <w:left w:type="dxa" w:w="120"/>
-              <w:bottom w:type="dxa" w:w="80"/>
-              <w:right w:type="dxa" w:w="120"/>
+              <w:top w:w="80" w:type="dxa"/>
+              <w:left w:w="120" w:type="dxa"/>
+              <w:bottom w:w="80" w:type="dxa"/>
+              <w:right w:w="120" w:type="dxa"/>
             </w:tcMar>
           </w:tcPr>
           <w:p>
             <w:r>
               <w:rPr>
-                <w:b w:val="false"/>
-                <w:bCs w:val="false"/>
                 <w:sz w:val="20"/>
                 <w:szCs w:val="20"/>
               </w:rPr>
-              <w:t xml:space="preserve">users - notifications</w:t>
+              <w:t>users - notifications</w:t>
             </w:r>
           </w:p>
         </w:tc>
         <w:tc>
           <w:tcPr>
-            <w:tcW w:type="dxa" w:w="2200"/>
+            <w:tcW w:w="2200" w:type="dxa"/>
             <w:tcBorders>
-              <w:top w:val="single" w:color="BFBFBF" w:sz="1"/>
-              <w:left w:val="single" w:color="BFBFBF" w:sz="1"/>
-              <w:bottom w:val="single" w:color="BFBFBF" w:sz="1"/>
-              <w:right w:val="single" w:color="BFBFBF" w:sz="1"/>
+              <w:top w:val="single" w:sz="1" w:space="0" w:color="BFBFBF"/>
+              <w:left w:val="single" w:sz="1" w:space="0" w:color="BFBFBF"/>
+              <w:bottom w:val="single" w:sz="1" w:space="0" w:color="BFBFBF"/>
+              <w:right w:val="single" w:sz="1" w:space="0" w:color="BFBFBF"/>
             </w:tcBorders>
             <w:tcMar>
-              <w:top w:type="dxa" w:w="80"/>
-              <w:left w:type="dxa" w:w="120"/>
-              <w:bottom w:type="dxa" w:w="80"/>
-              <w:right w:type="dxa" w:w="120"/>
+              <w:top w:w="80" w:type="dxa"/>
+              <w:left w:w="120" w:type="dxa"/>
+              <w:bottom w:w="80" w:type="dxa"/>
+              <w:right w:w="120" w:type="dxa"/>
             </w:tcMar>
           </w:tcPr>
           <w:p>
             <w:r>
               <w:rPr>
-                <w:b w:val="false"/>
-                <w:bCs w:val="false"/>
                 <w:sz w:val="20"/>
                 <w:szCs w:val="20"/>
               </w:rPr>
-              <w:t xml:space="preserve">1 : N</w:t>
+              <w:t>1 : N</w:t>
             </w:r>
           </w:p>
         </w:tc>
         <w:tc>
           <w:tcPr>
-            <w:tcW w:type="dxa" w:w="4026"/>
+            <w:tcW w:w="4026" w:type="dxa"/>
             <w:tcBorders>
-              <w:top w:val="single" w:color="BFBFBF" w:sz="1"/>
-              <w:left w:val="single" w:color="BFBFBF" w:sz="1"/>
-              <w:bottom w:val="single" w:color="BFBFBF" w:sz="1"/>
-              <w:right w:val="single" w:color="BFBFBF" w:sz="1"/>
+              <w:top w:val="single" w:sz="1" w:space="0" w:color="BFBFBF"/>
+              <w:left w:val="single" w:sz="1" w:space="0" w:color="BFBFBF"/>
+              <w:bottom w:val="single" w:sz="1" w:space="0" w:color="BFBFBF"/>
+              <w:right w:val="single" w:sz="1" w:space="0" w:color="BFBFBF"/>
             </w:tcBorders>
             <w:tcMar>
-              <w:top w:type="dxa" w:w="80"/>
-              <w:left w:type="dxa" w:w="120"/>
-              <w:bottom w:type="dxa" w:w="80"/>
-              <w:right w:type="dxa" w:w="120"/>
+              <w:top w:w="80" w:type="dxa"/>
+              <w:left w:w="120" w:type="dxa"/>
+              <w:bottom w:w="80" w:type="dxa"/>
+              <w:right w:w="120" w:type="dxa"/>
             </w:tcMar>
           </w:tcPr>
           <w:p>
             <w:r>
               <w:rPr>
-                <w:b w:val="false"/>
-                <w:bCs w:val="false"/>
                 <w:sz w:val="20"/>
                 <w:szCs w:val="20"/>
               </w:rPr>
-              <w:t xml:space="preserve">A user receives many notifications</w:t>
+              <w:t>A user receives many notifications</w:t>
             </w:r>
           </w:p>
         </w:tc>
       </w:tr>
       <w:tr>
-        <w:trPr>
-          <w:tblHeader w:val="false"/>
-        </w:trPr>
+        <w:tblPrEx>
+          <w:tblCellMar>
+            <w:top w:w="0" w:type="dxa"/>
+            <w:bottom w:w="0" w:type="dxa"/>
+          </w:tblCellMar>
+        </w:tblPrEx>
         <w:tc>
           <w:tcPr>
-            <w:tcW w:type="dxa" w:w="2800"/>
+            <w:tcW w:w="2800" w:type="dxa"/>
             <w:tcBorders>
-              <w:top w:val="single" w:color="BFBFBF" w:sz="1"/>
-              <w:left w:val="single" w:color="BFBFBF" w:sz="1"/>
-              <w:bottom w:val="single" w:color="BFBFBF" w:sz="1"/>
-              <w:right w:val="single" w:color="BFBFBF" w:sz="1"/>
+              <w:top w:val="single" w:sz="1" w:space="0" w:color="BFBFBF"/>
+              <w:left w:val="single" w:sz="1" w:space="0" w:color="BFBFBF"/>
+              <w:bottom w:val="single" w:sz="1" w:space="0" w:color="BFBFBF"/>
+              <w:right w:val="single" w:sz="1" w:space="0" w:color="BFBFBF"/>
             </w:tcBorders>
             <w:tcMar>
-              <w:top w:type="dxa" w:w="80"/>
-              <w:left w:type="dxa" w:w="120"/>
-              <w:bottom w:type="dxa" w:w="80"/>
-              <w:right w:type="dxa" w:w="120"/>
+              <w:top w:w="80" w:type="dxa"/>
+              <w:left w:w="120" w:type="dxa"/>
+              <w:bottom w:w="80" w:type="dxa"/>
+              <w:right w:w="120" w:type="dxa"/>
             </w:tcMar>
           </w:tcPr>
           <w:p>
             <w:r>
               <w:rPr>
-                <w:b w:val="false"/>
-                <w:bCs w:val="false"/>
                 <w:sz w:val="20"/>
                 <w:szCs w:val="20"/>
               </w:rPr>
-              <w:t xml:space="preserve">users(agent) - agent_assignments</w:t>
+              <w:lastRenderedPageBreak/>
+              <w:t>users(agent) - agent_assignments</w:t>
             </w:r>
           </w:p>
         </w:tc>
         <w:tc>
           <w:tcPr>
-            <w:tcW w:type="dxa" w:w="2200"/>
+            <w:tcW w:w="2200" w:type="dxa"/>
             <w:tcBorders>
-              <w:top w:val="single" w:color="BFBFBF" w:sz="1"/>
-              <w:left w:val="single" w:color="BFBFBF" w:sz="1"/>
-              <w:bottom w:val="single" w:color="BFBFBF" w:sz="1"/>
-              <w:right w:val="single" w:color="BFBFBF" w:sz="1"/>
+              <w:top w:val="single" w:sz="1" w:space="0" w:color="BFBFBF"/>
+              <w:left w:val="single" w:sz="1" w:space="0" w:color="BFBFBF"/>
+              <w:bottom w:val="single" w:sz="1" w:space="0" w:color="BFBFBF"/>
+              <w:right w:val="single" w:sz="1" w:space="0" w:color="BFBFBF"/>
             </w:tcBorders>
             <w:tcMar>
-              <w:top w:type="dxa" w:w="80"/>
-              <w:left w:type="dxa" w:w="120"/>
-              <w:bottom w:type="dxa" w:w="80"/>
-              <w:right w:type="dxa" w:w="120"/>
+              <w:top w:w="80" w:type="dxa"/>
+              <w:left w:w="120" w:type="dxa"/>
+              <w:bottom w:w="80" w:type="dxa"/>
+              <w:right w:w="120" w:type="dxa"/>
             </w:tcMar>
           </w:tcPr>
           <w:p>
             <w:r>
               <w:rPr>
-                <w:b w:val="false"/>
-                <w:bCs w:val="false"/>
                 <w:sz w:val="20"/>
                 <w:szCs w:val="20"/>
               </w:rPr>
-              <w:t xml:space="preserve">1 : N</w:t>
+              <w:t>1 : N</w:t>
             </w:r>
           </w:p>
         </w:tc>
         <w:tc>
           <w:tcPr>
-            <w:tcW w:type="dxa" w:w="4026"/>
+            <w:tcW w:w="4026" w:type="dxa"/>
             <w:tcBorders>
-              <w:top w:val="single" w:color="BFBFBF" w:sz="1"/>
-              <w:left w:val="single" w:color="BFBFBF" w:sz="1"/>
-              <w:bottom w:val="single" w:color="BFBFBF" w:sz="1"/>
-              <w:right w:val="single" w:color="BFBFBF" w:sz="1"/>
+              <w:top w:val="single" w:sz="1" w:space="0" w:color="BFBFBF"/>
+              <w:left w:val="single" w:sz="1" w:space="0" w:color="BFBFBF"/>
+              <w:bottom w:val="single" w:sz="1" w:space="0" w:color="BFBFBF"/>
+              <w:right w:val="single" w:sz="1" w:space="0" w:color="BFBFBF"/>
             </w:tcBorders>
             <w:tcMar>
-              <w:top w:type="dxa" w:w="80"/>
-              <w:left w:type="dxa" w:w="120"/>
-              <w:bottom w:type="dxa" w:w="80"/>
-              <w:right w:type="dxa" w:w="120"/>
+              <w:top w:w="80" w:type="dxa"/>
+              <w:left w:w="120" w:type="dxa"/>
+              <w:bottom w:w="80" w:type="dxa"/>
+              <w:right w:w="120" w:type="dxa"/>
             </w:tcMar>
           </w:tcPr>
           <w:p>
             <w:r>
               <w:rPr>
-                <w:b w:val="false"/>
-                <w:bCs w:val="false"/>
                 <w:sz w:val="20"/>
                 <w:szCs w:val="20"/>
               </w:rPr>
-              <w:t xml:space="preserve">An agent serves many customers</w:t>
+              <w:t>An agent serves many customers</w:t>
             </w:r>
           </w:p>
         </w:tc>
       </w:tr>
       <w:tr>
-        <w:trPr>
-          <w:tblHeader w:val="false"/>
-        </w:trPr>
+        <w:tblPrEx>
+          <w:tblCellMar>
+            <w:top w:w="0" w:type="dxa"/>
+            <w:bottom w:w="0" w:type="dxa"/>
+          </w:tblCellMar>
+        </w:tblPrEx>
         <w:tc>
           <w:tcPr>
-            <w:tcW w:type="dxa" w:w="2800"/>
+            <w:tcW w:w="2800" w:type="dxa"/>
             <w:tcBorders>
-              <w:top w:val="single" w:color="BFBFBF" w:sz="1"/>
-              <w:left w:val="single" w:color="BFBFBF" w:sz="1"/>
-              <w:bottom w:val="single" w:color="BFBFBF" w:sz="1"/>
-              <w:right w:val="single" w:color="BFBFBF" w:sz="1"/>
+              <w:top w:val="single" w:sz="1" w:space="0" w:color="BFBFBF"/>
+              <w:left w:val="single" w:sz="1" w:space="0" w:color="BFBFBF"/>
+              <w:bottom w:val="single" w:sz="1" w:space="0" w:color="BFBFBF"/>
+              <w:right w:val="single" w:sz="1" w:space="0" w:color="BFBFBF"/>
             </w:tcBorders>
             <w:tcMar>
-              <w:top w:type="dxa" w:w="80"/>
-              <w:left w:type="dxa" w:w="120"/>
-              <w:bottom w:type="dxa" w:w="80"/>
-              <w:right w:type="dxa" w:w="120"/>
+              <w:top w:w="80" w:type="dxa"/>
+              <w:left w:w="120" w:type="dxa"/>
+              <w:bottom w:w="80" w:type="dxa"/>
+              <w:right w:w="120" w:type="dxa"/>
             </w:tcMar>
           </w:tcPr>
           <w:p>
             <w:r>
               <w:rPr>
-                <w:b w:val="false"/>
-                <w:bCs w:val="false"/>
                 <w:sz w:val="20"/>
                 <w:szCs w:val="20"/>
               </w:rPr>
-              <w:t xml:space="preserve">users(customer) - agent_assignments</w:t>
+              <w:t>users(customer) - agent_assignments</w:t>
             </w:r>
           </w:p>
         </w:tc>
         <w:tc>
           <w:tcPr>
-            <w:tcW w:type="dxa" w:w="2200"/>
+            <w:tcW w:w="2200" w:type="dxa"/>
             <w:tcBorders>
-              <w:top w:val="single" w:color="BFBFBF" w:sz="1"/>
-              <w:left w:val="single" w:color="BFBFBF" w:sz="1"/>
-              <w:bottom w:val="single" w:color="BFBFBF" w:sz="1"/>
-              <w:right w:val="single" w:color="BFBFBF" w:sz="1"/>
+              <w:top w:val="single" w:sz="1" w:space="0" w:color="BFBFBF"/>
+              <w:left w:val="single" w:sz="1" w:space="0" w:color="BFBFBF"/>
+              <w:bottom w:val="single" w:sz="1" w:space="0" w:color="BFBFBF"/>
+              <w:right w:val="single" w:sz="1" w:space="0" w:color="BFBFBF"/>
             </w:tcBorders>
             <w:tcMar>
-              <w:top w:type="dxa" w:w="80"/>
-              <w:left w:type="dxa" w:w="120"/>
-              <w:bottom w:type="dxa" w:w="80"/>
-              <w:right w:type="dxa" w:w="120"/>
+              <w:top w:w="80" w:type="dxa"/>
+              <w:left w:w="120" w:type="dxa"/>
+              <w:bottom w:w="80" w:type="dxa"/>
+              <w:right w:w="120" w:type="dxa"/>
             </w:tcMar>
           </w:tcPr>
           <w:p>
             <w:r>
               <w:rPr>
-                <w:b w:val="false"/>
-                <w:bCs w:val="false"/>
                 <w:sz w:val="20"/>
                 <w:szCs w:val="20"/>
               </w:rPr>
-              <w:t xml:space="preserve">1 : 1</w:t>
+              <w:t>1 : 1</w:t>
             </w:r>
           </w:p>
         </w:tc>
         <w:tc>
           <w:tcPr>
-            <w:tcW w:type="dxa" w:w="4026"/>
+            <w:tcW w:w="4026" w:type="dxa"/>
             <w:tcBorders>
-              <w:top w:val="single" w:color="BFBFBF" w:sz="1"/>
-              <w:left w:val="single" w:color="BFBFBF" w:sz="1"/>
-              <w:bottom w:val="single" w:color="BFBFBF" w:sz="1"/>
-              <w:right w:val="single" w:color="BFBFBF" w:sz="1"/>
+              <w:top w:val="single" w:sz="1" w:space="0" w:color="BFBFBF"/>
+              <w:left w:val="single" w:sz="1" w:space="0" w:color="BFBFBF"/>
+              <w:bottom w:val="single" w:sz="1" w:space="0" w:color="BFBFBF"/>
+              <w:right w:val="single" w:sz="1" w:space="0" w:color="BFBFBF"/>
             </w:tcBorders>
             <w:tcMar>
-              <w:top w:type="dxa" w:w="80"/>
-              <w:left w:type="dxa" w:w="120"/>
-              <w:bottom w:type="dxa" w:w="80"/>
-              <w:right w:type="dxa" w:w="120"/>
+              <w:top w:w="80" w:type="dxa"/>
+              <w:left w:w="120" w:type="dxa"/>
+              <w:bottom w:w="80" w:type="dxa"/>
+              <w:right w:w="120" w:type="dxa"/>
             </w:tcMar>
           </w:tcPr>
           <w:p>
             <w:r>
               <w:rPr>
-                <w:b w:val="false"/>
-                <w:bCs w:val="false"/>
                 <w:sz w:val="20"/>
                 <w:szCs w:val="20"/>
               </w:rPr>
-              <w:t xml:space="preserve">A customer has at most one assigned agent (unique constraint)</w:t>
+              <w:t>A customer has at most one assigned agent (unique constraint)</w:t>
             </w:r>
           </w:p>
         </w:tc>
       </w:tr>
     </w:tbl>
+    <w:p/>
     <w:sectPr>
-      <w:headerReference w:type="default" r:id="rId7"/>
-      <w:footerReference w:type="default" r:id="rId8"/>
-      <w:pgSz w:w="11906" w:h="16838" w:orient="portrait"/>
+      <w:headerReference w:type="default" r:id="rId14"/>
+      <w:footerReference w:type="default" r:id="rId15"/>
+      <w:pgSz w:w="11906" w:h="16838"/>
       <w:pgMar w:top="1440" w:right="1440" w:bottom="1440" w:left="1440" w:header="708" w:footer="708" w:gutter="0"/>
-      <w:pgNumType/>
+      <w:cols w:space="720"/>
       <w:docGrid w:linePitch="360"/>
     </w:sectPr>
   </w:body>
 </w:document>
 </file>
 
-<file path=word/comments.xml><?xml version="1.0" encoding="utf-8"?>
-<w:comments xmlns:cx="http://schemas.microsoft.com/office/drawing/2014/chartex" xmlns:cx1="http://schemas.microsoft.com/office/drawing/2015/9/8/chartex" xmlns:cx2="http://schemas.microsoft.com/office/drawing/2015/10/21/chartex" xmlns:cx3="http://schemas.microsoft.com/office/drawing/2016/5/9/chartex" xmlns:cx4="http://schemas.microsoft.com/office/drawing/2016/5/10/chartex" xmlns:cx5="http://schemas.microsoft.com/office/drawing/2016/5/11/chartex" xmlns:cx6="http://schemas.microsoft.com/office/drawing/2016/5/12/chartex" xmlns:cx7="http://schemas.microsoft.com/office/drawing/2016/5/13/chartex" xmlns:cx8="http://schemas.microsoft.com/office/drawing/2016/5/14/chartex" xmlns:mc="http://schemas.openxmlformats.org/markup-compatibility/2006" xmlns:aink="http://schemas.microsoft.com/office/drawing/2016/ink" xmlns:am3d="http://schemas.microsoft.com/office/drawing/2017/model3d" xmlns:o="urn:schemas-microsoft-com:office:office" xmlns:r="http://schemas.openxmlformats.org/officeDocument/2006/relationships" xmlns:m="http://schemas.openxmlformats.org/officeDocument/2006/math" xmlns:v="urn:schemas-microsoft-com:vml" xmlns:wp14="http://schemas.microsoft.com/office/word/2010/wordprocessingDrawing" xmlns:wp="http://schemas.openxmlformats.org/drawingml/2006/wordprocessingDrawing" xmlns:w10="urn:schemas-microsoft-com:office:word" xmlns:w="http://schemas.openxmlformats.org/wordprocessingml/2006/main" xmlns:w14="http://schemas.microsoft.com/office/word/2010/wordml" xmlns:w15="http://schemas.microsoft.com/office/word/2012/wordml" xmlns:w16cex="http://schemas.microsoft.com/office/word/2018/wordml/cex" xmlns:w16cid="http://schemas.microsoft.com/office/word/2016/wordml/cid" xmlns:w16="http://schemas.microsoft.com/office/word/2018/wordml" xmlns:w16sdtdh="http://schemas.microsoft.com/office/word/2020/wordml/sdtdatahash" xmlns:w16se="http://schemas.microsoft.com/office/word/2015/wordml/symex" xmlns:wpg="http://schemas.microsoft.com/office/word/2010/wordprocessingGroup" xmlns:wpi="http://schemas.microsoft.com/office/word/2010/wordprocessingInk" xmlns:wne="http://schemas.microsoft.com/office/word/2006/wordml" xmlns:wps="http://schemas.microsoft.com/office/word/2010/wordprocessingShape"/>
-</file>
-
 <file path=word/endnotes.xml><?xml version="1.0" encoding="utf-8"?>
-<w:endnotes xmlns:wpc="http://schemas.microsoft.com/office/word/2010/wordprocessingCanvas" xmlns:mc="http://schemas.openxmlformats.org/markup-compatibility/2006" xmlns:o="urn:schemas-microsoft-com:office:office" xmlns:r="http://schemas.openxmlformats.org/officeDocument/2006/relationships" xmlns:m="http://schemas.openxmlformats.org/officeDocument/2006/math" xmlns:v="urn:schemas-microsoft-com:vml" xmlns:wp14="http://schemas.microsoft.com/office/word/2010/wordprocessingDrawing" xmlns:wp="http://schemas.openxmlformats.org/drawingml/2006/wordprocessingDrawing" xmlns:w10="urn:schemas-microsoft-com:office:word" xmlns:w="http://schemas.openxmlformats.org/wordprocessingml/2006/main" xmlns:w14="http://schemas.microsoft.com/office/word/2010/wordml" xmlns:w15="http://schemas.microsoft.com/office/word/2012/wordml" xmlns:wpg="http://schemas.microsoft.com/office/word/2010/wordprocessingGroup" xmlns:wpi="http://schemas.microsoft.com/office/word/2010/wordprocessingInk" xmlns:wne="http://schemas.microsoft.com/office/word/2006/wordml" xmlns:wps="http://schemas.microsoft.com/office/word/2010/wordprocessingShape" mc:Ignorable="w14 w15 wp14">
+<w:endnotes xmlns:wpc="http://schemas.microsoft.com/office/word/2010/wordprocessingCanvas" xmlns:cx="http://schemas.microsoft.com/office/drawing/2014/chartex" xmlns:cx1="http://schemas.microsoft.com/office/drawing/2015/9/8/chartex" xmlns:cx2="http://schemas.microsoft.com/office/drawing/2015/10/21/chartex" xmlns:cx3="http://schemas.microsoft.com/office/drawing/2016/5/9/chartex" xmlns:cx4="http://schemas.microsoft.com/office/drawing/2016/5/10/chartex" xmlns:cx5="http://schemas.microsoft.com/office/drawing/2016/5/11/chartex" xmlns:cx6="http://schemas.microsoft.com/office/drawing/2016/5/12/chartex" xmlns:cx7="http://schemas.microsoft.com/office/drawing/2016/5/13/chartex" xmlns:cx8="http://schemas.microsoft.com/office/drawing/2016/5/14/chartex" xmlns:mc="http://schemas.openxmlformats.org/markup-compatibility/2006" xmlns:aink="http://schemas.microsoft.com/office/drawing/2016/ink" xmlns:am3d="http://schemas.microsoft.com/office/drawing/2017/model3d" xmlns:o="urn:schemas-microsoft-com:office:office" xmlns:oel="http://schemas.microsoft.com/office/2019/extlst" xmlns:r="http://schemas.openxmlformats.org/officeDocument/2006/relationships" xmlns:m="http://schemas.openxmlformats.org/officeDocument/2006/math" xmlns:v="urn:schemas-microsoft-com:vml" xmlns:wp14="http://schemas.microsoft.com/office/word/2010/wordprocessingDrawing" xmlns:wp="http://schemas.openxmlformats.org/drawingml/2006/wordprocessingDrawing" xmlns:w10="urn:schemas-microsoft-com:office:word" xmlns:w="http://schemas.openxmlformats.org/wordprocessingml/2006/main" xmlns:w14="http://schemas.microsoft.com/office/word/2010/wordml" xmlns:w15="http://schemas.microsoft.com/office/word/2012/wordml" xmlns:w16cex="http://schemas.microsoft.com/office/word/2018/wordml/cex" xmlns:w16cid="http://schemas.microsoft.com/office/word/2016/wordml/cid" xmlns:w16="http://schemas.microsoft.com/office/word/2018/wordml" xmlns:w16du="http://schemas.microsoft.com/office/word/2023/wordml/word16du" xmlns:w16sdtdh="http://schemas.microsoft.com/office/word/2020/wordml/sdtdatahash" xmlns:w16sdtfl="http://schemas.microsoft.com/office/word/2024/wordml/sdtformatlock" xmlns:w16se="http://schemas.microsoft.com/office/word/2015/wordml/symex" xmlns:wpg="http://schemas.microsoft.com/office/word/2010/wordprocessingGroup" xmlns:wpi="http://schemas.microsoft.com/office/word/2010/wordprocessingInk" xmlns:wne="http://schemas.microsoft.com/office/word/2006/wordml" xmlns:wps="http://schemas.microsoft.com/office/word/2010/wordprocessingShape" mc:Ignorable="w14 w15 w16se w16cid w16 w16cex w16sdtdh w16sdtfl w16du wp14">
   <w:endnote w:type="separator" w:id="-1">
     <w:p>
-      <w:pPr>
-        <w:spacing w:after="0" w:line="240" w:lineRule="auto"/>
-      </w:pPr>
-      <w:r>
-        <w:rPr>
-          <w:rStyle w:val="EndnoteReference"/>
-        </w:rPr>
-        <w:endnoteRef/>
-      </w:r>
       <w:r>
         <w:separator/>
       </w:r>
@@ -1694,15 +2326,6 @@
   </w:endnote>
   <w:endnote w:type="continuationSeparator" w:id="0">
     <w:p>
-      <w:pPr>
-        <w:spacing w:after="0" w:line="240" w:lineRule="auto"/>
-      </w:pPr>
-      <w:r>
-        <w:rPr>
-          <w:rStyle w:val="EndnoteReference"/>
-        </w:rPr>
-        <w:endnoteRef/>
-      </w:r>
       <w:r>
         <w:continuationSeparator/>
       </w:r>
@@ -1712,7 +2335,7 @@
 </file>
 
 <file path=word/footer1.xml><?xml version="1.0" encoding="utf-8"?>
-<w:ftr xmlns:wpc="http://schemas.microsoft.com/office/word/2010/wordprocessingCanvas" xmlns:mc="http://schemas.openxmlformats.org/markup-compatibility/2006" xmlns:o="urn:schemas-microsoft-com:office:office" xmlns:r="http://schemas.openxmlformats.org/officeDocument/2006/relationships" xmlns:m="http://schemas.openxmlformats.org/officeDocument/2006/math" xmlns:v="urn:schemas-microsoft-com:vml" xmlns:wp14="http://schemas.microsoft.com/office/word/2010/wordprocessingDrawing" xmlns:wp="http://schemas.openxmlformats.org/drawingml/2006/wordprocessingDrawing" xmlns:w10="urn:schemas-microsoft-com:office:word" xmlns:w="http://schemas.openxmlformats.org/wordprocessingml/2006/main" xmlns:w14="http://schemas.microsoft.com/office/word/2010/wordml" xmlns:w15="http://schemas.microsoft.com/office/word/2012/wordml" xmlns:wpg="http://schemas.microsoft.com/office/word/2010/wordprocessingGroup" xmlns:wpi="http://schemas.microsoft.com/office/word/2010/wordprocessingInk" xmlns:wne="http://schemas.microsoft.com/office/word/2006/wordml" xmlns:wps="http://schemas.microsoft.com/office/word/2010/wordprocessingShape">
+<w:ftr xmlns:wpc="http://schemas.microsoft.com/office/word/2010/wordprocessingCanvas" xmlns:cx="http://schemas.microsoft.com/office/drawing/2014/chartex" xmlns:cx1="http://schemas.microsoft.com/office/drawing/2015/9/8/chartex" xmlns:cx2="http://schemas.microsoft.com/office/drawing/2015/10/21/chartex" xmlns:cx3="http://schemas.microsoft.com/office/drawing/2016/5/9/chartex" xmlns:cx4="http://schemas.microsoft.com/office/drawing/2016/5/10/chartex" xmlns:cx5="http://schemas.microsoft.com/office/drawing/2016/5/11/chartex" xmlns:cx6="http://schemas.microsoft.com/office/drawing/2016/5/12/chartex" xmlns:cx7="http://schemas.microsoft.com/office/drawing/2016/5/13/chartex" xmlns:cx8="http://schemas.microsoft.com/office/drawing/2016/5/14/chartex" xmlns:mc="http://schemas.openxmlformats.org/markup-compatibility/2006" xmlns:aink="http://schemas.microsoft.com/office/drawing/2016/ink" xmlns:am3d="http://schemas.microsoft.com/office/drawing/2017/model3d" xmlns:o="urn:schemas-microsoft-com:office:office" xmlns:oel="http://schemas.microsoft.com/office/2019/extlst" xmlns:r="http://schemas.openxmlformats.org/officeDocument/2006/relationships" xmlns:m="http://schemas.openxmlformats.org/officeDocument/2006/math" xmlns:v="urn:schemas-microsoft-com:vml" xmlns:wp14="http://schemas.microsoft.com/office/word/2010/wordprocessingDrawing" xmlns:wp="http://schemas.openxmlformats.org/drawingml/2006/wordprocessingDrawing" xmlns:w10="urn:schemas-microsoft-com:office:word" xmlns:w="http://schemas.openxmlformats.org/wordprocessingml/2006/main" xmlns:w14="http://schemas.microsoft.com/office/word/2010/wordml" xmlns:w15="http://schemas.microsoft.com/office/word/2012/wordml" xmlns:w16cex="http://schemas.microsoft.com/office/word/2018/wordml/cex" xmlns:w16cid="http://schemas.microsoft.com/office/word/2016/wordml/cid" xmlns:w16="http://schemas.microsoft.com/office/word/2018/wordml" xmlns:w16du="http://schemas.microsoft.com/office/word/2023/wordml/word16du" xmlns:w16sdtdh="http://schemas.microsoft.com/office/word/2020/wordml/sdtdatahash" xmlns:w16sdtfl="http://schemas.microsoft.com/office/word/2024/wordml/sdtformatlock" xmlns:w16se="http://schemas.microsoft.com/office/word/2015/wordml/symex" xmlns:wpg="http://schemas.microsoft.com/office/word/2010/wordprocessingGroup" xmlns:wpi="http://schemas.microsoft.com/office/word/2010/wordprocessingInk" xmlns:wne="http://schemas.microsoft.com/office/word/2006/wordml" xmlns:wps="http://schemas.microsoft.com/office/word/2010/wordprocessingShape" mc:Ignorable="w14 w15 w16se w16cid w16 w16cex w16sdtdh w16sdtfl w16du wp14">
   <w:p>
     <w:pPr>
       <w:jc w:val="center"/>
@@ -1732,8 +2355,38 @@
         <w:szCs w:val="18"/>
       </w:rPr>
       <w:fldChar w:fldCharType="begin"/>
-      <w:instrText xml:space="preserve">PAGE</w:instrText>
+    </w:r>
+    <w:r>
+      <w:rPr>
+        <w:color w:val="666666"/>
+        <w:sz w:val="18"/>
+        <w:szCs w:val="18"/>
+      </w:rPr>
+      <w:instrText>PAGE</w:instrText>
+    </w:r>
+    <w:r>
+      <w:rPr>
+        <w:color w:val="666666"/>
+        <w:sz w:val="18"/>
+        <w:szCs w:val="18"/>
+      </w:rPr>
       <w:fldChar w:fldCharType="separate"/>
+    </w:r>
+    <w:r>
+      <w:rPr>
+        <w:noProof/>
+        <w:color w:val="666666"/>
+        <w:sz w:val="18"/>
+        <w:szCs w:val="18"/>
+      </w:rPr>
+      <w:t>1</w:t>
+    </w:r>
+    <w:r>
+      <w:rPr>
+        <w:color w:val="666666"/>
+        <w:sz w:val="18"/>
+        <w:szCs w:val="18"/>
+      </w:rPr>
       <w:fldChar w:fldCharType="end"/>
     </w:r>
     <w:r>
@@ -1751,8 +2404,38 @@
         <w:szCs w:val="18"/>
       </w:rPr>
       <w:fldChar w:fldCharType="begin"/>
-      <w:instrText xml:space="preserve">NUMPAGES</w:instrText>
+    </w:r>
+    <w:r>
+      <w:rPr>
+        <w:color w:val="666666"/>
+        <w:sz w:val="18"/>
+        <w:szCs w:val="18"/>
+      </w:rPr>
+      <w:instrText>NUMPAGES</w:instrText>
+    </w:r>
+    <w:r>
+      <w:rPr>
+        <w:color w:val="666666"/>
+        <w:sz w:val="18"/>
+        <w:szCs w:val="18"/>
+      </w:rPr>
       <w:fldChar w:fldCharType="separate"/>
+    </w:r>
+    <w:r>
+      <w:rPr>
+        <w:noProof/>
+        <w:color w:val="666666"/>
+        <w:sz w:val="18"/>
+        <w:szCs w:val="18"/>
+      </w:rPr>
+      <w:t>2</w:t>
+    </w:r>
+    <w:r>
+      <w:rPr>
+        <w:color w:val="666666"/>
+        <w:sz w:val="18"/>
+        <w:szCs w:val="18"/>
+      </w:rPr>
       <w:fldChar w:fldCharType="end"/>
     </w:r>
   </w:p>
@@ -1760,18 +2443,9 @@
 </file>
 
 <file path=word/footnotes.xml><?xml version="1.0" encoding="utf-8"?>
-<w:footnotes xmlns:wpc="http://schemas.microsoft.com/office/word/2010/wordprocessingCanvas" xmlns:mc="http://schemas.openxmlformats.org/markup-compatibility/2006" xmlns:o="urn:schemas-microsoft-com:office:office" xmlns:r="http://schemas.openxmlformats.org/officeDocument/2006/relationships" xmlns:m="http://schemas.openxmlformats.org/officeDocument/2006/math" xmlns:v="urn:schemas-microsoft-com:vml" xmlns:wp14="http://schemas.microsoft.com/office/word/2010/wordprocessingDrawing" xmlns:wp="http://schemas.openxmlformats.org/drawingml/2006/wordprocessingDrawing" xmlns:w10="urn:schemas-microsoft-com:office:word" xmlns:w="http://schemas.openxmlformats.org/wordprocessingml/2006/main" xmlns:w14="http://schemas.microsoft.com/office/word/2010/wordml" xmlns:w15="http://schemas.microsoft.com/office/word/2012/wordml" xmlns:wpg="http://schemas.microsoft.com/office/word/2010/wordprocessingGroup" xmlns:wpi="http://schemas.microsoft.com/office/word/2010/wordprocessingInk" xmlns:wne="http://schemas.microsoft.com/office/word/2006/wordml" xmlns:wps="http://schemas.microsoft.com/office/word/2010/wordprocessingShape" mc:Ignorable="w14 w15 wp14">
+<w:footnotes xmlns:wpc="http://schemas.microsoft.com/office/word/2010/wordprocessingCanvas" xmlns:cx="http://schemas.microsoft.com/office/drawing/2014/chartex" xmlns:cx1="http://schemas.microsoft.com/office/drawing/2015/9/8/chartex" xmlns:cx2="http://schemas.microsoft.com/office/drawing/2015/10/21/chartex" xmlns:cx3="http://schemas.microsoft.com/office/drawing/2016/5/9/chartex" xmlns:cx4="http://schemas.microsoft.com/office/drawing/2016/5/10/chartex" xmlns:cx5="http://schemas.microsoft.com/office/drawing/2016/5/11/chartex" xmlns:cx6="http://schemas.microsoft.com/office/drawing/2016/5/12/chartex" xmlns:cx7="http://schemas.microsoft.com/office/drawing/2016/5/13/chartex" xmlns:cx8="http://schemas.microsoft.com/office/drawing/2016/5/14/chartex" xmlns:mc="http://schemas.openxmlformats.org/markup-compatibility/2006" xmlns:aink="http://schemas.microsoft.com/office/drawing/2016/ink" xmlns:am3d="http://schemas.microsoft.com/office/drawing/2017/model3d" xmlns:o="urn:schemas-microsoft-com:office:office" xmlns:oel="http://schemas.microsoft.com/office/2019/extlst" xmlns:r="http://schemas.openxmlformats.org/officeDocument/2006/relationships" xmlns:m="http://schemas.openxmlformats.org/officeDocument/2006/math" xmlns:v="urn:schemas-microsoft-com:vml" xmlns:wp14="http://schemas.microsoft.com/office/word/2010/wordprocessingDrawing" xmlns:wp="http://schemas.openxmlformats.org/drawingml/2006/wordprocessingDrawing" xmlns:w10="urn:schemas-microsoft-com:office:word" xmlns:w="http://schemas.openxmlformats.org/wordprocessingml/2006/main" xmlns:w14="http://schemas.microsoft.com/office/word/2010/wordml" xmlns:w15="http://schemas.microsoft.com/office/word/2012/wordml" xmlns:w16cex="http://schemas.microsoft.com/office/word/2018/wordml/cex" xmlns:w16cid="http://schemas.microsoft.com/office/word/2016/wordml/cid" xmlns:w16="http://schemas.microsoft.com/office/word/2018/wordml" xmlns:w16du="http://schemas.microsoft.com/office/word/2023/wordml/word16du" xmlns:w16sdtdh="http://schemas.microsoft.com/office/word/2020/wordml/sdtdatahash" xmlns:w16sdtfl="http://schemas.microsoft.com/office/word/2024/wordml/sdtformatlock" xmlns:w16se="http://schemas.microsoft.com/office/word/2015/wordml/symex" xmlns:wpg="http://schemas.microsoft.com/office/word/2010/wordprocessingGroup" xmlns:wpi="http://schemas.microsoft.com/office/word/2010/wordprocessingInk" xmlns:wne="http://schemas.microsoft.com/office/word/2006/wordml" xmlns:wps="http://schemas.microsoft.com/office/word/2010/wordprocessingShape" mc:Ignorable="w14 w15 w16se w16cid w16 w16cex w16sdtdh w16sdtfl w16du wp14">
   <w:footnote w:type="separator" w:id="-1">
     <w:p>
-      <w:pPr>
-        <w:spacing w:after="0" w:line="240" w:lineRule="auto"/>
-      </w:pPr>
-      <w:r>
-        <w:rPr>
-          <w:rStyle w:val="FootnoteReference"/>
-        </w:rPr>
-        <w:footnoteRef/>
-      </w:r>
       <w:r>
         <w:separator/>
       </w:r>
@@ -1779,15 +2453,6 @@
   </w:footnote>
   <w:footnote w:type="continuationSeparator" w:id="0">
     <w:p>
-      <w:pPr>
-        <w:spacing w:after="0" w:line="240" w:lineRule="auto"/>
-      </w:pPr>
-      <w:r>
-        <w:rPr>
-          <w:rStyle w:val="FootnoteReference"/>
-        </w:rPr>
-        <w:footnoteRef/>
-      </w:r>
       <w:r>
         <w:continuationSeparator/>
       </w:r>
@@ -1797,11 +2462,11 @@
 </file>
 
 <file path=word/header1.xml><?xml version="1.0" encoding="utf-8"?>
-<w:hdr xmlns:wpc="http://schemas.microsoft.com/office/word/2010/wordprocessingCanvas" xmlns:mc="http://schemas.openxmlformats.org/markup-compatibility/2006" xmlns:o="urn:schemas-microsoft-com:office:office" xmlns:r="http://schemas.openxmlformats.org/officeDocument/2006/relationships" xmlns:m="http://schemas.openxmlformats.org/officeDocument/2006/math" xmlns:v="urn:schemas-microsoft-com:vml" xmlns:wp14="http://schemas.microsoft.com/office/word/2010/wordprocessingDrawing" xmlns:wp="http://schemas.openxmlformats.org/drawingml/2006/wordprocessingDrawing" xmlns:w10="urn:schemas-microsoft-com:office:word" xmlns:w="http://schemas.openxmlformats.org/wordprocessingml/2006/main" xmlns:w14="http://schemas.microsoft.com/office/word/2010/wordml" xmlns:w15="http://schemas.microsoft.com/office/word/2012/wordml" xmlns:wpg="http://schemas.microsoft.com/office/word/2010/wordprocessingGroup" xmlns:wpi="http://schemas.microsoft.com/office/word/2010/wordprocessingInk" xmlns:wne="http://schemas.microsoft.com/office/word/2006/wordml" xmlns:wps="http://schemas.microsoft.com/office/word/2010/wordprocessingShape" xmlns:cx="http://schemas.microsoft.com/office/drawing/2014/chartex" xmlns:cx1="http://schemas.microsoft.com/office/drawing/2015/9/8/chartex" xmlns:cx2="http://schemas.microsoft.com/office/drawing/2015/10/21/chartex" xmlns:cx3="http://schemas.microsoft.com/office/drawing/2016/5/9/chartex" xmlns:cx4="http://schemas.microsoft.com/office/drawing/2016/5/10/chartex" xmlns:cx5="http://schemas.microsoft.com/office/drawing/2016/5/11/chartex" xmlns:cx6="http://schemas.microsoft.com/office/drawing/2016/5/12/chartex" xmlns:cx7="http://schemas.microsoft.com/office/drawing/2016/5/13/chartex" xmlns:cx8="http://schemas.microsoft.com/office/drawing/2016/5/14/chartex" xmlns:w16cid="http://schemas.microsoft.com/office/word/2016/wordml/cid" xmlns:w16se="http://schemas.microsoft.com/office/word/2015/wordml/symex">
+<w:hdr xmlns:wpc="http://schemas.microsoft.com/office/word/2010/wordprocessingCanvas" xmlns:cx="http://schemas.microsoft.com/office/drawing/2014/chartex" xmlns:cx1="http://schemas.microsoft.com/office/drawing/2015/9/8/chartex" xmlns:cx2="http://schemas.microsoft.com/office/drawing/2015/10/21/chartex" xmlns:cx3="http://schemas.microsoft.com/office/drawing/2016/5/9/chartex" xmlns:cx4="http://schemas.microsoft.com/office/drawing/2016/5/10/chartex" xmlns:cx5="http://schemas.microsoft.com/office/drawing/2016/5/11/chartex" xmlns:cx6="http://schemas.microsoft.com/office/drawing/2016/5/12/chartex" xmlns:cx7="http://schemas.microsoft.com/office/drawing/2016/5/13/chartex" xmlns:cx8="http://schemas.microsoft.com/office/drawing/2016/5/14/chartex" xmlns:mc="http://schemas.openxmlformats.org/markup-compatibility/2006" xmlns:aink="http://schemas.microsoft.com/office/drawing/2016/ink" xmlns:am3d="http://schemas.microsoft.com/office/drawing/2017/model3d" xmlns:o="urn:schemas-microsoft-com:office:office" xmlns:oel="http://schemas.microsoft.com/office/2019/extlst" xmlns:r="http://schemas.openxmlformats.org/officeDocument/2006/relationships" xmlns:m="http://schemas.openxmlformats.org/officeDocument/2006/math" xmlns:v="urn:schemas-microsoft-com:vml" xmlns:wp14="http://schemas.microsoft.com/office/word/2010/wordprocessingDrawing" xmlns:wp="http://schemas.openxmlformats.org/drawingml/2006/wordprocessingDrawing" xmlns:w10="urn:schemas-microsoft-com:office:word" xmlns:w="http://schemas.openxmlformats.org/wordprocessingml/2006/main" xmlns:w14="http://schemas.microsoft.com/office/word/2010/wordml" xmlns:w15="http://schemas.microsoft.com/office/word/2012/wordml" xmlns:w16cex="http://schemas.microsoft.com/office/word/2018/wordml/cex" xmlns:w16cid="http://schemas.microsoft.com/office/word/2016/wordml/cid" xmlns:w16="http://schemas.microsoft.com/office/word/2018/wordml" xmlns:w16du="http://schemas.microsoft.com/office/word/2023/wordml/word16du" xmlns:w16sdtdh="http://schemas.microsoft.com/office/word/2020/wordml/sdtdatahash" xmlns:w16sdtfl="http://schemas.microsoft.com/office/word/2024/wordml/sdtformatlock" xmlns:w16se="http://schemas.microsoft.com/office/word/2015/wordml/symex" xmlns:wpg="http://schemas.microsoft.com/office/word/2010/wordprocessingGroup" xmlns:wpi="http://schemas.microsoft.com/office/word/2010/wordprocessingInk" xmlns:wne="http://schemas.microsoft.com/office/word/2006/wordml" xmlns:wps="http://schemas.microsoft.com/office/word/2010/wordprocessingShape" mc:Ignorable="w14 w15 w16se w16cid w16 w16cex w16sdtdh w16sdtfl w16du wp14">
   <w:p>
     <w:pPr>
       <w:pBdr>
-        <w:bottom w:val="single" w:color="2E75B6" w:sz="6" w:space="1"/>
+        <w:bottom w:val="single" w:sz="6" w:space="1" w:color="2E75B6"/>
       </w:pBdr>
       <w:jc w:val="right"/>
     </w:pPr>
@@ -1811,17 +2476,73 @@
         <w:sz w:val="18"/>
         <w:szCs w:val="18"/>
       </w:rPr>
-      <w:t xml:space="preserve">Insurance Management System - Design Document</w:t>
+      <w:t>Insurance Management System - Design Document</w:t>
     </w:r>
   </w:p>
 </w:hdr>
 </file>
 
 <file path=word/numbering.xml><?xml version="1.0" encoding="utf-8"?>
-<w:numbering xmlns:wpc="http://schemas.microsoft.com/office/word/2010/wordprocessingCanvas" xmlns:mc="http://schemas.openxmlformats.org/markup-compatibility/2006" xmlns:o="urn:schemas-microsoft-com:office:office" xmlns:r="http://schemas.openxmlformats.org/officeDocument/2006/relationships" xmlns:m="http://schemas.openxmlformats.org/officeDocument/2006/math" xmlns:v="urn:schemas-microsoft-com:vml" xmlns:wp14="http://schemas.microsoft.com/office/word/2010/wordprocessingDrawing" xmlns:wp="http://schemas.openxmlformats.org/drawingml/2006/wordprocessingDrawing" xmlns:w10="urn:schemas-microsoft-com:office:word" xmlns:w="http://schemas.openxmlformats.org/wordprocessingml/2006/main" xmlns:w14="http://schemas.microsoft.com/office/word/2010/wordml" xmlns:w15="http://schemas.microsoft.com/office/word/2012/wordml" xmlns:wpg="http://schemas.microsoft.com/office/word/2010/wordprocessingGroup" xmlns:wpi="http://schemas.microsoft.com/office/word/2010/wordprocessingInk" xmlns:wne="http://schemas.microsoft.com/office/word/2006/wordml" xmlns:wps="http://schemas.microsoft.com/office/word/2010/wordprocessingShape" mc:Ignorable="w14 w15 wp14">
+<w:numbering xmlns:wpc="http://schemas.microsoft.com/office/word/2010/wordprocessingCanvas" xmlns:cx="http://schemas.microsoft.com/office/drawing/2014/chartex" xmlns:cx1="http://schemas.microsoft.com/office/drawing/2015/9/8/chartex" xmlns:cx2="http://schemas.microsoft.com/office/drawing/2015/10/21/chartex" xmlns:cx3="http://schemas.microsoft.com/office/drawing/2016/5/9/chartex" xmlns:cx4="http://schemas.microsoft.com/office/drawing/2016/5/10/chartex" xmlns:cx5="http://schemas.microsoft.com/office/drawing/2016/5/11/chartex" xmlns:cx6="http://schemas.microsoft.com/office/drawing/2016/5/12/chartex" xmlns:cx7="http://schemas.microsoft.com/office/drawing/2016/5/13/chartex" xmlns:cx8="http://schemas.microsoft.com/office/drawing/2016/5/14/chartex" xmlns:mc="http://schemas.openxmlformats.org/markup-compatibility/2006" xmlns:aink="http://schemas.microsoft.com/office/drawing/2016/ink" xmlns:am3d="http://schemas.microsoft.com/office/drawing/2017/model3d" xmlns:o="urn:schemas-microsoft-com:office:office" xmlns:oel="http://schemas.microsoft.com/office/2019/extlst" xmlns:r="http://schemas.openxmlformats.org/officeDocument/2006/relationships" xmlns:m="http://schemas.openxmlformats.org/officeDocument/2006/math" xmlns:v="urn:schemas-microsoft-com:vml" xmlns:wp14="http://schemas.microsoft.com/office/word/2010/wordprocessingDrawing" xmlns:wp="http://schemas.openxmlformats.org/drawingml/2006/wordprocessingDrawing" xmlns:w10="urn:schemas-microsoft-com:office:word" xmlns:w="http://schemas.openxmlformats.org/wordprocessingml/2006/main" xmlns:w14="http://schemas.microsoft.com/office/word/2010/wordml" xmlns:w15="http://schemas.microsoft.com/office/word/2012/wordml" xmlns:w16cex="http://schemas.microsoft.com/office/word/2018/wordml/cex" xmlns:w16cid="http://schemas.microsoft.com/office/word/2016/wordml/cid" xmlns:w16="http://schemas.microsoft.com/office/word/2018/wordml" xmlns:w16du="http://schemas.microsoft.com/office/word/2023/wordml/word16du" xmlns:w16sdtdh="http://schemas.microsoft.com/office/word/2020/wordml/sdtdatahash" xmlns:w16sdtfl="http://schemas.microsoft.com/office/word/2024/wordml/sdtformatlock" xmlns:w16se="http://schemas.microsoft.com/office/word/2015/wordml/symex" xmlns:wpg="http://schemas.microsoft.com/office/word/2010/wordprocessingGroup" xmlns:wpi="http://schemas.microsoft.com/office/word/2010/wordprocessingInk" xmlns:wne="http://schemas.microsoft.com/office/word/2006/wordml" xmlns:wps="http://schemas.microsoft.com/office/word/2010/wordprocessingShape" mc:Ignorable="w14 w15 w16se w16cid w16 w16cex w16sdtdh w16sdtfl w16du wp14">
+  <w:abstractNum w:abstractNumId="0" w15:restartNumberingAfterBreak="0">
+    <w:nsid w:val="239C4ACA"/>
+    <w:multiLevelType w:val="hybridMultilevel"/>
+    <w:tmpl w:val="FBB28B2C"/>
+    <w:lvl w:ilvl="0" w:tplc="7C7E6382">
+      <w:start w:val="1"/>
+      <w:numFmt w:val="bullet"/>
+      <w:lvlText w:val="•"/>
+      <w:lvlJc w:val="left"/>
+      <w:pPr>
+        <w:ind w:left="720" w:hanging="360"/>
+      </w:pPr>
+    </w:lvl>
+    <w:lvl w:ilvl="1" w:tplc="D5B8AF08">
+      <w:numFmt w:val="decimal"/>
+      <w:lvlText w:val=""/>
+      <w:lvlJc w:val="left"/>
+    </w:lvl>
+    <w:lvl w:ilvl="2" w:tplc="4F56F548">
+      <w:numFmt w:val="decimal"/>
+      <w:lvlText w:val=""/>
+      <w:lvlJc w:val="left"/>
+    </w:lvl>
+    <w:lvl w:ilvl="3" w:tplc="5F4C6248">
+      <w:numFmt w:val="decimal"/>
+      <w:lvlText w:val=""/>
+      <w:lvlJc w:val="left"/>
+    </w:lvl>
+    <w:lvl w:ilvl="4" w:tplc="E6641990">
+      <w:numFmt w:val="decimal"/>
+      <w:lvlText w:val=""/>
+      <w:lvlJc w:val="left"/>
+    </w:lvl>
+    <w:lvl w:ilvl="5" w:tplc="11ECEE94">
+      <w:numFmt w:val="decimal"/>
+      <w:lvlText w:val=""/>
+      <w:lvlJc w:val="left"/>
+    </w:lvl>
+    <w:lvl w:ilvl="6" w:tplc="4ECAF08C">
+      <w:numFmt w:val="decimal"/>
+      <w:lvlText w:val=""/>
+      <w:lvlJc w:val="left"/>
+    </w:lvl>
+    <w:lvl w:ilvl="7" w:tplc="F4201868">
+      <w:numFmt w:val="decimal"/>
+      <w:lvlText w:val=""/>
+      <w:lvlJc w:val="left"/>
+    </w:lvl>
+    <w:lvl w:ilvl="8" w:tplc="C3E227AA">
+      <w:numFmt w:val="decimal"/>
+      <w:lvlText w:val=""/>
+      <w:lvlJc w:val="left"/>
+    </w:lvl>
+  </w:abstractNum>
   <w:abstractNum w:abstractNumId="1" w15:restartNumberingAfterBreak="0">
+    <w:nsid w:val="798362CE"/>
     <w:multiLevelType w:val="hybridMultilevel"/>
-    <w:lvl w:ilvl="0" w15:tentative="1">
+    <w:tmpl w:val="D554A522"/>
+    <w:lvl w:ilvl="0" w:tplc="940874A6">
       <w:start w:val="1"/>
       <w:numFmt w:val="bullet"/>
       <w:lvlText w:val="●"/>
@@ -1830,7 +2551,7 @@
         <w:ind w:left="720" w:hanging="360"/>
       </w:pPr>
     </w:lvl>
-    <w:lvl w:ilvl="1" w15:tentative="1">
+    <w:lvl w:ilvl="1" w:tplc="60D65780">
       <w:start w:val="1"/>
       <w:numFmt w:val="bullet"/>
       <w:lvlText w:val="○"/>
@@ -1839,7 +2560,7 @@
         <w:ind w:left="1440" w:hanging="360"/>
       </w:pPr>
     </w:lvl>
-    <w:lvl w:ilvl="2" w15:tentative="1">
+    <w:lvl w:ilvl="2" w:tplc="5F189658">
       <w:start w:val="1"/>
       <w:numFmt w:val="bullet"/>
       <w:lvlText w:val="■"/>
@@ -1848,7 +2569,7 @@
         <w:ind w:left="2160" w:hanging="360"/>
       </w:pPr>
     </w:lvl>
-    <w:lvl w:ilvl="3" w15:tentative="1">
+    <w:lvl w:ilvl="3" w:tplc="25B6FB1E">
       <w:start w:val="1"/>
       <w:numFmt w:val="bullet"/>
       <w:lvlText w:val="●"/>
@@ -1857,7 +2578,7 @@
         <w:ind w:left="2880" w:hanging="360"/>
       </w:pPr>
     </w:lvl>
-    <w:lvl w:ilvl="4" w15:tentative="1">
+    <w:lvl w:ilvl="4" w:tplc="72E09946">
       <w:start w:val="1"/>
       <w:numFmt w:val="bullet"/>
       <w:lvlText w:val="○"/>
@@ -1866,7 +2587,7 @@
         <w:ind w:left="3600" w:hanging="360"/>
       </w:pPr>
     </w:lvl>
-    <w:lvl w:ilvl="5" w15:tentative="1">
+    <w:lvl w:ilvl="5" w:tplc="B4026334">
       <w:start w:val="1"/>
       <w:numFmt w:val="bullet"/>
       <w:lvlText w:val="■"/>
@@ -1875,7 +2596,7 @@
         <w:ind w:left="4320" w:hanging="360"/>
       </w:pPr>
     </w:lvl>
-    <w:lvl w:ilvl="6" w15:tentative="1">
+    <w:lvl w:ilvl="6" w:tplc="3EC0C8DC">
       <w:start w:val="1"/>
       <w:numFmt w:val="bullet"/>
       <w:lvlText w:val="●"/>
@@ -1884,7 +2605,7 @@
         <w:ind w:left="5040" w:hanging="360"/>
       </w:pPr>
     </w:lvl>
-    <w:lvl w:ilvl="7" w15:tentative="1">
+    <w:lvl w:ilvl="7" w:tplc="26A4CF84">
       <w:start w:val="1"/>
       <w:numFmt w:val="bullet"/>
       <w:lvlText w:val="●"/>
@@ -1893,7 +2614,7 @@
         <w:ind w:left="5760" w:hanging="360"/>
       </w:pPr>
     </w:lvl>
-    <w:lvl w:ilvl="8" w15:tentative="1">
+    <w:lvl w:ilvl="8" w:tplc="78DE3D9E">
       <w:start w:val="1"/>
       <w:numFmt w:val="bullet"/>
       <w:lvlText w:val="●"/>
@@ -1903,26 +2624,14 @@
       </w:pPr>
     </w:lvl>
   </w:abstractNum>
-  <w:abstractNum w:abstractNumId="2" w15:restartNumberingAfterBreak="0">
-    <w:multiLevelType w:val="hybridMultilevel"/>
-    <w:lvl w:ilvl="0" w15:tentative="1">
-      <w:start w:val="1"/>
-      <w:numFmt w:val="bullet"/>
-      <w:lvlText w:val="•"/>
-      <w:lvlJc w:val="left"/>
-      <w:pPr>
-        <w:ind w:left="720" w:hanging="360"/>
-      </w:pPr>
-    </w:lvl>
-  </w:abstractNum>
-  <w:num w:numId="1">
+  <w:num w:numId="1" w16cid:durableId="607810839">
     <w:abstractNumId w:val="1"/>
     <w:lvlOverride w:ilvl="0">
       <w:startOverride w:val="1"/>
     </w:lvlOverride>
   </w:num>
-  <w:num w:numId="2">
-    <w:abstractNumId w:val="2"/>
+  <w:num w:numId="2" w16cid:durableId="1901551504">
+    <w:abstractNumId w:val="0"/>
     <w:lvlOverride w:ilvl="0">
       <w:startOverride w:val="1"/>
     </w:lvlOverride>
@@ -1931,54 +2640,442 @@
 </file>
 
 <file path=word/styles.xml><?xml version="1.0" encoding="utf-8"?>
-<w:styles xmlns:mc="http://schemas.openxmlformats.org/markup-compatibility/2006" xmlns:r="http://schemas.openxmlformats.org/officeDocument/2006/relationships" xmlns:w="http://schemas.openxmlformats.org/wordprocessingml/2006/main" xmlns:w14="http://schemas.microsoft.com/office/word/2010/wordml" xmlns:w15="http://schemas.microsoft.com/office/word/2012/wordml" mc:Ignorable="w14 w15">
+<w:styles xmlns:mc="http://schemas.openxmlformats.org/markup-compatibility/2006" xmlns:r="http://schemas.openxmlformats.org/officeDocument/2006/relationships" xmlns:w="http://schemas.openxmlformats.org/wordprocessingml/2006/main" xmlns:w14="http://schemas.microsoft.com/office/word/2010/wordml" xmlns:w15="http://schemas.microsoft.com/office/word/2012/wordml" xmlns:w16cex="http://schemas.microsoft.com/office/word/2018/wordml/cex" xmlns:w16cid="http://schemas.microsoft.com/office/word/2016/wordml/cid" xmlns:w16="http://schemas.microsoft.com/office/word/2018/wordml" xmlns:w16du="http://schemas.microsoft.com/office/word/2023/wordml/word16du" xmlns:w16sdtdh="http://schemas.microsoft.com/office/word/2020/wordml/sdtdatahash" xmlns:w16sdtfl="http://schemas.microsoft.com/office/word/2024/wordml/sdtformatlock" xmlns:w16se="http://schemas.microsoft.com/office/word/2015/wordml/symex" mc:Ignorable="w14 w15 w16se w16cid w16 w16cex w16sdtdh w16sdtfl w16du">
   <w:docDefaults>
     <w:rPrDefault>
       <w:rPr>
-        <w:rFonts w:ascii="Arial" w:cs="Arial" w:eastAsia="Arial" w:hAnsi="Arial"/>
+        <w:rFonts w:ascii="Arial" w:eastAsia="Arial" w:hAnsi="Arial" w:cs="Arial"/>
         <w:sz w:val="22"/>
         <w:szCs w:val="22"/>
+        <w:lang w:val="en-US" w:eastAsia="en-US" w:bidi="ar-SA"/>
       </w:rPr>
     </w:rPrDefault>
     <w:pPrDefault/>
   </w:docDefaults>
-  <w:style w:type="paragraph" w:styleId="Title">
-    <w:name w:val="Title"/>
-    <w:basedOn w:val="Normal"/>
-    <w:next w:val="Normal"/>
+  <w:latentStyles w:defLockedState="0" w:defUIPriority="99" w:defSemiHidden="0" w:defUnhideWhenUsed="0" w:defQFormat="0" w:count="376">
+    <w:lsdException w:name="Normal" w:uiPriority="0" w:qFormat="1"/>
+    <w:lsdException w:name="heading 1" w:uiPriority="9" w:qFormat="1"/>
+    <w:lsdException w:name="heading 2" w:semiHidden="1" w:uiPriority="9" w:unhideWhenUsed="1" w:qFormat="1"/>
+    <w:lsdException w:name="heading 3" w:semiHidden="1" w:uiPriority="9" w:unhideWhenUsed="1" w:qFormat="1"/>
+    <w:lsdException w:name="heading 4" w:semiHidden="1" w:uiPriority="9" w:unhideWhenUsed="1" w:qFormat="1"/>
+    <w:lsdException w:name="heading 5" w:semiHidden="1" w:uiPriority="9" w:unhideWhenUsed="1" w:qFormat="1"/>
+    <w:lsdException w:name="heading 6" w:semiHidden="1" w:uiPriority="9" w:unhideWhenUsed="1" w:qFormat="1"/>
+    <w:lsdException w:name="heading 7" w:semiHidden="1" w:uiPriority="9" w:unhideWhenUsed="1" w:qFormat="1"/>
+    <w:lsdException w:name="heading 8" w:semiHidden="1" w:uiPriority="9" w:unhideWhenUsed="1" w:qFormat="1"/>
+    <w:lsdException w:name="heading 9" w:semiHidden="1" w:uiPriority="9" w:unhideWhenUsed="1" w:qFormat="1"/>
+    <w:lsdException w:name="index 1" w:semiHidden="1" w:unhideWhenUsed="1"/>
+    <w:lsdException w:name="index 2" w:semiHidden="1" w:unhideWhenUsed="1"/>
+    <w:lsdException w:name="index 3" w:semiHidden="1" w:unhideWhenUsed="1"/>
+    <w:lsdException w:name="index 4" w:semiHidden="1" w:unhideWhenUsed="1"/>
+    <w:lsdException w:name="index 5" w:semiHidden="1" w:unhideWhenUsed="1"/>
+    <w:lsdException w:name="index 6" w:semiHidden="1" w:unhideWhenUsed="1"/>
+    <w:lsdException w:name="index 7" w:semiHidden="1" w:unhideWhenUsed="1"/>
+    <w:lsdException w:name="index 8" w:semiHidden="1" w:unhideWhenUsed="1"/>
+    <w:lsdException w:name="index 9" w:semiHidden="1" w:unhideWhenUsed="1"/>
+    <w:lsdException w:name="toc 1" w:semiHidden="1" w:uiPriority="39" w:unhideWhenUsed="1"/>
+    <w:lsdException w:name="toc 2" w:semiHidden="1" w:uiPriority="39" w:unhideWhenUsed="1"/>
+    <w:lsdException w:name="toc 3" w:semiHidden="1" w:uiPriority="39" w:unhideWhenUsed="1"/>
+    <w:lsdException w:name="toc 4" w:semiHidden="1" w:uiPriority="39" w:unhideWhenUsed="1"/>
+    <w:lsdException w:name="toc 5" w:semiHidden="1" w:uiPriority="39" w:unhideWhenUsed="1"/>
+    <w:lsdException w:name="toc 6" w:semiHidden="1" w:uiPriority="39" w:unhideWhenUsed="1"/>
+    <w:lsdException w:name="toc 7" w:semiHidden="1" w:uiPriority="39" w:unhideWhenUsed="1"/>
+    <w:lsdException w:name="toc 8" w:semiHidden="1" w:uiPriority="39" w:unhideWhenUsed="1"/>
+    <w:lsdException w:name="toc 9" w:semiHidden="1" w:uiPriority="39" w:unhideWhenUsed="1"/>
+    <w:lsdException w:name="Normal Indent" w:semiHidden="1" w:unhideWhenUsed="1"/>
+    <w:lsdException w:name="footnote text" w:semiHidden="1" w:unhideWhenUsed="1"/>
+    <w:lsdException w:name="annotation text" w:semiHidden="1" w:unhideWhenUsed="1"/>
+    <w:lsdException w:name="header" w:semiHidden="1" w:unhideWhenUsed="1"/>
+    <w:lsdException w:name="footer" w:semiHidden="1" w:unhideWhenUsed="1"/>
+    <w:lsdException w:name="index heading" w:semiHidden="1" w:unhideWhenUsed="1"/>
+    <w:lsdException w:name="caption" w:semiHidden="1" w:uiPriority="35" w:unhideWhenUsed="1" w:qFormat="1"/>
+    <w:lsdException w:name="table of figures" w:semiHidden="1" w:unhideWhenUsed="1"/>
+    <w:lsdException w:name="envelope address" w:semiHidden="1" w:unhideWhenUsed="1"/>
+    <w:lsdException w:name="envelope return" w:semiHidden="1" w:unhideWhenUsed="1"/>
+    <w:lsdException w:name="footnote reference" w:semiHidden="1" w:unhideWhenUsed="1"/>
+    <w:lsdException w:name="annotation reference" w:semiHidden="1" w:unhideWhenUsed="1"/>
+    <w:lsdException w:name="line number" w:semiHidden="1" w:unhideWhenUsed="1"/>
+    <w:lsdException w:name="page number" w:semiHidden="1" w:unhideWhenUsed="1"/>
+    <w:lsdException w:name="endnote reference" w:semiHidden="1" w:unhideWhenUsed="1"/>
+    <w:lsdException w:name="endnote text" w:semiHidden="1" w:unhideWhenUsed="1"/>
+    <w:lsdException w:name="table of authorities" w:semiHidden="1" w:unhideWhenUsed="1"/>
+    <w:lsdException w:name="macro" w:semiHidden="1" w:unhideWhenUsed="1"/>
+    <w:lsdException w:name="toa heading" w:semiHidden="1" w:unhideWhenUsed="1"/>
+    <w:lsdException w:name="List" w:semiHidden="1" w:unhideWhenUsed="1"/>
+    <w:lsdException w:name="List Bullet" w:semiHidden="1" w:unhideWhenUsed="1"/>
+    <w:lsdException w:name="List Number" w:semiHidden="1" w:unhideWhenUsed="1"/>
+    <w:lsdException w:name="List 2" w:semiHidden="1" w:unhideWhenUsed="1"/>
+    <w:lsdException w:name="List 3" w:semiHidden="1" w:unhideWhenUsed="1"/>
+    <w:lsdException w:name="List 4" w:semiHidden="1" w:unhideWhenUsed="1"/>
+    <w:lsdException w:name="List 5" w:semiHidden="1" w:unhideWhenUsed="1"/>
+    <w:lsdException w:name="List Bullet 2" w:semiHidden="1" w:unhideWhenUsed="1"/>
+    <w:lsdException w:name="List Bullet 3" w:semiHidden="1" w:unhideWhenUsed="1"/>
+    <w:lsdException w:name="List Bullet 4" w:semiHidden="1" w:unhideWhenUsed="1"/>
+    <w:lsdException w:name="List Bullet 5" w:semiHidden="1" w:unhideWhenUsed="1"/>
+    <w:lsdException w:name="List Number 2" w:semiHidden="1" w:unhideWhenUsed="1"/>
+    <w:lsdException w:name="List Number 3" w:semiHidden="1" w:unhideWhenUsed="1"/>
+    <w:lsdException w:name="List Number 4" w:semiHidden="1" w:unhideWhenUsed="1"/>
+    <w:lsdException w:name="List Number 5" w:semiHidden="1" w:unhideWhenUsed="1"/>
+    <w:lsdException w:name="Title" w:uiPriority="10" w:qFormat="1"/>
+    <w:lsdException w:name="Closing" w:semiHidden="1" w:unhideWhenUsed="1"/>
+    <w:lsdException w:name="Signature" w:semiHidden="1" w:unhideWhenUsed="1"/>
+    <w:lsdException w:name="Default Paragraph Font" w:semiHidden="1" w:uiPriority="1" w:unhideWhenUsed="1"/>
+    <w:lsdException w:name="Body Text" w:semiHidden="1" w:unhideWhenUsed="1"/>
+    <w:lsdException w:name="Body Text Indent" w:semiHidden="1" w:unhideWhenUsed="1"/>
+    <w:lsdException w:name="List Continue" w:semiHidden="1" w:unhideWhenUsed="1"/>
+    <w:lsdException w:name="List Continue 2" w:semiHidden="1" w:unhideWhenUsed="1"/>
+    <w:lsdException w:name="List Continue 3" w:semiHidden="1" w:unhideWhenUsed="1"/>
+    <w:lsdException w:name="List Continue 4" w:semiHidden="1" w:unhideWhenUsed="1"/>
+    <w:lsdException w:name="List Continue 5" w:semiHidden="1" w:unhideWhenUsed="1"/>
+    <w:lsdException w:name="Message Header" w:semiHidden="1" w:unhideWhenUsed="1"/>
+    <w:lsdException w:name="Subtitle" w:uiPriority="11" w:qFormat="1"/>
+    <w:lsdException w:name="Salutation" w:semiHidden="1" w:unhideWhenUsed="1"/>
+    <w:lsdException w:name="Date" w:semiHidden="1" w:unhideWhenUsed="1"/>
+    <w:lsdException w:name="Body Text First Indent" w:semiHidden="1" w:unhideWhenUsed="1"/>
+    <w:lsdException w:name="Body Text First Indent 2" w:semiHidden="1" w:unhideWhenUsed="1"/>
+    <w:lsdException w:name="Note Heading" w:semiHidden="1" w:unhideWhenUsed="1"/>
+    <w:lsdException w:name="Body Text 2" w:semiHidden="1" w:unhideWhenUsed="1"/>
+    <w:lsdException w:name="Body Text 3" w:semiHidden="1" w:unhideWhenUsed="1"/>
+    <w:lsdException w:name="Body Text Indent 2" w:semiHidden="1" w:unhideWhenUsed="1"/>
+    <w:lsdException w:name="Body Text Indent 3" w:semiHidden="1" w:unhideWhenUsed="1"/>
+    <w:lsdException w:name="Block Text" w:semiHidden="1" w:unhideWhenUsed="1"/>
+    <w:lsdException w:name="Hyperlink" w:semiHidden="1" w:unhideWhenUsed="1"/>
+    <w:lsdException w:name="FollowedHyperlink" w:semiHidden="1" w:unhideWhenUsed="1"/>
+    <w:lsdException w:name="Strong" w:uiPriority="22" w:qFormat="1"/>
+    <w:lsdException w:name="Emphasis" w:uiPriority="20" w:qFormat="1"/>
+    <w:lsdException w:name="Document Map" w:semiHidden="1" w:unhideWhenUsed="1"/>
+    <w:lsdException w:name="Plain Text" w:semiHidden="1" w:unhideWhenUsed="1"/>
+    <w:lsdException w:name="E-mail Signature" w:semiHidden="1" w:unhideWhenUsed="1"/>
+    <w:lsdException w:name="HTML Top of Form" w:semiHidden="1" w:unhideWhenUsed="1"/>
+    <w:lsdException w:name="HTML Bottom of Form" w:semiHidden="1" w:unhideWhenUsed="1"/>
+    <w:lsdException w:name="Normal (Web)" w:semiHidden="1" w:unhideWhenUsed="1"/>
+    <w:lsdException w:name="HTML Acronym" w:semiHidden="1" w:unhideWhenUsed="1"/>
+    <w:lsdException w:name="HTML Address" w:semiHidden="1" w:unhideWhenUsed="1"/>
+    <w:lsdException w:name="HTML Cite" w:semiHidden="1" w:unhideWhenUsed="1"/>
+    <w:lsdException w:name="HTML Code" w:semiHidden="1" w:unhideWhenUsed="1"/>
+    <w:lsdException w:name="HTML Definition" w:semiHidden="1" w:unhideWhenUsed="1"/>
+    <w:lsdException w:name="HTML Keyboard" w:semiHidden="1" w:unhideWhenUsed="1"/>
+    <w:lsdException w:name="HTML Preformatted" w:semiHidden="1" w:unhideWhenUsed="1"/>
+    <w:lsdException w:name="HTML Sample" w:semiHidden="1" w:unhideWhenUsed="1"/>
+    <w:lsdException w:name="HTML Typewriter" w:semiHidden="1" w:unhideWhenUsed="1"/>
+    <w:lsdException w:name="HTML Variable" w:semiHidden="1" w:unhideWhenUsed="1"/>
+    <w:lsdException w:name="Normal Table" w:semiHidden="1" w:unhideWhenUsed="1"/>
+    <w:lsdException w:name="annotation subject" w:semiHidden="1" w:unhideWhenUsed="1"/>
+    <w:lsdException w:name="No List" w:semiHidden="1" w:unhideWhenUsed="1"/>
+    <w:lsdException w:name="Outline List 1" w:semiHidden="1" w:unhideWhenUsed="1"/>
+    <w:lsdException w:name="Outline List 2" w:semiHidden="1" w:unhideWhenUsed="1"/>
+    <w:lsdException w:name="Outline List 3" w:semiHidden="1" w:unhideWhenUsed="1"/>
+    <w:lsdException w:name="Table Simple 1" w:semiHidden="1" w:unhideWhenUsed="1"/>
+    <w:lsdException w:name="Table Simple 2" w:semiHidden="1" w:unhideWhenUsed="1"/>
+    <w:lsdException w:name="Table Simple 3" w:semiHidden="1" w:unhideWhenUsed="1"/>
+    <w:lsdException w:name="Table Classic 1" w:semiHidden="1" w:unhideWhenUsed="1"/>
+    <w:lsdException w:name="Table Classic 2" w:semiHidden="1" w:unhideWhenUsed="1"/>
+    <w:lsdException w:name="Table Classic 3" w:semiHidden="1" w:unhideWhenUsed="1"/>
+    <w:lsdException w:name="Table Classic 4" w:semiHidden="1" w:unhideWhenUsed="1"/>
+    <w:lsdException w:name="Table Colorful 1" w:semiHidden="1" w:unhideWhenUsed="1"/>
+    <w:lsdException w:name="Table Colorful 2" w:semiHidden="1" w:unhideWhenUsed="1"/>
+    <w:lsdException w:name="Table Colorful 3" w:semiHidden="1" w:unhideWhenUsed="1"/>
+    <w:lsdException w:name="Table Columns 1" w:semiHidden="1" w:unhideWhenUsed="1"/>
+    <w:lsdException w:name="Table Columns 2" w:semiHidden="1" w:unhideWhenUsed="1"/>
+    <w:lsdException w:name="Table Columns 3" w:semiHidden="1" w:unhideWhenUsed="1"/>
+    <w:lsdException w:name="Table Columns 4" w:semiHidden="1" w:unhideWhenUsed="1"/>
+    <w:lsdException w:name="Table Columns 5" w:semiHidden="1" w:unhideWhenUsed="1"/>
+    <w:lsdException w:name="Table Grid 1" w:semiHidden="1" w:unhideWhenUsed="1"/>
+    <w:lsdException w:name="Table Grid 2" w:semiHidden="1" w:unhideWhenUsed="1"/>
+    <w:lsdException w:name="Table Grid 3" w:semiHidden="1" w:unhideWhenUsed="1"/>
+    <w:lsdException w:name="Table Grid 4" w:semiHidden="1" w:unhideWhenUsed="1"/>
+    <w:lsdException w:name="Table Grid 5" w:semiHidden="1" w:unhideWhenUsed="1"/>
+    <w:lsdException w:name="Table Grid 6" w:semiHidden="1" w:unhideWhenUsed="1"/>
+    <w:lsdException w:name="Table Grid 7" w:semiHidden="1" w:unhideWhenUsed="1"/>
+    <w:lsdException w:name="Table Grid 8" w:semiHidden="1" w:unhideWhenUsed="1"/>
+    <w:lsdException w:name="Table List 1" w:semiHidden="1" w:unhideWhenUsed="1"/>
+    <w:lsdException w:name="Table List 2" w:semiHidden="1" w:unhideWhenUsed="1"/>
+    <w:lsdException w:name="Table List 3" w:semiHidden="1" w:unhideWhenUsed="1"/>
+    <w:lsdException w:name="Table List 4" w:semiHidden="1" w:unhideWhenUsed="1"/>
+    <w:lsdException w:name="Table List 5" w:semiHidden="1" w:unhideWhenUsed="1"/>
+    <w:lsdException w:name="Table List 6" w:semiHidden="1" w:unhideWhenUsed="1"/>
+    <w:lsdException w:name="Table List 7" w:semiHidden="1" w:unhideWhenUsed="1"/>
+    <w:lsdException w:name="Table List 8" w:semiHidden="1" w:unhideWhenUsed="1"/>
+    <w:lsdException w:name="Table 3D effects 1" w:semiHidden="1" w:unhideWhenUsed="1"/>
+    <w:lsdException w:name="Table 3D effects 2" w:semiHidden="1" w:unhideWhenUsed="1"/>
+    <w:lsdException w:name="Table 3D effects 3" w:semiHidden="1" w:unhideWhenUsed="1"/>
+    <w:lsdException w:name="Table Contemporary" w:semiHidden="1" w:unhideWhenUsed="1"/>
+    <w:lsdException w:name="Table Elegant" w:semiHidden="1" w:unhideWhenUsed="1"/>
+    <w:lsdException w:name="Table Professional" w:semiHidden="1" w:unhideWhenUsed="1"/>
+    <w:lsdException w:name="Table Subtle 1" w:semiHidden="1" w:unhideWhenUsed="1"/>
+    <w:lsdException w:name="Table Subtle 2" w:semiHidden="1" w:unhideWhenUsed="1"/>
+    <w:lsdException w:name="Table Web 1" w:semiHidden="1" w:unhideWhenUsed="1"/>
+    <w:lsdException w:name="Table Web 2" w:semiHidden="1" w:unhideWhenUsed="1"/>
+    <w:lsdException w:name="Table Web 3" w:semiHidden="1" w:unhideWhenUsed="1"/>
+    <w:lsdException w:name="Balloon Text" w:semiHidden="1" w:unhideWhenUsed="1"/>
+    <w:lsdException w:name="Table Grid" w:uiPriority="39"/>
+    <w:lsdException w:name="Table Theme" w:semiHidden="1" w:unhideWhenUsed="1"/>
+    <w:lsdException w:name="Placeholder Text" w:semiHidden="1"/>
+    <w:lsdException w:name="No Spacing" w:uiPriority="1" w:qFormat="1"/>
+    <w:lsdException w:name="Light Shading" w:uiPriority="60"/>
+    <w:lsdException w:name="Light List" w:uiPriority="61"/>
+    <w:lsdException w:name="Light Grid" w:uiPriority="62"/>
+    <w:lsdException w:name="Medium Shading 1" w:uiPriority="63"/>
+    <w:lsdException w:name="Medium Shading 2" w:uiPriority="64"/>
+    <w:lsdException w:name="Medium List 1" w:uiPriority="65"/>
+    <w:lsdException w:name="Medium List 2" w:uiPriority="66"/>
+    <w:lsdException w:name="Medium Grid 1" w:uiPriority="67"/>
+    <w:lsdException w:name="Medium Grid 2" w:uiPriority="68"/>
+    <w:lsdException w:name="Medium Grid 3" w:uiPriority="69"/>
+    <w:lsdException w:name="Dark List" w:uiPriority="70"/>
+    <w:lsdException w:name="Colorful Shading" w:uiPriority="71"/>
+    <w:lsdException w:name="Colorful List" w:uiPriority="72"/>
+    <w:lsdException w:name="Colorful Grid" w:uiPriority="73"/>
+    <w:lsdException w:name="Light Shading Accent 1" w:uiPriority="60"/>
+    <w:lsdException w:name="Light List Accent 1" w:uiPriority="61"/>
+    <w:lsdException w:name="Light Grid Accent 1" w:uiPriority="62"/>
+    <w:lsdException w:name="Medium Shading 1 Accent 1" w:uiPriority="63"/>
+    <w:lsdException w:name="Medium Shading 2 Accent 1" w:uiPriority="64"/>
+    <w:lsdException w:name="Medium List 1 Accent 1" w:uiPriority="65"/>
+    <w:lsdException w:name="Revision" w:semiHidden="1"/>
+    <w:lsdException w:name="List Paragraph" w:uiPriority="34" w:qFormat="1"/>
+    <w:lsdException w:name="Quote" w:uiPriority="29" w:qFormat="1"/>
+    <w:lsdException w:name="Intense Quote" w:uiPriority="30" w:qFormat="1"/>
+    <w:lsdException w:name="Medium List 2 Accent 1" w:uiPriority="66"/>
+    <w:lsdException w:name="Medium Grid 1 Accent 1" w:uiPriority="67"/>
+    <w:lsdException w:name="Medium Grid 2 Accent 1" w:uiPriority="68"/>
+    <w:lsdException w:name="Medium Grid 3 Accent 1" w:uiPriority="69"/>
+    <w:lsdException w:name="Dark List Accent 1" w:uiPriority="70"/>
+    <w:lsdException w:name="Colorful Shading Accent 1" w:uiPriority="71"/>
+    <w:lsdException w:name="Colorful List Accent 1" w:uiPriority="72"/>
+    <w:lsdException w:name="Colorful Grid Accent 1" w:uiPriority="73"/>
+    <w:lsdException w:name="Light Shading Accent 2" w:uiPriority="60"/>
+    <w:lsdException w:name="Light List Accent 2" w:uiPriority="61"/>
+    <w:lsdException w:name="Light Grid Accent 2" w:uiPriority="62"/>
+    <w:lsdException w:name="Medium Shading 1 Accent 2" w:uiPriority="63"/>
+    <w:lsdException w:name="Medium Shading 2 Accent 2" w:uiPriority="64"/>
+    <w:lsdException w:name="Medium List 1 Accent 2" w:uiPriority="65"/>
+    <w:lsdException w:name="Medium List 2 Accent 2" w:uiPriority="66"/>
+    <w:lsdException w:name="Medium Grid 1 Accent 2" w:uiPriority="67"/>
+    <w:lsdException w:name="Medium Grid 2 Accent 2" w:uiPriority="68"/>
+    <w:lsdException w:name="Medium Grid 3 Accent 2" w:uiPriority="69"/>
+    <w:lsdException w:name="Dark List Accent 2" w:uiPriority="70"/>
+    <w:lsdException w:name="Colorful Shading Accent 2" w:uiPriority="71"/>
+    <w:lsdException w:name="Colorful List Accent 2" w:uiPriority="72"/>
+    <w:lsdException w:name="Colorful Grid Accent 2" w:uiPriority="73"/>
+    <w:lsdException w:name="Light Shading Accent 3" w:uiPriority="60"/>
+    <w:lsdException w:name="Light List Accent 3" w:uiPriority="61"/>
+    <w:lsdException w:name="Light Grid Accent 3" w:uiPriority="62"/>
+    <w:lsdException w:name="Medium Shading 1 Accent 3" w:uiPriority="63"/>
+    <w:lsdException w:name="Medium Shading 2 Accent 3" w:uiPriority="64"/>
+    <w:lsdException w:name="Medium List 1 Accent 3" w:uiPriority="65"/>
+    <w:lsdException w:name="Medium List 2 Accent 3" w:uiPriority="66"/>
+    <w:lsdException w:name="Medium Grid 1 Accent 3" w:uiPriority="67"/>
+    <w:lsdException w:name="Medium Grid 2 Accent 3" w:uiPriority="68"/>
+    <w:lsdException w:name="Medium Grid 3 Accent 3" w:uiPriority="69"/>
+    <w:lsdException w:name="Dark List Accent 3" w:uiPriority="70"/>
+    <w:lsdException w:name="Colorful Shading Accent 3" w:uiPriority="71"/>
+    <w:lsdException w:name="Colorful List Accent 3" w:uiPriority="72"/>
+    <w:lsdException w:name="Colorful Grid Accent 3" w:uiPriority="73"/>
+    <w:lsdException w:name="Light Shading Accent 4" w:uiPriority="60"/>
+    <w:lsdException w:name="Light List Accent 4" w:uiPriority="61"/>
+    <w:lsdException w:name="Light Grid Accent 4" w:uiPriority="62"/>
+    <w:lsdException w:name="Medium Shading 1 Accent 4" w:uiPriority="63"/>
+    <w:lsdException w:name="Medium Shading 2 Accent 4" w:uiPriority="64"/>
+    <w:lsdException w:name="Medium List 1 Accent 4" w:uiPriority="65"/>
+    <w:lsdException w:name="Medium List 2 Accent 4" w:uiPriority="66"/>
+    <w:lsdException w:name="Medium Grid 1 Accent 4" w:uiPriority="67"/>
+    <w:lsdException w:name="Medium Grid 2 Accent 4" w:uiPriority="68"/>
+    <w:lsdException w:name="Medium Grid 3 Accent 4" w:uiPriority="69"/>
+    <w:lsdException w:name="Dark List Accent 4" w:uiPriority="70"/>
+    <w:lsdException w:name="Colorful Shading Accent 4" w:uiPriority="71"/>
+    <w:lsdException w:name="Colorful List Accent 4" w:uiPriority="72"/>
+    <w:lsdException w:name="Colorful Grid Accent 4" w:uiPriority="73"/>
+    <w:lsdException w:name="Light Shading Accent 5" w:uiPriority="60"/>
+    <w:lsdException w:name="Light List Accent 5" w:uiPriority="61"/>
+    <w:lsdException w:name="Light Grid Accent 5" w:uiPriority="62"/>
+    <w:lsdException w:name="Medium Shading 1 Accent 5" w:uiPriority="63"/>
+    <w:lsdException w:name="Medium Shading 2 Accent 5" w:uiPriority="64"/>
+    <w:lsdException w:name="Medium List 1 Accent 5" w:uiPriority="65"/>
+    <w:lsdException w:name="Medium List 2 Accent 5" w:uiPriority="66"/>
+    <w:lsdException w:name="Medium Grid 1 Accent 5" w:uiPriority="67"/>
+    <w:lsdException w:name="Medium Grid 2 Accent 5" w:uiPriority="68"/>
+    <w:lsdException w:name="Medium Grid 3 Accent 5" w:uiPriority="69"/>
+    <w:lsdException w:name="Dark List Accent 5" w:uiPriority="70"/>
+    <w:lsdException w:name="Colorful Shading Accent 5" w:uiPriority="71"/>
+    <w:lsdException w:name="Colorful List Accent 5" w:uiPriority="72"/>
+    <w:lsdException w:name="Colorful Grid Accent 5" w:uiPriority="73"/>
+    <w:lsdException w:name="Light Shading Accent 6" w:uiPriority="60"/>
+    <w:lsdException w:name="Light List Accent 6" w:uiPriority="61"/>
+    <w:lsdException w:name="Light Grid Accent 6" w:uiPriority="62"/>
+    <w:lsdException w:name="Medium Shading 1 Accent 6" w:uiPriority="63"/>
+    <w:lsdException w:name="Medium Shading 2 Accent 6" w:uiPriority="64"/>
+    <w:lsdException w:name="Medium List 1 Accent 6" w:uiPriority="65"/>
+    <w:lsdException w:name="Medium List 2 Accent 6" w:uiPriority="66"/>
+    <w:lsdException w:name="Medium Grid 1 Accent 6" w:uiPriority="67"/>
+    <w:lsdException w:name="Medium Grid 2 Accent 6" w:uiPriority="68"/>
+    <w:lsdException w:name="Medium Grid 3 Accent 6" w:uiPriority="69"/>
+    <w:lsdException w:name="Dark List Accent 6" w:uiPriority="70"/>
+    <w:lsdException w:name="Colorful Shading Accent 6" w:uiPriority="71"/>
+    <w:lsdException w:name="Colorful List Accent 6" w:uiPriority="72"/>
+    <w:lsdException w:name="Colorful Grid Accent 6" w:uiPriority="73"/>
+    <w:lsdException w:name="Subtle Emphasis" w:uiPriority="19" w:qFormat="1"/>
+    <w:lsdException w:name="Intense Emphasis" w:uiPriority="21" w:qFormat="1"/>
+    <w:lsdException w:name="Subtle Reference" w:uiPriority="31" w:qFormat="1"/>
+    <w:lsdException w:name="Intense Reference" w:uiPriority="32" w:qFormat="1"/>
+    <w:lsdException w:name="Book Title" w:uiPriority="33" w:qFormat="1"/>
+    <w:lsdException w:name="Bibliography" w:semiHidden="1" w:uiPriority="37" w:unhideWhenUsed="1"/>
+    <w:lsdException w:name="TOC Heading" w:semiHidden="1" w:uiPriority="39" w:unhideWhenUsed="1" w:qFormat="1"/>
+    <w:lsdException w:name="Plain Table 1" w:uiPriority="41"/>
+    <w:lsdException w:name="Plain Table 2" w:uiPriority="42"/>
+    <w:lsdException w:name="Plain Table 3" w:uiPriority="43"/>
+    <w:lsdException w:name="Plain Table 4" w:uiPriority="44"/>
+    <w:lsdException w:name="Plain Table 5" w:uiPriority="45"/>
+    <w:lsdException w:name="Grid Table Light" w:uiPriority="40"/>
+    <w:lsdException w:name="Grid Table 1 Light" w:uiPriority="46"/>
+    <w:lsdException w:name="Grid Table 2" w:uiPriority="47"/>
+    <w:lsdException w:name="Grid Table 3" w:uiPriority="48"/>
+    <w:lsdException w:name="Grid Table 4" w:uiPriority="49"/>
+    <w:lsdException w:name="Grid Table 5 Dark" w:uiPriority="50"/>
+    <w:lsdException w:name="Grid Table 6 Colorful" w:uiPriority="51"/>
+    <w:lsdException w:name="Grid Table 7 Colorful" w:uiPriority="52"/>
+    <w:lsdException w:name="Grid Table 1 Light Accent 1" w:uiPriority="46"/>
+    <w:lsdException w:name="Grid Table 2 Accent 1" w:uiPriority="47"/>
+    <w:lsdException w:name="Grid Table 3 Accent 1" w:uiPriority="48"/>
+    <w:lsdException w:name="Grid Table 4 Accent 1" w:uiPriority="49"/>
+    <w:lsdException w:name="Grid Table 5 Dark Accent 1" w:uiPriority="50"/>
+    <w:lsdException w:name="Grid Table 6 Colorful Accent 1" w:uiPriority="51"/>
+    <w:lsdException w:name="Grid Table 7 Colorful Accent 1" w:uiPriority="52"/>
+    <w:lsdException w:name="Grid Table 1 Light Accent 2" w:uiPriority="46"/>
+    <w:lsdException w:name="Grid Table 2 Accent 2" w:uiPriority="47"/>
+    <w:lsdException w:name="Grid Table 3 Accent 2" w:uiPriority="48"/>
+    <w:lsdException w:name="Grid Table 4 Accent 2" w:uiPriority="49"/>
+    <w:lsdException w:name="Grid Table 5 Dark Accent 2" w:uiPriority="50"/>
+    <w:lsdException w:name="Grid Table 6 Colorful Accent 2" w:uiPriority="51"/>
+    <w:lsdException w:name="Grid Table 7 Colorful Accent 2" w:uiPriority="52"/>
+    <w:lsdException w:name="Grid Table 1 Light Accent 3" w:uiPriority="46"/>
+    <w:lsdException w:name="Grid Table 2 Accent 3" w:uiPriority="47"/>
+    <w:lsdException w:name="Grid Table 3 Accent 3" w:uiPriority="48"/>
+    <w:lsdException w:name="Grid Table 4 Accent 3" w:uiPriority="49"/>
+    <w:lsdException w:name="Grid Table 5 Dark Accent 3" w:uiPriority="50"/>
+    <w:lsdException w:name="Grid Table 6 Colorful Accent 3" w:uiPriority="51"/>
+    <w:lsdException w:name="Grid Table 7 Colorful Accent 3" w:uiPriority="52"/>
+    <w:lsdException w:name="Grid Table 1 Light Accent 4" w:uiPriority="46"/>
+    <w:lsdException w:name="Grid Table 2 Accent 4" w:uiPriority="47"/>
+    <w:lsdException w:name="Grid Table 3 Accent 4" w:uiPriority="48"/>
+    <w:lsdException w:name="Grid Table 4 Accent 4" w:uiPriority="49"/>
+    <w:lsdException w:name="Grid Table 5 Dark Accent 4" w:uiPriority="50"/>
+    <w:lsdException w:name="Grid Table 6 Colorful Accent 4" w:uiPriority="51"/>
+    <w:lsdException w:name="Grid Table 7 Colorful Accent 4" w:uiPriority="52"/>
+    <w:lsdException w:name="Grid Table 1 Light Accent 5" w:uiPriority="46"/>
+    <w:lsdException w:name="Grid Table 2 Accent 5" w:uiPriority="47"/>
+    <w:lsdException w:name="Grid Table 3 Accent 5" w:uiPriority="48"/>
+    <w:lsdException w:name="Grid Table 4 Accent 5" w:uiPriority="49"/>
+    <w:lsdException w:name="Grid Table 5 Dark Accent 5" w:uiPriority="50"/>
+    <w:lsdException w:name="Grid Table 6 Colorful Accent 5" w:uiPriority="51"/>
+    <w:lsdException w:name="Grid Table 7 Colorful Accent 5" w:uiPriority="52"/>
+    <w:lsdException w:name="Grid Table 1 Light Accent 6" w:uiPriority="46"/>
+    <w:lsdException w:name="Grid Table 2 Accent 6" w:uiPriority="47"/>
+    <w:lsdException w:name="Grid Table 3 Accent 6" w:uiPriority="48"/>
+    <w:lsdException w:name="Grid Table 4 Accent 6" w:uiPriority="49"/>
+    <w:lsdException w:name="Grid Table 5 Dark Accent 6" w:uiPriority="50"/>
+    <w:lsdException w:name="Grid Table 6 Colorful Accent 6" w:uiPriority="51"/>
+    <w:lsdException w:name="Grid Table 7 Colorful Accent 6" w:uiPriority="52"/>
+    <w:lsdException w:name="List Table 1 Light" w:uiPriority="46"/>
+    <w:lsdException w:name="List Table 2" w:uiPriority="47"/>
+    <w:lsdException w:name="List Table 3" w:uiPriority="48"/>
+    <w:lsdException w:name="List Table 4" w:uiPriority="49"/>
+    <w:lsdException w:name="List Table 5 Dark" w:uiPriority="50"/>
+    <w:lsdException w:name="List Table 6 Colorful" w:uiPriority="51"/>
+    <w:lsdException w:name="List Table 7 Colorful" w:uiPriority="52"/>
+    <w:lsdException w:name="List Table 1 Light Accent 1" w:uiPriority="46"/>
+    <w:lsdException w:name="List Table 2 Accent 1" w:uiPriority="47"/>
+    <w:lsdException w:name="List Table 3 Accent 1" w:uiPriority="48"/>
+    <w:lsdException w:name="List Table 4 Accent 1" w:uiPriority="49"/>
+    <w:lsdException w:name="List Table 5 Dark Accent 1" w:uiPriority="50"/>
+    <w:lsdException w:name="List Table 6 Colorful Accent 1" w:uiPriority="51"/>
+    <w:lsdException w:name="List Table 7 Colorful Accent 1" w:uiPriority="52"/>
+    <w:lsdException w:name="List Table 1 Light Accent 2" w:uiPriority="46"/>
+    <w:lsdException w:name="List Table 2 Accent 2" w:uiPriority="47"/>
+    <w:lsdException w:name="List Table 3 Accent 2" w:uiPriority="48"/>
+    <w:lsdException w:name="List Table 4 Accent 2" w:uiPriority="49"/>
+    <w:lsdException w:name="List Table 5 Dark Accent 2" w:uiPriority="50"/>
+    <w:lsdException w:name="List Table 6 Colorful Accent 2" w:uiPriority="51"/>
+    <w:lsdException w:name="List Table 7 Colorful Accent 2" w:uiPriority="52"/>
+    <w:lsdException w:name="List Table 1 Light Accent 3" w:uiPriority="46"/>
+    <w:lsdException w:name="List Table 2 Accent 3" w:uiPriority="47"/>
+    <w:lsdException w:name="List Table 3 Accent 3" w:uiPriority="48"/>
+    <w:lsdException w:name="List Table 4 Accent 3" w:uiPriority="49"/>
+    <w:lsdException w:name="List Table 5 Dark Accent 3" w:uiPriority="50"/>
+    <w:lsdException w:name="List Table 6 Colorful Accent 3" w:uiPriority="51"/>
+    <w:lsdException w:name="List Table 7 Colorful Accent 3" w:uiPriority="52"/>
+    <w:lsdException w:name="List Table 1 Light Accent 4" w:uiPriority="46"/>
+    <w:lsdException w:name="List Table 2 Accent 4" w:uiPriority="47"/>
+    <w:lsdException w:name="List Table 3 Accent 4" w:uiPriority="48"/>
+    <w:lsdException w:name="List Table 4 Accent 4" w:uiPriority="49"/>
+    <w:lsdException w:name="List Table 5 Dark Accent 4" w:uiPriority="50"/>
+    <w:lsdException w:name="List Table 6 Colorful Accent 4" w:uiPriority="51"/>
+    <w:lsdException w:name="List Table 7 Colorful Accent 4" w:uiPriority="52"/>
+    <w:lsdException w:name="List Table 1 Light Accent 5" w:uiPriority="46"/>
+    <w:lsdException w:name="List Table 2 Accent 5" w:uiPriority="47"/>
+    <w:lsdException w:name="List Table 3 Accent 5" w:uiPriority="48"/>
+    <w:lsdException w:name="List Table 4 Accent 5" w:uiPriority="49"/>
+    <w:lsdException w:name="List Table 5 Dark Accent 5" w:uiPriority="50"/>
+    <w:lsdException w:name="List Table 6 Colorful Accent 5" w:uiPriority="51"/>
+    <w:lsdException w:name="List Table 7 Colorful Accent 5" w:uiPriority="52"/>
+    <w:lsdException w:name="List Table 1 Light Accent 6" w:uiPriority="46"/>
+    <w:lsdException w:name="List Table 2 Accent 6" w:uiPriority="47"/>
+    <w:lsdException w:name="List Table 3 Accent 6" w:uiPriority="48"/>
+    <w:lsdException w:name="List Table 4 Accent 6" w:uiPriority="49"/>
+    <w:lsdException w:name="List Table 5 Dark Accent 6" w:uiPriority="50"/>
+    <w:lsdException w:name="List Table 6 Colorful Accent 6" w:uiPriority="51"/>
+    <w:lsdException w:name="List Table 7 Colorful Accent 6" w:uiPriority="52"/>
+    <w:lsdException w:name="Mention" w:semiHidden="1" w:unhideWhenUsed="1"/>
+    <w:lsdException w:name="Smart Hyperlink" w:semiHidden="1" w:unhideWhenUsed="1"/>
+    <w:lsdException w:name="Hashtag" w:semiHidden="1" w:unhideWhenUsed="1"/>
+    <w:lsdException w:name="Unresolved Mention" w:semiHidden="1" w:unhideWhenUsed="1"/>
+    <w:lsdException w:name="Smart Link" w:semiHidden="1" w:unhideWhenUsed="1"/>
+  </w:latentStyles>
+  <w:style w:type="paragraph" w:default="1" w:styleId="Normal">
+    <w:name w:val="Normal"/>
     <w:qFormat/>
-    <w:rPr>
-      <w:sz w:val="56"/>
-      <w:szCs w:val="56"/>
-    </w:rPr>
   </w:style>
   <w:style w:type="paragraph" w:styleId="Heading1">
-    <w:name w:val="Heading 1"/>
-    <w:basedOn w:val="Normal"/>
-    <w:next w:val="Normal"/>
+    <w:name w:val="heading 1"/>
+    <w:uiPriority w:val="9"/>
     <w:qFormat/>
+    <w:pPr>
+      <w:spacing w:before="300" w:after="200"/>
+      <w:outlineLvl w:val="0"/>
+    </w:pPr>
     <w:rPr>
-      <w:color w:val="2E74B5"/>
-      <w:sz w:val="32"/>
-      <w:szCs w:val="32"/>
+      <w:b/>
+      <w:bCs/>
+      <w:color w:val="1F4E79"/>
+      <w:sz w:val="30"/>
+      <w:szCs w:val="30"/>
     </w:rPr>
   </w:style>
   <w:style w:type="paragraph" w:styleId="Heading2">
-    <w:name w:val="Heading 2"/>
-    <w:basedOn w:val="Normal"/>
-    <w:next w:val="Normal"/>
+    <w:name w:val="heading 2"/>
+    <w:uiPriority w:val="9"/>
+    <w:unhideWhenUsed/>
     <w:qFormat/>
+    <w:pPr>
+      <w:spacing w:before="220" w:after="140"/>
+      <w:outlineLvl w:val="1"/>
+    </w:pPr>
     <w:rPr>
-      <w:color w:val="2E74B5"/>
-      <w:sz w:val="26"/>
-      <w:szCs w:val="26"/>
+      <w:b/>
+      <w:bCs/>
+      <w:color w:val="2E75B6"/>
+      <w:sz w:val="25"/>
+      <w:szCs w:val="25"/>
     </w:rPr>
   </w:style>
   <w:style w:type="paragraph" w:styleId="Heading3">
-    <w:name w:val="Heading 3"/>
-    <w:basedOn w:val="Normal"/>
-    <w:next w:val="Normal"/>
+    <w:name w:val="heading 3"/>
+    <w:uiPriority w:val="9"/>
+    <w:semiHidden/>
+    <w:unhideWhenUsed/>
     <w:qFormat/>
+    <w:pPr>
+      <w:outlineLvl w:val="2"/>
+    </w:pPr>
     <w:rPr>
       <w:color w:val="1F4D78"/>
       <w:sz w:val="24"/>
@@ -1986,10 +3083,14 @@
     </w:rPr>
   </w:style>
   <w:style w:type="paragraph" w:styleId="Heading4">
-    <w:name w:val="Heading 4"/>
-    <w:basedOn w:val="Normal"/>
-    <w:next w:val="Normal"/>
+    <w:name w:val="heading 4"/>
+    <w:uiPriority w:val="9"/>
+    <w:semiHidden/>
+    <w:unhideWhenUsed/>
     <w:qFormat/>
+    <w:pPr>
+      <w:outlineLvl w:val="3"/>
+    </w:pPr>
     <w:rPr>
       <w:i/>
       <w:iCs/>
@@ -1997,27 +3098,69 @@
     </w:rPr>
   </w:style>
   <w:style w:type="paragraph" w:styleId="Heading5">
-    <w:name w:val="Heading 5"/>
-    <w:basedOn w:val="Normal"/>
-    <w:next w:val="Normal"/>
+    <w:name w:val="heading 5"/>
+    <w:uiPriority w:val="9"/>
+    <w:semiHidden/>
+    <w:unhideWhenUsed/>
     <w:qFormat/>
+    <w:pPr>
+      <w:outlineLvl w:val="4"/>
+    </w:pPr>
     <w:rPr>
       <w:color w:val="2E74B5"/>
     </w:rPr>
   </w:style>
   <w:style w:type="paragraph" w:styleId="Heading6">
-    <w:name w:val="Heading 6"/>
-    <w:basedOn w:val="Normal"/>
-    <w:next w:val="Normal"/>
+    <w:name w:val="heading 6"/>
+    <w:uiPriority w:val="9"/>
+    <w:semiHidden/>
+    <w:unhideWhenUsed/>
     <w:qFormat/>
+    <w:pPr>
+      <w:outlineLvl w:val="5"/>
+    </w:pPr>
     <w:rPr>
       <w:color w:val="1F4D78"/>
     </w:rPr>
   </w:style>
-  <w:style w:type="paragraph" w:styleId="Strong">
-    <w:name w:val="Strong"/>
-    <w:basedOn w:val="Normal"/>
-    <w:next w:val="Normal"/>
+  <w:style w:type="character" w:default="1" w:styleId="DefaultParagraphFont">
+    <w:name w:val="Default Paragraph Font"/>
+    <w:uiPriority w:val="1"/>
+    <w:semiHidden/>
+    <w:unhideWhenUsed/>
+  </w:style>
+  <w:style w:type="table" w:default="1" w:styleId="TableNormal">
+    <w:name w:val="Normal Table"/>
+    <w:uiPriority w:val="99"/>
+    <w:semiHidden/>
+    <w:unhideWhenUsed/>
+    <w:tblPr>
+      <w:tblInd w:w="0" w:type="dxa"/>
+      <w:tblCellMar>
+        <w:top w:w="0" w:type="dxa"/>
+        <w:left w:w="108" w:type="dxa"/>
+        <w:bottom w:w="0" w:type="dxa"/>
+        <w:right w:w="108" w:type="dxa"/>
+      </w:tblCellMar>
+    </w:tblPr>
+  </w:style>
+  <w:style w:type="numbering" w:default="1" w:styleId="NoList">
+    <w:name w:val="No List"/>
+    <w:uiPriority w:val="99"/>
+    <w:semiHidden/>
+    <w:unhideWhenUsed/>
+  </w:style>
+  <w:style w:type="paragraph" w:styleId="Title">
+    <w:name w:val="Title"/>
+    <w:uiPriority w:val="10"/>
+    <w:qFormat/>
+    <w:rPr>
+      <w:sz w:val="56"/>
+      <w:szCs w:val="56"/>
+    </w:rPr>
+  </w:style>
+  <w:style w:type="paragraph" w:customStyle="1" w:styleId="Strong1">
+    <w:name w:val="Strong1"/>
     <w:qFormat/>
     <w:rPr>
       <w:b/>
@@ -2026,12 +3169,10 @@
   </w:style>
   <w:style w:type="paragraph" w:styleId="ListParagraph">
     <w:name w:val="List Paragraph"/>
-    <w:basedOn w:val="Normal"/>
     <w:qFormat/>
   </w:style>
   <w:style w:type="character" w:styleId="Hyperlink">
     <w:name w:val="Hyperlink"/>
-    <w:basedOn w:val="DefaultParagraphFont"/>
     <w:uiPriority w:val="99"/>
     <w:unhideWhenUsed/>
     <w:rPr>
@@ -2041,7 +3182,6 @@
   </w:style>
   <w:style w:type="character" w:styleId="FootnoteReference">
     <w:name w:val="footnote reference"/>
-    <w:basedOn w:val="DefaultParagraphFont"/>
     <w:uiPriority w:val="99"/>
     <w:semiHidden/>
     <w:unhideWhenUsed/>
@@ -2051,22 +3191,17 @@
   </w:style>
   <w:style w:type="paragraph" w:styleId="FootnoteText">
     <w:name w:val="footnote text"/>
-    <w:basedOn w:val="Normal"/>
     <w:link w:val="FootnoteTextChar"/>
     <w:uiPriority w:val="99"/>
     <w:semiHidden/>
     <w:unhideWhenUsed/>
-    <w:pPr>
-      <w:spacing w:after="0" w:line="240" w:lineRule="auto"/>
-    </w:pPr>
     <w:rPr>
       <w:sz w:val="20"/>
       <w:szCs w:val="20"/>
     </w:rPr>
   </w:style>
-  <w:style w:type="character" w:styleId="FootnoteTextChar">
+  <w:style w:type="character" w:customStyle="1" w:styleId="FootnoteTextChar">
     <w:name w:val="Footnote Text Char"/>
-    <w:basedOn w:val="DefaultParagraphFont"/>
     <w:link w:val="FootnoteText"/>
     <w:uiPriority w:val="99"/>
     <w:semiHidden/>
@@ -2078,7 +3213,6 @@
   </w:style>
   <w:style w:type="character" w:styleId="EndnoteReference">
     <w:name w:val="endnote reference"/>
-    <w:basedOn w:val="DefaultParagraphFont"/>
     <w:uiPriority w:val="99"/>
     <w:semiHidden/>
     <w:unhideWhenUsed/>
@@ -2088,22 +3222,17 @@
   </w:style>
   <w:style w:type="paragraph" w:styleId="EndnoteText">
     <w:name w:val="endnote text"/>
-    <w:basedOn w:val="Normal"/>
     <w:link w:val="EndnoteTextChar"/>
     <w:uiPriority w:val="99"/>
     <w:semiHidden/>
     <w:unhideWhenUsed/>
-    <w:pPr>
-      <w:spacing w:after="0" w:line="240" w:lineRule="auto"/>
-    </w:pPr>
     <w:rPr>
       <w:sz w:val="20"/>
       <w:szCs w:val="20"/>
     </w:rPr>
   </w:style>
-  <w:style w:type="character" w:styleId="EndnoteTextChar">
+  <w:style w:type="character" w:customStyle="1" w:styleId="EndnoteTextChar">
     <w:name w:val="Endnote Text Char"/>
-    <w:basedOn w:val="DefaultParagraphFont"/>
     <w:link w:val="EndnoteText"/>
     <w:uiPriority w:val="99"/>
     <w:semiHidden/>
@@ -2113,41 +3242,325 @@
       <w:szCs w:val="20"/>
     </w:rPr>
   </w:style>
-  <w:style w:type="paragraph" w:styleId="Heading1">
-    <w:name w:val="Heading 1"/>
+  <w:style w:type="paragraph" w:styleId="TOC1">
+    <w:name w:val="toc 1"/>
     <w:basedOn w:val="Normal"/>
     <w:next w:val="Normal"/>
-    <w:qFormat/>
+    <w:autoRedefine/>
+    <w:uiPriority w:val="39"/>
+    <w:unhideWhenUsed/>
+    <w:rsid w:val="00BD2115"/>
     <w:pPr>
-      <w:spacing w:after="200" w:before="300"/>
-      <w:outlineLvl w:val="0"/>
+      <w:spacing w:after="100"/>
     </w:pPr>
-    <w:rPr>
-      <w:rFonts w:ascii="Arial" w:cs="Arial" w:eastAsia="Arial" w:hAnsi="Arial"/>
-      <w:b/>
-      <w:bCs/>
-      <w:color w:val="1F4E79"/>
-      <w:sz w:val="30"/>
-      <w:szCs w:val="30"/>
-    </w:rPr>
   </w:style>
-  <w:style w:type="paragraph" w:styleId="Heading2">
-    <w:name w:val="Heading 2"/>
+  <w:style w:type="paragraph" w:styleId="TOC2">
+    <w:name w:val="toc 2"/>
     <w:basedOn w:val="Normal"/>
     <w:next w:val="Normal"/>
-    <w:qFormat/>
+    <w:autoRedefine/>
+    <w:uiPriority w:val="39"/>
+    <w:unhideWhenUsed/>
+    <w:rsid w:val="00BD2115"/>
     <w:pPr>
-      <w:spacing w:after="140" w:before="220"/>
-      <w:outlineLvl w:val="1"/>
+      <w:spacing w:after="100"/>
+      <w:ind w:left="220"/>
     </w:pPr>
-    <w:rPr>
-      <w:rFonts w:ascii="Arial" w:cs="Arial" w:eastAsia="Arial" w:hAnsi="Arial"/>
-      <w:b/>
-      <w:bCs/>
-      <w:color w:val="2E75B6"/>
-      <w:sz w:val="25"/>
-      <w:szCs w:val="25"/>
-    </w:rPr>
   </w:style>
 </w:styles>
+</file>
+
+<file path=word/theme/theme1.xml><?xml version="1.0" encoding="utf-8"?>
+<a:theme xmlns:a="http://schemas.openxmlformats.org/drawingml/2006/main" name="Office Theme">
+  <a:themeElements>
+    <a:clrScheme name="Office">
+      <a:dk1>
+        <a:sysClr val="windowText" lastClr="000000"/>
+      </a:dk1>
+      <a:lt1>
+        <a:sysClr val="window" lastClr="FFFFFF"/>
+      </a:lt1>
+      <a:dk2>
+        <a:srgbClr val="44546A"/>
+      </a:dk2>
+      <a:lt2>
+        <a:srgbClr val="E7E6E6"/>
+      </a:lt2>
+      <a:accent1>
+        <a:srgbClr val="4472C4"/>
+      </a:accent1>
+      <a:accent2>
+        <a:srgbClr val="ED7D31"/>
+      </a:accent2>
+      <a:accent3>
+        <a:srgbClr val="A5A5A5"/>
+      </a:accent3>
+      <a:accent4>
+        <a:srgbClr val="FFC000"/>
+      </a:accent4>
+      <a:accent5>
+        <a:srgbClr val="5B9BD5"/>
+      </a:accent5>
+      <a:accent6>
+        <a:srgbClr val="70AD47"/>
+      </a:accent6>
+      <a:hlink>
+        <a:srgbClr val="0563C1"/>
+      </a:hlink>
+      <a:folHlink>
+        <a:srgbClr val="954F72"/>
+      </a:folHlink>
+    </a:clrScheme>
+    <a:fontScheme name="Office">
+      <a:majorFont>
+        <a:latin typeface="Calibri Light" panose="020F0302020204030204"/>
+        <a:ea typeface=""/>
+        <a:cs typeface=""/>
+        <a:font script="Jpan" typeface="游ゴシック Light"/>
+        <a:font script="Hang" typeface="맑은 고딕"/>
+        <a:font script="Hans" typeface="等线 Light"/>
+        <a:font script="Hant" typeface="新細明體"/>
+        <a:font script="Arab" typeface="Times New Roman"/>
+        <a:font script="Hebr" typeface="Times New Roman"/>
+        <a:font script="Thai" typeface="Angsana New"/>
+        <a:font script="Ethi" typeface="Nyala"/>
+        <a:font script="Beng" typeface="Vrinda"/>
+        <a:font script="Gujr" typeface="Shruti"/>
+        <a:font script="Khmr" typeface="MoolBoran"/>
+        <a:font script="Knda" typeface="Tunga"/>
+        <a:font script="Guru" typeface="Raavi"/>
+        <a:font script="Cans" typeface="Euphemia"/>
+        <a:font script="Cher" typeface="Plantagenet Cherokee"/>
+        <a:font script="Yiii" typeface="Microsoft Yi Baiti"/>
+        <a:font script="Tibt" typeface="Microsoft Himalaya"/>
+        <a:font script="Thaa" typeface="MV Boli"/>
+        <a:font script="Deva" typeface="Mangal"/>
+        <a:font script="Telu" typeface="Gautami"/>
+        <a:font script="Taml" typeface="Latha"/>
+        <a:font script="Syrc" typeface="Estrangelo Edessa"/>
+        <a:font script="Orya" typeface="Kalinga"/>
+        <a:font script="Mlym" typeface="Kartika"/>
+        <a:font script="Laoo" typeface="DokChampa"/>
+        <a:font script="Sinh" typeface="Iskoola Pota"/>
+        <a:font script="Mong" typeface="Mongolian Baiti"/>
+        <a:font script="Viet" typeface="Times New Roman"/>
+        <a:font script="Uigh" typeface="Microsoft Uighur"/>
+        <a:font script="Geor" typeface="Sylfaen"/>
+        <a:font script="Armn" typeface="Arial"/>
+        <a:font script="Bugi" typeface="Leelawadee UI"/>
+        <a:font script="Bopo" typeface="Microsoft JhengHei"/>
+        <a:font script="Java" typeface="Javanese Text"/>
+        <a:font script="Lisu" typeface="Segoe UI"/>
+        <a:font script="Mymr" typeface="Myanmar Text"/>
+        <a:font script="Nkoo" typeface="Ebrima"/>
+        <a:font script="Olck" typeface="Nirmala UI"/>
+        <a:font script="Osma" typeface="Ebrima"/>
+        <a:font script="Phag" typeface="Phagspa"/>
+        <a:font script="Syrn" typeface="Estrangelo Edessa"/>
+        <a:font script="Syrj" typeface="Estrangelo Edessa"/>
+        <a:font script="Syre" typeface="Estrangelo Edessa"/>
+        <a:font script="Sora" typeface="Nirmala UI"/>
+        <a:font script="Tale" typeface="Microsoft Tai Le"/>
+        <a:font script="Talu" typeface="Microsoft New Tai Lue"/>
+        <a:font script="Tfng" typeface="Ebrima"/>
+      </a:majorFont>
+      <a:minorFont>
+        <a:latin typeface="Calibri" panose="020F0502020204030204"/>
+        <a:ea typeface=""/>
+        <a:cs typeface=""/>
+        <a:font script="Jpan" typeface="游明朝"/>
+        <a:font script="Hang" typeface="맑은 고딕"/>
+        <a:font script="Hans" typeface="等线"/>
+        <a:font script="Hant" typeface="新細明體"/>
+        <a:font script="Arab" typeface="Arial"/>
+        <a:font script="Hebr" typeface="Arial"/>
+        <a:font script="Thai" typeface="Cordia New"/>
+        <a:font script="Ethi" typeface="Nyala"/>
+        <a:font script="Beng" typeface="Vrinda"/>
+        <a:font script="Gujr" typeface="Shruti"/>
+        <a:font script="Khmr" typeface="DaunPenh"/>
+        <a:font script="Knda" typeface="Tunga"/>
+        <a:font script="Guru" typeface="Raavi"/>
+        <a:font script="Cans" typeface="Euphemia"/>
+        <a:font script="Cher" typeface="Plantagenet Cherokee"/>
+        <a:font script="Yiii" typeface="Microsoft Yi Baiti"/>
+        <a:font script="Tibt" typeface="Microsoft Himalaya"/>
+        <a:font script="Thaa" typeface="MV Boli"/>
+        <a:font script="Deva" typeface="Mangal"/>
+        <a:font script="Telu" typeface="Gautami"/>
+        <a:font script="Taml" typeface="Latha"/>
+        <a:font script="Syrc" typeface="Estrangelo Edessa"/>
+        <a:font script="Orya" typeface="Kalinga"/>
+        <a:font script="Mlym" typeface="Kartika"/>
+        <a:font script="Laoo" typeface="DokChampa"/>
+        <a:font script="Sinh" typeface="Iskoola Pota"/>
+        <a:font script="Mong" typeface="Mongolian Baiti"/>
+        <a:font script="Viet" typeface="Arial"/>
+        <a:font script="Uigh" typeface="Microsoft Uighur"/>
+        <a:font script="Geor" typeface="Sylfaen"/>
+        <a:font script="Armn" typeface="Arial"/>
+        <a:font script="Bugi" typeface="Leelawadee UI"/>
+        <a:font script="Bopo" typeface="Microsoft JhengHei"/>
+        <a:font script="Java" typeface="Javanese Text"/>
+        <a:font script="Lisu" typeface="Segoe UI"/>
+        <a:font script="Mymr" typeface="Myanmar Text"/>
+        <a:font script="Nkoo" typeface="Ebrima"/>
+        <a:font script="Olck" typeface="Nirmala UI"/>
+        <a:font script="Osma" typeface="Ebrima"/>
+        <a:font script="Phag" typeface="Phagspa"/>
+        <a:font script="Syrn" typeface="Estrangelo Edessa"/>
+        <a:font script="Syrj" typeface="Estrangelo Edessa"/>
+        <a:font script="Syre" typeface="Estrangelo Edessa"/>
+        <a:font script="Sora" typeface="Nirmala UI"/>
+        <a:font script="Tale" typeface="Microsoft Tai Le"/>
+        <a:font script="Talu" typeface="Microsoft New Tai Lue"/>
+        <a:font script="Tfng" typeface="Ebrima"/>
+      </a:minorFont>
+    </a:fontScheme>
+    <a:fmtScheme name="Office">
+      <a:fillStyleLst>
+        <a:solidFill>
+          <a:schemeClr val="phClr"/>
+        </a:solidFill>
+        <a:gradFill rotWithShape="1">
+          <a:gsLst>
+            <a:gs pos="0">
+              <a:schemeClr val="phClr">
+                <a:lumMod val="110000"/>
+                <a:satMod val="105000"/>
+                <a:tint val="67000"/>
+              </a:schemeClr>
+            </a:gs>
+            <a:gs pos="50000">
+              <a:schemeClr val="phClr">
+                <a:lumMod val="105000"/>
+                <a:satMod val="103000"/>
+                <a:tint val="73000"/>
+              </a:schemeClr>
+            </a:gs>
+            <a:gs pos="100000">
+              <a:schemeClr val="phClr">
+                <a:lumMod val="105000"/>
+                <a:satMod val="109000"/>
+                <a:tint val="81000"/>
+              </a:schemeClr>
+            </a:gs>
+          </a:gsLst>
+          <a:lin ang="5400000" scaled="0"/>
+        </a:gradFill>
+        <a:gradFill rotWithShape="1">
+          <a:gsLst>
+            <a:gs pos="0">
+              <a:schemeClr val="phClr">
+                <a:satMod val="103000"/>
+                <a:lumMod val="102000"/>
+                <a:tint val="94000"/>
+              </a:schemeClr>
+            </a:gs>
+            <a:gs pos="50000">
+              <a:schemeClr val="phClr">
+                <a:satMod val="110000"/>
+                <a:lumMod val="100000"/>
+                <a:shade val="100000"/>
+              </a:schemeClr>
+            </a:gs>
+            <a:gs pos="100000">
+              <a:schemeClr val="phClr">
+                <a:lumMod val="99000"/>
+                <a:satMod val="120000"/>
+                <a:shade val="78000"/>
+              </a:schemeClr>
+            </a:gs>
+          </a:gsLst>
+          <a:lin ang="5400000" scaled="0"/>
+        </a:gradFill>
+      </a:fillStyleLst>
+      <a:lnStyleLst>
+        <a:ln w="6350" cap="flat" cmpd="sng" algn="ctr">
+          <a:solidFill>
+            <a:schemeClr val="phClr"/>
+          </a:solidFill>
+          <a:prstDash val="solid"/>
+          <a:miter lim="800000"/>
+        </a:ln>
+        <a:ln w="12700" cap="flat" cmpd="sng" algn="ctr">
+          <a:solidFill>
+            <a:schemeClr val="phClr"/>
+          </a:solidFill>
+          <a:prstDash val="solid"/>
+          <a:miter lim="800000"/>
+        </a:ln>
+        <a:ln w="19050" cap="flat" cmpd="sng" algn="ctr">
+          <a:solidFill>
+            <a:schemeClr val="phClr"/>
+          </a:solidFill>
+          <a:prstDash val="solid"/>
+          <a:miter lim="800000"/>
+        </a:ln>
+      </a:lnStyleLst>
+      <a:effectStyleLst>
+        <a:effectStyle>
+          <a:effectLst/>
+        </a:effectStyle>
+        <a:effectStyle>
+          <a:effectLst/>
+        </a:effectStyle>
+        <a:effectStyle>
+          <a:effectLst>
+            <a:outerShdw blurRad="57150" dist="19050" dir="5400000" algn="ctr" rotWithShape="0">
+              <a:srgbClr val="000000">
+                <a:alpha val="63000"/>
+              </a:srgbClr>
+            </a:outerShdw>
+          </a:effectLst>
+        </a:effectStyle>
+      </a:effectStyleLst>
+      <a:bgFillStyleLst>
+        <a:solidFill>
+          <a:schemeClr val="phClr"/>
+        </a:solidFill>
+        <a:solidFill>
+          <a:schemeClr val="phClr">
+            <a:tint val="95000"/>
+            <a:satMod val="170000"/>
+          </a:schemeClr>
+        </a:solidFill>
+        <a:gradFill rotWithShape="1">
+          <a:gsLst>
+            <a:gs pos="0">
+              <a:schemeClr val="phClr">
+                <a:tint val="93000"/>
+                <a:satMod val="150000"/>
+                <a:shade val="98000"/>
+                <a:lumMod val="102000"/>
+              </a:schemeClr>
+            </a:gs>
+            <a:gs pos="50000">
+              <a:schemeClr val="phClr">
+                <a:tint val="98000"/>
+                <a:satMod val="130000"/>
+                <a:shade val="90000"/>
+                <a:lumMod val="103000"/>
+              </a:schemeClr>
+            </a:gs>
+            <a:gs pos="100000">
+              <a:schemeClr val="phClr">
+                <a:shade val="63000"/>
+                <a:satMod val="120000"/>
+              </a:schemeClr>
+            </a:gs>
+          </a:gsLst>
+          <a:lin ang="5400000" scaled="0"/>
+        </a:gradFill>
+      </a:bgFillStyleLst>
+    </a:fmtScheme>
+  </a:themeElements>
+  <a:objectDefaults/>
+  <a:extraClrSchemeLst/>
+  <a:extLst>
+    <a:ext uri="{05A4C25C-085E-4340-85A3-A5531E510DB2}">
+      <thm15:themeFamily xmlns:thm15="http://schemas.microsoft.com/office/thememl/2012/main" name="Office Theme" id="{62F939B6-93AF-4DB8-9C6B-D6C7DFDC589F}" vid="{4A3C46E8-61CC-4603-A589-7422A47A8E4A}"/>
+    </a:ext>
+  </a:extLst>
+</a:theme>
 </file>
</xml_diff>